<commit_message>
docs(report): test results as of 2026-09-28; regenerate editor SQL
Co-Authored-By: Claude Opus 5.5 <noreply@anthropic.com>
</commit_message>
<xml_diff>
--- a/개발보고서(공동개발자용)/곡반정와드_공동개발자_보고서.docx
+++ b/개발보고서(공동개발자용)/곡반정와드_공동개발자_보고서.docx
@@ -743,7 +743,7 @@
       <w:pPr>
         <w:pStyle w:val="1"/>
       </w:pPr>
-      <w:bookmarkStart w:id="0" w:name="_Toc241448113"/>
+      <w:bookmarkStart w:id="0" w:name="_Toc241448196"/>
       <w:r>
         <w:t>목차</w:t>
       </w:r>
@@ -752,7 +752,7 @@
     <w:sdt>
       <w:sdtPr>
         <w:alias w:val="목차"/>
-        <w:id w:val="1668059027"/>
+        <w:id w:val="1281914976"/>
       </w:sdtPr>
       <w:sdtEndPr/>
       <w:sdtContent>
@@ -775,7 +775,7 @@
           <w:r>
             <w:fldChar w:fldCharType="separate"/>
           </w:r>
-          <w:hyperlink w:anchor="_Toc241448113" w:history="1">
+          <w:hyperlink w:anchor="_Toc241448196" w:history="1">
             <w:r>
               <w:rPr>
                 <w:rStyle w:val="a5"/>
@@ -799,7 +799,7 @@
               <w:rPr>
                 <w:noProof/>
               </w:rPr>
-              <w:instrText xml:space="preserve"> PAGEREF _Toc241448113 \h </w:instrText>
+              <w:instrText xml:space="preserve"> PAGEREF _Toc241448196 \h </w:instrText>
             </w:r>
             <w:r>
               <w:rPr>
@@ -836,7 +836,7 @@
               <w:noProof/>
             </w:rPr>
           </w:pPr>
-          <w:hyperlink w:anchor="_Toc241448114" w:history="1">
+          <w:hyperlink w:anchor="_Toc241448197" w:history="1">
             <w:r>
               <w:rPr>
                 <w:rStyle w:val="a5"/>
@@ -860,7 +860,7 @@
               <w:rPr>
                 <w:noProof/>
               </w:rPr>
-              <w:instrText xml:space="preserve"> PAGEREF _Toc241448114 \h </w:instrText>
+              <w:instrText xml:space="preserve"> PAGEREF _Toc241448197 \h </w:instrText>
             </w:r>
             <w:r>
               <w:rPr>
@@ -897,7 +897,7 @@
               <w:noProof/>
             </w:rPr>
           </w:pPr>
-          <w:hyperlink w:anchor="_Toc241448115" w:history="1">
+          <w:hyperlink w:anchor="_Toc241448198" w:history="1">
             <w:r>
               <w:rPr>
                 <w:rStyle w:val="a5"/>
@@ -921,7 +921,7 @@
               <w:rPr>
                 <w:noProof/>
               </w:rPr>
-              <w:instrText xml:space="preserve"> PAGEREF _Toc241448115 \h </w:instrText>
+              <w:instrText xml:space="preserve"> PAGEREF _Toc241448198 \h </w:instrText>
             </w:r>
             <w:r>
               <w:rPr>
@@ -959,7 +959,7 @@
               <w:noProof/>
             </w:rPr>
           </w:pPr>
-          <w:hyperlink w:anchor="_Toc241448116" w:history="1">
+          <w:hyperlink w:anchor="_Toc241448199" w:history="1">
             <w:r>
               <w:rPr>
                 <w:rStyle w:val="a5"/>
@@ -983,7 +983,7 @@
               <w:rPr>
                 <w:noProof/>
               </w:rPr>
-              <w:instrText xml:space="preserve"> PAGEREF _Toc241448116 \h </w:instrText>
+              <w:instrText xml:space="preserve"> PAGEREF _Toc241448199 \h </w:instrText>
             </w:r>
             <w:r>
               <w:rPr>
@@ -1020,7 +1020,7 @@
               <w:noProof/>
             </w:rPr>
           </w:pPr>
-          <w:hyperlink w:anchor="_Toc241448117" w:history="1">
+          <w:hyperlink w:anchor="_Toc241448200" w:history="1">
             <w:r>
               <w:rPr>
                 <w:rStyle w:val="a5"/>
@@ -1044,7 +1044,7 @@
               <w:rPr>
                 <w:noProof/>
               </w:rPr>
-              <w:instrText xml:space="preserve"> PAGEREF _Toc241448117 \h </w:instrText>
+              <w:instrText xml:space="preserve"> PAGEREF _Toc241448200 \h </w:instrText>
             </w:r>
             <w:r>
               <w:rPr>
@@ -1081,7 +1081,7 @@
               <w:noProof/>
             </w:rPr>
           </w:pPr>
-          <w:hyperlink w:anchor="_Toc241448118" w:history="1">
+          <w:hyperlink w:anchor="_Toc241448201" w:history="1">
             <w:r>
               <w:rPr>
                 <w:rStyle w:val="a5"/>
@@ -1105,7 +1105,7 @@
               <w:rPr>
                 <w:noProof/>
               </w:rPr>
-              <w:instrText xml:space="preserve"> PAGEREF _Toc241448118 \h </w:instrText>
+              <w:instrText xml:space="preserve"> PAGEREF _Toc241448201 \h </w:instrText>
             </w:r>
             <w:r>
               <w:rPr>
@@ -1143,7 +1143,7 @@
               <w:noProof/>
             </w:rPr>
           </w:pPr>
-          <w:hyperlink w:anchor="_Toc241448119" w:history="1">
+          <w:hyperlink w:anchor="_Toc241448202" w:history="1">
             <w:r>
               <w:rPr>
                 <w:rStyle w:val="a5"/>
@@ -1167,7 +1167,7 @@
               <w:rPr>
                 <w:noProof/>
               </w:rPr>
-              <w:instrText xml:space="preserve"> PAGEREF _Toc241448119 \h </w:instrText>
+              <w:instrText xml:space="preserve"> PAGEREF _Toc241448202 \h </w:instrText>
             </w:r>
             <w:r>
               <w:rPr>
@@ -1205,7 +1205,7 @@
               <w:noProof/>
             </w:rPr>
           </w:pPr>
-          <w:hyperlink w:anchor="_Toc241448120" w:history="1">
+          <w:hyperlink w:anchor="_Toc241448203" w:history="1">
             <w:r>
               <w:rPr>
                 <w:rStyle w:val="a5"/>
@@ -1229,7 +1229,7 @@
               <w:rPr>
                 <w:noProof/>
               </w:rPr>
-              <w:instrText xml:space="preserve"> PAGEREF _Toc241448120 \h </w:instrText>
+              <w:instrText xml:space="preserve"> PAGEREF _Toc241448203 \h </w:instrText>
             </w:r>
             <w:r>
               <w:rPr>
@@ -1267,7 +1267,7 @@
               <w:noProof/>
             </w:rPr>
           </w:pPr>
-          <w:hyperlink w:anchor="_Toc241448121" w:history="1">
+          <w:hyperlink w:anchor="_Toc241448204" w:history="1">
             <w:r>
               <w:rPr>
                 <w:rStyle w:val="a5"/>
@@ -1291,7 +1291,7 @@
               <w:rPr>
                 <w:noProof/>
               </w:rPr>
-              <w:instrText xml:space="preserve"> PAGEREF _Toc241448121 \h </w:instrText>
+              <w:instrText xml:space="preserve"> PAGEREF _Toc241448204 \h </w:instrText>
             </w:r>
             <w:r>
               <w:rPr>
@@ -1328,7 +1328,7 @@
               <w:noProof/>
             </w:rPr>
           </w:pPr>
-          <w:hyperlink w:anchor="_Toc241448122" w:history="1">
+          <w:hyperlink w:anchor="_Toc241448205" w:history="1">
             <w:r>
               <w:rPr>
                 <w:rStyle w:val="a5"/>
@@ -1352,7 +1352,7 @@
               <w:rPr>
                 <w:noProof/>
               </w:rPr>
-              <w:instrText xml:space="preserve"> PAGEREF _Toc241448122 \h </w:instrText>
+              <w:instrText xml:space="preserve"> PAGEREF _Toc241448205 \h </w:instrText>
             </w:r>
             <w:r>
               <w:rPr>
@@ -1390,7 +1390,7 @@
               <w:noProof/>
             </w:rPr>
           </w:pPr>
-          <w:hyperlink w:anchor="_Toc241448123" w:history="1">
+          <w:hyperlink w:anchor="_Toc241448206" w:history="1">
             <w:r>
               <w:rPr>
                 <w:rStyle w:val="a5"/>
@@ -1414,7 +1414,7 @@
               <w:rPr>
                 <w:noProof/>
               </w:rPr>
-              <w:instrText xml:space="preserve"> PAGEREF _Toc241448123 \h </w:instrText>
+              <w:instrText xml:space="preserve"> PAGEREF _Toc241448206 \h </w:instrText>
             </w:r>
             <w:r>
               <w:rPr>
@@ -1451,7 +1451,7 @@
               <w:noProof/>
             </w:rPr>
           </w:pPr>
-          <w:hyperlink w:anchor="_Toc241448124" w:history="1">
+          <w:hyperlink w:anchor="_Toc241448207" w:history="1">
             <w:r>
               <w:rPr>
                 <w:rStyle w:val="a5"/>
@@ -1475,7 +1475,7 @@
               <w:rPr>
                 <w:noProof/>
               </w:rPr>
-              <w:instrText xml:space="preserve"> PAGEREF _Toc241448124 \h </w:instrText>
+              <w:instrText xml:space="preserve"> PAGEREF _Toc241448207 \h </w:instrText>
             </w:r>
             <w:r>
               <w:rPr>
@@ -1513,7 +1513,7 @@
               <w:noProof/>
             </w:rPr>
           </w:pPr>
-          <w:hyperlink w:anchor="_Toc241448125" w:history="1">
+          <w:hyperlink w:anchor="_Toc241448208" w:history="1">
             <w:r>
               <w:rPr>
                 <w:rStyle w:val="a5"/>
@@ -1537,7 +1537,7 @@
               <w:rPr>
                 <w:noProof/>
               </w:rPr>
-              <w:instrText xml:space="preserve"> PAGEREF _Toc241448125 \h </w:instrText>
+              <w:instrText xml:space="preserve"> PAGEREF _Toc241448208 \h </w:instrText>
             </w:r>
             <w:r>
               <w:rPr>
@@ -1575,7 +1575,7 @@
               <w:noProof/>
             </w:rPr>
           </w:pPr>
-          <w:hyperlink w:anchor="_Toc241448126" w:history="1">
+          <w:hyperlink w:anchor="_Toc241448209" w:history="1">
             <w:r>
               <w:rPr>
                 <w:rStyle w:val="a5"/>
@@ -1599,7 +1599,7 @@
               <w:rPr>
                 <w:noProof/>
               </w:rPr>
-              <w:instrText xml:space="preserve"> PAGEREF _Toc241448126 \h </w:instrText>
+              <w:instrText xml:space="preserve"> PAGEREF _Toc241448209 \h </w:instrText>
             </w:r>
             <w:r>
               <w:rPr>
@@ -1637,7 +1637,7 @@
               <w:noProof/>
             </w:rPr>
           </w:pPr>
-          <w:hyperlink w:anchor="_Toc241448127" w:history="1">
+          <w:hyperlink w:anchor="_Toc241448210" w:history="1">
             <w:r>
               <w:rPr>
                 <w:rStyle w:val="a5"/>
@@ -1661,7 +1661,7 @@
               <w:rPr>
                 <w:noProof/>
               </w:rPr>
-              <w:instrText xml:space="preserve"> PAGEREF _Toc241448127 \h </w:instrText>
+              <w:instrText xml:space="preserve"> PAGEREF _Toc241448210 \h </w:instrText>
             </w:r>
             <w:r>
               <w:rPr>
@@ -1698,7 +1698,7 @@
               <w:noProof/>
             </w:rPr>
           </w:pPr>
-          <w:hyperlink w:anchor="_Toc241448128" w:history="1">
+          <w:hyperlink w:anchor="_Toc241448211" w:history="1">
             <w:r>
               <w:rPr>
                 <w:rStyle w:val="a5"/>
@@ -1722,7 +1722,7 @@
               <w:rPr>
                 <w:noProof/>
               </w:rPr>
-              <w:instrText xml:space="preserve"> PAGEREF _Toc241448128 \h </w:instrText>
+              <w:instrText xml:space="preserve"> PAGEREF _Toc241448211 \h </w:instrText>
             </w:r>
             <w:r>
               <w:rPr>
@@ -1760,7 +1760,7 @@
               <w:noProof/>
             </w:rPr>
           </w:pPr>
-          <w:hyperlink w:anchor="_Toc241448129" w:history="1">
+          <w:hyperlink w:anchor="_Toc241448212" w:history="1">
             <w:r>
               <w:rPr>
                 <w:rStyle w:val="a5"/>
@@ -1784,7 +1784,7 @@
               <w:rPr>
                 <w:noProof/>
               </w:rPr>
-              <w:instrText xml:space="preserve"> PAGEREF _Toc241448129 \h </w:instrText>
+              <w:instrText xml:space="preserve"> PAGEREF _Toc241448212 \h </w:instrText>
             </w:r>
             <w:r>
               <w:rPr>
@@ -1822,7 +1822,7 @@
               <w:noProof/>
             </w:rPr>
           </w:pPr>
-          <w:hyperlink w:anchor="_Toc241448130" w:history="1">
+          <w:hyperlink w:anchor="_Toc241448213" w:history="1">
             <w:r>
               <w:rPr>
                 <w:rStyle w:val="a5"/>
@@ -1846,7 +1846,7 @@
               <w:rPr>
                 <w:noProof/>
               </w:rPr>
-              <w:instrText xml:space="preserve"> PAGEREF _Toc241448130 \h </w:instrText>
+              <w:instrText xml:space="preserve"> PAGEREF _Toc241448213 \h </w:instrText>
             </w:r>
             <w:r>
               <w:rPr>
@@ -1884,7 +1884,7 @@
               <w:noProof/>
             </w:rPr>
           </w:pPr>
-          <w:hyperlink w:anchor="_Toc241448131" w:history="1">
+          <w:hyperlink w:anchor="_Toc241448214" w:history="1">
             <w:r>
               <w:rPr>
                 <w:rStyle w:val="a5"/>
@@ -1908,7 +1908,7 @@
               <w:rPr>
                 <w:noProof/>
               </w:rPr>
-              <w:instrText xml:space="preserve"> PAGEREF _Toc241448131 \h </w:instrText>
+              <w:instrText xml:space="preserve"> PAGEREF _Toc241448214 \h </w:instrText>
             </w:r>
             <w:r>
               <w:rPr>
@@ -1946,7 +1946,7 @@
               <w:noProof/>
             </w:rPr>
           </w:pPr>
-          <w:hyperlink w:anchor="_Toc241448132" w:history="1">
+          <w:hyperlink w:anchor="_Toc241448215" w:history="1">
             <w:r>
               <w:rPr>
                 <w:rStyle w:val="a5"/>
@@ -1970,7 +1970,7 @@
               <w:rPr>
                 <w:noProof/>
               </w:rPr>
-              <w:instrText xml:space="preserve"> PAGEREF _Toc241448132 \h </w:instrText>
+              <w:instrText xml:space="preserve"> PAGEREF _Toc241448215 \h </w:instrText>
             </w:r>
             <w:r>
               <w:rPr>
@@ -2007,7 +2007,7 @@
               <w:noProof/>
             </w:rPr>
           </w:pPr>
-          <w:hyperlink w:anchor="_Toc241448133" w:history="1">
+          <w:hyperlink w:anchor="_Toc241448216" w:history="1">
             <w:r>
               <w:rPr>
                 <w:rStyle w:val="a5"/>
@@ -2031,7 +2031,7 @@
               <w:rPr>
                 <w:noProof/>
               </w:rPr>
-              <w:instrText xml:space="preserve"> PAGEREF _Toc241448133 \h </w:instrText>
+              <w:instrText xml:space="preserve"> PAGEREF _Toc241448216 \h </w:instrText>
             </w:r>
             <w:r>
               <w:rPr>
@@ -2069,7 +2069,7 @@
               <w:noProof/>
             </w:rPr>
           </w:pPr>
-          <w:hyperlink w:anchor="_Toc241448134" w:history="1">
+          <w:hyperlink w:anchor="_Toc241448217" w:history="1">
             <w:r>
               <w:rPr>
                 <w:rStyle w:val="a5"/>
@@ -2093,7 +2093,7 @@
               <w:rPr>
                 <w:noProof/>
               </w:rPr>
-              <w:instrText xml:space="preserve"> PAGEREF _Toc241448134 \h </w:instrText>
+              <w:instrText xml:space="preserve"> PAGEREF _Toc241448217 \h </w:instrText>
             </w:r>
             <w:r>
               <w:rPr>
@@ -2131,7 +2131,7 @@
               <w:noProof/>
             </w:rPr>
           </w:pPr>
-          <w:hyperlink w:anchor="_Toc241448135" w:history="1">
+          <w:hyperlink w:anchor="_Toc241448218" w:history="1">
             <w:r>
               <w:rPr>
                 <w:rStyle w:val="a5"/>
@@ -2155,7 +2155,7 @@
               <w:rPr>
                 <w:noProof/>
               </w:rPr>
-              <w:instrText xml:space="preserve"> PAGEREF _Toc241448135 \h </w:instrText>
+              <w:instrText xml:space="preserve"> PAGEREF _Toc241448218 \h </w:instrText>
             </w:r>
             <w:r>
               <w:rPr>
@@ -2193,7 +2193,7 @@
               <w:noProof/>
             </w:rPr>
           </w:pPr>
-          <w:hyperlink w:anchor="_Toc241448136" w:history="1">
+          <w:hyperlink w:anchor="_Toc241448219" w:history="1">
             <w:r>
               <w:rPr>
                 <w:rStyle w:val="a5"/>
@@ -2217,7 +2217,7 @@
               <w:rPr>
                 <w:noProof/>
               </w:rPr>
-              <w:instrText xml:space="preserve"> PAGEREF _Toc241448136 \h </w:instrText>
+              <w:instrText xml:space="preserve"> PAGEREF _Toc241448219 \h </w:instrText>
             </w:r>
             <w:r>
               <w:rPr>
@@ -2255,7 +2255,7 @@
               <w:noProof/>
             </w:rPr>
           </w:pPr>
-          <w:hyperlink w:anchor="_Toc241448137" w:history="1">
+          <w:hyperlink w:anchor="_Toc241448220" w:history="1">
             <w:r>
               <w:rPr>
                 <w:rStyle w:val="a5"/>
@@ -2279,7 +2279,7 @@
               <w:rPr>
                 <w:noProof/>
               </w:rPr>
-              <w:instrText xml:space="preserve"> PAGEREF _Toc241448137 \h </w:instrText>
+              <w:instrText xml:space="preserve"> PAGEREF _Toc241448220 \h </w:instrText>
             </w:r>
             <w:r>
               <w:rPr>
@@ -2316,7 +2316,7 @@
               <w:noProof/>
             </w:rPr>
           </w:pPr>
-          <w:hyperlink w:anchor="_Toc241448138" w:history="1">
+          <w:hyperlink w:anchor="_Toc241448221" w:history="1">
             <w:r>
               <w:rPr>
                 <w:rStyle w:val="a5"/>
@@ -2340,7 +2340,7 @@
               <w:rPr>
                 <w:noProof/>
               </w:rPr>
-              <w:instrText xml:space="preserve"> PAGEREF _Toc241448138 \h </w:instrText>
+              <w:instrText xml:space="preserve"> PAGEREF _Toc241448221 \h </w:instrText>
             </w:r>
             <w:r>
               <w:rPr>
@@ -2379,7 +2379,7 @@
         <w:pStyle w:val="1"/>
         <w:pageBreakBefore/>
       </w:pPr>
-      <w:bookmarkStart w:id="1" w:name="_Toc241448114"/>
+      <w:bookmarkStart w:id="1" w:name="_Toc241448197"/>
       <w:r>
         <w:t xml:space="preserve">1. </w:t>
       </w:r>
@@ -4039,21 +4039,7 @@
                 <w:sz w:val="19"/>
                 <w:szCs w:val="19"/>
               </w:rPr>
-              <w:t>중</w:t>
-            </w:r>
-            <w:r>
-              <w:rPr>
-                <w:sz w:val="19"/>
-                <w:szCs w:val="19"/>
-              </w:rPr>
-              <w:t xml:space="preserve"> 73</w:t>
-            </w:r>
-            <w:r>
-              <w:rPr>
-                <w:sz w:val="19"/>
-                <w:szCs w:val="19"/>
-              </w:rPr>
-              <w:t>개</w:t>
+              <w:t>모두</w:t>
             </w:r>
             <w:r>
               <w:rPr>
@@ -4074,7 +4060,63 @@
                 <w:sz w:val="19"/>
                 <w:szCs w:val="19"/>
               </w:rPr>
-              <w:t xml:space="preserve"> (1</w:t>
+              <w:t xml:space="preserve"> (</w:t>
+            </w:r>
+            <w:r>
+              <w:rPr>
+                <w:sz w:val="19"/>
+                <w:szCs w:val="19"/>
+              </w:rPr>
+              <w:t>원래</w:t>
+            </w:r>
+            <w:r>
+              <w:rPr>
+                <w:sz w:val="19"/>
+                <w:szCs w:val="19"/>
+              </w:rPr>
+              <w:t xml:space="preserve"> </w:t>
+            </w:r>
+            <w:r>
+              <w:rPr>
+                <w:sz w:val="19"/>
+                <w:szCs w:val="19"/>
+              </w:rPr>
+              <w:t>있던</w:t>
+            </w:r>
+            <w:r>
+              <w:rPr>
+                <w:sz w:val="19"/>
+                <w:szCs w:val="19"/>
+              </w:rPr>
+              <w:t xml:space="preserve"> AI </w:t>
+            </w:r>
+            <w:r>
+              <w:rPr>
+                <w:sz w:val="19"/>
+                <w:szCs w:val="19"/>
+              </w:rPr>
+              <w:t>퀴즈</w:t>
+            </w:r>
+            <w:r>
+              <w:rPr>
+                <w:sz w:val="19"/>
+                <w:szCs w:val="19"/>
+              </w:rPr>
+              <w:t xml:space="preserve"> </w:t>
+            </w:r>
+            <w:r>
+              <w:rPr>
+                <w:sz w:val="19"/>
+                <w:szCs w:val="19"/>
+              </w:rPr>
+              <w:t>테스트</w:t>
+            </w:r>
+            <w:r>
+              <w:rPr>
+                <w:sz w:val="19"/>
+                <w:szCs w:val="19"/>
+              </w:rPr>
+              <w:t xml:space="preserve"> 1</w:t>
             </w:r>
             <w:r>
               <w:rPr>
@@ -4095,49 +4137,7 @@
                 <w:sz w:val="19"/>
                 <w:szCs w:val="19"/>
               </w:rPr>
-              <w:t>원래</w:t>
-            </w:r>
-            <w:r>
-              <w:rPr>
-                <w:sz w:val="19"/>
-                <w:szCs w:val="19"/>
-              </w:rPr>
-              <w:t xml:space="preserve"> </w:t>
-            </w:r>
-            <w:r>
-              <w:rPr>
-                <w:sz w:val="19"/>
-                <w:szCs w:val="19"/>
-              </w:rPr>
-              <w:t>있던</w:t>
-            </w:r>
-            <w:r>
-              <w:rPr>
-                <w:sz w:val="19"/>
-                <w:szCs w:val="19"/>
-              </w:rPr>
-              <w:t xml:space="preserve"> </w:t>
-            </w:r>
-            <w:r>
-              <w:rPr>
-                <w:sz w:val="19"/>
-                <w:szCs w:val="19"/>
-              </w:rPr>
-              <w:t>일요일</w:t>
-            </w:r>
-            <w:r>
-              <w:rPr>
-                <w:sz w:val="19"/>
-                <w:szCs w:val="19"/>
-              </w:rPr>
-              <w:t xml:space="preserve"> </w:t>
-            </w:r>
-            <w:r>
-              <w:rPr>
-                <w:sz w:val="19"/>
-                <w:szCs w:val="19"/>
-              </w:rPr>
-              <w:t>전용</w:t>
+              <w:t>일요일에만</w:t>
             </w:r>
             <w:r>
               <w:rPr>
@@ -4202,7 +4202,7 @@
         <w:pStyle w:val="1"/>
         <w:pageBreakBefore/>
       </w:pPr>
-      <w:bookmarkStart w:id="2" w:name="_Toc241448115"/>
+      <w:bookmarkStart w:id="2" w:name="_Toc241448198"/>
       <w:r>
         <w:t xml:space="preserve">2. </w:t>
       </w:r>
@@ -4232,7 +4232,6 @@
     <w:tbl>
       <w:tblPr>
         <w:tblW w:w="9638" w:type="dxa"/>
-        <w:tblInd w:w="-3" w:type="dxa"/>
         <w:tblBorders>
           <w:top w:val="single" w:sz="4" w:space="0" w:color="auto"/>
           <w:left w:val="single" w:sz="4" w:space="0" w:color="auto"/>
@@ -5819,7 +5818,7 @@
       <w:pPr>
         <w:pStyle w:val="2"/>
       </w:pPr>
-      <w:bookmarkStart w:id="3" w:name="_Toc241448116"/>
+      <w:bookmarkStart w:id="3" w:name="_Toc241448199"/>
       <w:r>
         <w:t>통합</w:t>
       </w:r>
@@ -6307,7 +6306,7 @@
         <w:pStyle w:val="1"/>
         <w:pageBreakBefore/>
       </w:pPr>
-      <w:bookmarkStart w:id="4" w:name="_Toc241448117"/>
+      <w:bookmarkStart w:id="4" w:name="_Toc241448200"/>
       <w:r>
         <w:t xml:space="preserve">3. </w:t>
       </w:r>
@@ -8790,7 +8789,7 @@
         <w:pStyle w:val="1"/>
         <w:pageBreakBefore/>
       </w:pPr>
-      <w:bookmarkStart w:id="5" w:name="_Toc241448118"/>
+      <w:bookmarkStart w:id="5" w:name="_Toc241448201"/>
       <w:r>
         <w:t xml:space="preserve">4. </w:t>
       </w:r>
@@ -8803,7 +8802,7 @@
       <w:pPr>
         <w:pStyle w:val="2"/>
       </w:pPr>
-      <w:bookmarkStart w:id="6" w:name="_Toc241448119"/>
+      <w:bookmarkStart w:id="6" w:name="_Toc241448202"/>
       <w:r>
         <w:t>기술</w:t>
       </w:r>
@@ -9605,7 +9604,7 @@
       <w:pPr>
         <w:pStyle w:val="2"/>
       </w:pPr>
-      <w:bookmarkStart w:id="7" w:name="_Toc241448120"/>
+      <w:bookmarkStart w:id="7" w:name="_Toc241448203"/>
       <w:r>
         <w:t>요청이</w:t>
       </w:r>
@@ -9957,7 +9956,7 @@
       <w:pPr>
         <w:pStyle w:val="2"/>
       </w:pPr>
-      <w:bookmarkStart w:id="8" w:name="_Toc241448121"/>
+      <w:bookmarkStart w:id="8" w:name="_Toc241448204"/>
       <w:r>
         <w:t>폴더</w:t>
       </w:r>
@@ -11327,7 +11326,7 @@
         <w:pStyle w:val="1"/>
         <w:pageBreakBefore/>
       </w:pPr>
-      <w:bookmarkStart w:id="9" w:name="_Toc241448122"/>
+      <w:bookmarkStart w:id="9" w:name="_Toc241448205"/>
       <w:r>
         <w:t xml:space="preserve">5. </w:t>
       </w:r>
@@ -12192,7 +12191,7 @@
       <w:pPr>
         <w:pStyle w:val="2"/>
       </w:pPr>
-      <w:bookmarkStart w:id="10" w:name="_Toc241448123"/>
+      <w:bookmarkStart w:id="10" w:name="_Toc241448206"/>
       <w:r>
         <w:t>운영</w:t>
       </w:r>
@@ -12728,7 +12727,7 @@
         <w:pStyle w:val="1"/>
         <w:pageBreakBefore/>
       </w:pPr>
-      <w:bookmarkStart w:id="11" w:name="_Toc241448124"/>
+      <w:bookmarkStart w:id="11" w:name="_Toc241448207"/>
       <w:r>
         <w:t xml:space="preserve">6. </w:t>
       </w:r>
@@ -12747,7 +12746,7 @@
       <w:pPr>
         <w:pStyle w:val="2"/>
       </w:pPr>
-      <w:bookmarkStart w:id="12" w:name="_Toc241448125"/>
+      <w:bookmarkStart w:id="12" w:name="_Toc241448208"/>
       <w:r>
         <w:t>환경변수</w:t>
       </w:r>
@@ -13744,7 +13743,7 @@
       <w:pPr>
         <w:pStyle w:val="2"/>
       </w:pPr>
-      <w:bookmarkStart w:id="13" w:name="_Toc241448126"/>
+      <w:bookmarkStart w:id="13" w:name="_Toc241448209"/>
       <w:r>
         <w:t>배포</w:t>
       </w:r>
@@ -14036,7 +14035,7 @@
       <w:pPr>
         <w:pStyle w:val="2"/>
       </w:pPr>
-      <w:bookmarkStart w:id="14" w:name="_Toc241448127"/>
+      <w:bookmarkStart w:id="14" w:name="_Toc241448210"/>
       <w:r>
         <w:t>안드로이드</w:t>
       </w:r>
@@ -14455,7 +14454,7 @@
         <w:pStyle w:val="1"/>
         <w:pageBreakBefore/>
       </w:pPr>
-      <w:bookmarkStart w:id="15" w:name="_Toc241448128"/>
+      <w:bookmarkStart w:id="15" w:name="_Toc241448211"/>
       <w:r>
         <w:t xml:space="preserve">7. </w:t>
       </w:r>
@@ -14480,7 +14479,7 @@
       <w:pPr>
         <w:pStyle w:val="2"/>
       </w:pPr>
-      <w:bookmarkStart w:id="16" w:name="_Toc241448129"/>
+      <w:bookmarkStart w:id="16" w:name="_Toc241448212"/>
       <w:r>
         <w:t xml:space="preserve">APK </w:t>
       </w:r>
@@ -15618,7 +15617,7 @@
       <w:pPr>
         <w:pStyle w:val="2"/>
       </w:pPr>
-      <w:bookmarkStart w:id="17" w:name="_Toc241448130"/>
+      <w:bookmarkStart w:id="17" w:name="_Toc241448213"/>
       <w:r>
         <w:t>사이트</w:t>
       </w:r>
@@ -15976,7 +15975,7 @@
       <w:pPr>
         <w:pStyle w:val="2"/>
       </w:pPr>
-      <w:bookmarkStart w:id="18" w:name="_Toc241448131"/>
+      <w:bookmarkStart w:id="18" w:name="_Toc241448214"/>
       <w:r>
         <w:t>테스트</w:t>
       </w:r>
@@ -16000,13 +15999,7 @@
         <w:t xml:space="preserve"> </w:t>
       </w:r>
       <w:r>
-        <w:t>중</w:t>
-      </w:r>
-      <w:r>
-        <w:t xml:space="preserve"> 73</w:t>
-      </w:r>
-      <w:r>
-        <w:t>개</w:t>
+        <w:t>모두</w:t>
       </w:r>
       <w:r>
         <w:t xml:space="preserve"> </w:t>
@@ -16015,10 +16008,40 @@
         <w:t>통과</w:t>
       </w:r>
       <w:r>
-        <w:t xml:space="preserve">. </w:t>
-      </w:r>
-      <w:r>
-        <w:t>실패</w:t>
+        <w:t xml:space="preserve">(2026-09-28). </w:t>
+      </w:r>
+      <w:r>
+        <w:t>단</w:t>
+      </w:r>
+      <w:r>
+        <w:t>, gospel-class</w:t>
+      </w:r>
+      <w:r>
+        <w:t>에</w:t>
+      </w:r>
+      <w:r>
+        <w:t xml:space="preserve"> </w:t>
+      </w:r>
+      <w:r>
+        <w:t>원래</w:t>
+      </w:r>
+      <w:r>
+        <w:t xml:space="preserve"> </w:t>
+      </w:r>
+      <w:r>
+        <w:t>있던</w:t>
+      </w:r>
+      <w:r>
+        <w:t xml:space="preserve"> AI </w:t>
+      </w:r>
+      <w:r>
+        <w:t>퀴즈</w:t>
+      </w:r>
+      <w:r>
+        <w:t xml:space="preserve"> </w:t>
+      </w:r>
+      <w:r>
+        <w:t>테스트</w:t>
       </w:r>
       <w:r>
         <w:t xml:space="preserve"> 1</w:t>
@@ -16028,36 +16051,6 @@
       </w:r>
       <w:r>
         <w:t xml:space="preserve"> </w:t>
-      </w:r>
-      <w:r>
-        <w:t>원래</w:t>
-      </w:r>
-      <w:r>
-        <w:t xml:space="preserve"> gospel-class</w:t>
-      </w:r>
-      <w:r>
-        <w:t>에</w:t>
-      </w:r>
-      <w:r>
-        <w:t xml:space="preserve"> </w:t>
-      </w:r>
-      <w:r>
-        <w:t>있던</w:t>
-      </w:r>
-      <w:r>
-        <w:t xml:space="preserve"> AI </w:t>
-      </w:r>
-      <w:r>
-        <w:t>퀴즈</w:t>
-      </w:r>
-      <w:r>
-        <w:t xml:space="preserve"> </w:t>
-      </w:r>
-      <w:r>
-        <w:t>테스트로</w:t>
-      </w:r>
-      <w:r>
-        <w:t xml:space="preserve">, </w:t>
       </w:r>
       <w:r>
         <w:t>일요일에는</w:t>
@@ -16376,7 +16369,7 @@
       <w:pPr>
         <w:pStyle w:val="2"/>
       </w:pPr>
-      <w:bookmarkStart w:id="19" w:name="_Toc241448132"/>
+      <w:bookmarkStart w:id="19" w:name="_Toc241448215"/>
       <w:r>
         <w:t>알려진</w:t>
       </w:r>
@@ -16819,7 +16812,7 @@
         <w:pStyle w:val="1"/>
         <w:pageBreakBefore/>
       </w:pPr>
-      <w:bookmarkStart w:id="20" w:name="_Toc241448133"/>
+      <w:bookmarkStart w:id="20" w:name="_Toc241448216"/>
       <w:r>
         <w:t xml:space="preserve">8. </w:t>
       </w:r>
@@ -16844,7 +16837,7 @@
       <w:pPr>
         <w:pStyle w:val="2"/>
       </w:pPr>
-      <w:bookmarkStart w:id="21" w:name="_Toc241448134"/>
+      <w:bookmarkStart w:id="21" w:name="_Toc241448217"/>
       <w:r>
         <w:t>처음</w:t>
       </w:r>
@@ -17040,7 +17033,7 @@
       <w:pPr>
         <w:pStyle w:val="2"/>
       </w:pPr>
-      <w:bookmarkStart w:id="22" w:name="_Toc241448135"/>
+      <w:bookmarkStart w:id="22" w:name="_Toc241448218"/>
       <w:r>
         <w:t>새</w:t>
       </w:r>
@@ -17455,7 +17448,7 @@
       <w:pPr>
         <w:pStyle w:val="2"/>
       </w:pPr>
-      <w:bookmarkStart w:id="23" w:name="_Toc241448136"/>
+      <w:bookmarkStart w:id="23" w:name="_Toc241448219"/>
       <w:r>
         <w:t>지켜</w:t>
       </w:r>
@@ -17711,7 +17704,7 @@
       <w:pPr>
         <w:pStyle w:val="2"/>
       </w:pPr>
-      <w:bookmarkStart w:id="24" w:name="_Toc241448137"/>
+      <w:bookmarkStart w:id="24" w:name="_Toc241448220"/>
       <w:r>
         <w:t>다음에</w:t>
       </w:r>
@@ -17935,7 +17928,7 @@
         <w:pStyle w:val="1"/>
         <w:pageBreakBefore/>
       </w:pPr>
-      <w:bookmarkStart w:id="25" w:name="_Toc241448138"/>
+      <w:bookmarkStart w:id="25" w:name="_Toc241448221"/>
       <w:r>
         <w:t>부록</w:t>
       </w:r>
@@ -19188,10 +19181,10 @@
 <file path=word/numbering.xml><?xml version="1.0" encoding="utf-8"?>
 <w:numbering xmlns:wpc="http://schemas.microsoft.com/office/word/2010/wordprocessingCanvas" xmlns:cx="http://schemas.microsoft.com/office/drawing/2014/chartex" xmlns:cx1="http://schemas.microsoft.com/office/drawing/2015/9/8/chartex" xmlns:cx2="http://schemas.microsoft.com/office/drawing/2015/10/21/chartex" xmlns:cx3="http://schemas.microsoft.com/office/drawing/2016/5/9/chartex" xmlns:cx4="http://schemas.microsoft.com/office/drawing/2016/5/10/chartex" xmlns:cx5="http://schemas.microsoft.com/office/drawing/2016/5/11/chartex" xmlns:cx6="http://schemas.microsoft.com/office/drawing/2016/5/12/chartex" xmlns:cx7="http://schemas.microsoft.com/office/drawing/2016/5/13/chartex" xmlns:cx8="http://schemas.microsoft.com/office/drawing/2016/5/14/chartex" xmlns:mc="http://schemas.openxmlformats.org/markup-compatibility/2006" xmlns:aink="http://schemas.microsoft.com/office/drawing/2016/ink" xmlns:am3d="http://schemas.microsoft.com/office/drawing/2017/model3d" xmlns:o="urn:schemas-microsoft-com:office:office" xmlns:oel="http://schemas.microsoft.com/office/2019/extlst" xmlns:r="http://schemas.openxmlformats.org/officeDocument/2006/relationships" xmlns:m="http://schemas.openxmlformats.org/officeDocument/2006/math" xmlns:v="urn:schemas-microsoft-com:vml" xmlns:wp14="http://schemas.microsoft.com/office/word/2010/wordprocessingDrawing" xmlns:wp="http://schemas.openxmlformats.org/drawingml/2006/wordprocessingDrawing" xmlns:w10="urn:schemas-microsoft-com:office:word" xmlns:w="http://schemas.openxmlformats.org/wordprocessingml/2006/main" xmlns:w14="http://schemas.microsoft.com/office/word/2010/wordml" xmlns:w15="http://schemas.microsoft.com/office/word/2012/wordml" xmlns:w16cex="http://schemas.microsoft.com/office/word/2018/wordml/cex" xmlns:w16cid="http://schemas.microsoft.com/office/word/2016/wordml/cid" xmlns:w16="http://schemas.microsoft.com/office/word/2018/wordml" xmlns:w16du="http://schemas.microsoft.com/office/word/2023/wordml/word16du" xmlns:w16sdtdh="http://schemas.microsoft.com/office/word/2020/wordml/sdtdatahash" xmlns:w16sdtfl="http://schemas.microsoft.com/office/word/2024/wordml/sdtformatlock" xmlns:w16se="http://schemas.microsoft.com/office/word/2015/wordml/symex" xmlns:wpg="http://schemas.microsoft.com/office/word/2010/wordprocessingGroup" xmlns:wpi="http://schemas.microsoft.com/office/word/2010/wordprocessingInk" xmlns:wne="http://schemas.microsoft.com/office/word/2006/wordml" xmlns:wps="http://schemas.microsoft.com/office/word/2010/wordprocessingShape" mc:Ignorable="w14 w15 w16se w16cid w16 w16cex w16sdtdh w16sdtfl w16du wp14">
   <w:abstractNum w:abstractNumId="0" w15:restartNumberingAfterBreak="0">
-    <w:nsid w:val="54421C52"/>
+    <w:nsid w:val="08B367BD"/>
     <w:multiLevelType w:val="hybridMultilevel"/>
-    <w:tmpl w:val="50540280"/>
-    <w:lvl w:ilvl="0" w:tplc="2F4CCA50">
+    <w:tmpl w:val="0ADAB356"/>
+    <w:lvl w:ilvl="0" w:tplc="685C088C">
       <w:start w:val="1"/>
       <w:numFmt w:val="bullet"/>
       <w:lvlText w:val="•"/>
@@ -19200,52 +19193,52 @@
         <w:ind w:left="540" w:hanging="360"/>
       </w:pPr>
     </w:lvl>
-    <w:lvl w:ilvl="1" w:tplc="11704406">
+    <w:lvl w:ilvl="1" w:tplc="432C6E4A">
       <w:numFmt w:val="decimal"/>
       <w:lvlText w:val=""/>
       <w:lvlJc w:val="left"/>
     </w:lvl>
-    <w:lvl w:ilvl="2" w:tplc="114CFF4E">
+    <w:lvl w:ilvl="2" w:tplc="7F766234">
       <w:numFmt w:val="decimal"/>
       <w:lvlText w:val=""/>
       <w:lvlJc w:val="left"/>
     </w:lvl>
-    <w:lvl w:ilvl="3" w:tplc="F182B434">
+    <w:lvl w:ilvl="3" w:tplc="D6B0B5C6">
       <w:numFmt w:val="decimal"/>
       <w:lvlText w:val=""/>
       <w:lvlJc w:val="left"/>
     </w:lvl>
-    <w:lvl w:ilvl="4" w:tplc="D65C1D12">
+    <w:lvl w:ilvl="4" w:tplc="EC984018">
       <w:numFmt w:val="decimal"/>
       <w:lvlText w:val=""/>
       <w:lvlJc w:val="left"/>
     </w:lvl>
-    <w:lvl w:ilvl="5" w:tplc="C1D6B272">
+    <w:lvl w:ilvl="5" w:tplc="63E8257C">
       <w:numFmt w:val="decimal"/>
       <w:lvlText w:val=""/>
       <w:lvlJc w:val="left"/>
     </w:lvl>
-    <w:lvl w:ilvl="6" w:tplc="6A84E358">
+    <w:lvl w:ilvl="6" w:tplc="6C28969C">
       <w:numFmt w:val="decimal"/>
       <w:lvlText w:val=""/>
       <w:lvlJc w:val="left"/>
     </w:lvl>
-    <w:lvl w:ilvl="7" w:tplc="599C130A">
+    <w:lvl w:ilvl="7" w:tplc="75FEFFF4">
       <w:numFmt w:val="decimal"/>
       <w:lvlText w:val=""/>
       <w:lvlJc w:val="left"/>
     </w:lvl>
-    <w:lvl w:ilvl="8" w:tplc="A75AD284">
+    <w:lvl w:ilvl="8" w:tplc="E0FA7820">
       <w:numFmt w:val="decimal"/>
       <w:lvlText w:val=""/>
       <w:lvlJc w:val="left"/>
     </w:lvl>
   </w:abstractNum>
   <w:abstractNum w:abstractNumId="1" w15:restartNumberingAfterBreak="0">
-    <w:nsid w:val="57DB2710"/>
+    <w:nsid w:val="51172205"/>
     <w:multiLevelType w:val="hybridMultilevel"/>
-    <w:tmpl w:val="6FACA4BA"/>
-    <w:lvl w:ilvl="0" w:tplc="EE7827AC">
+    <w:tmpl w:val="A8705DC4"/>
+    <w:lvl w:ilvl="0" w:tplc="93744528">
       <w:start w:val="1"/>
       <w:numFmt w:val="decimal"/>
       <w:lvlText w:val="%1."/>
@@ -19254,52 +19247,52 @@
         <w:ind w:left="540" w:hanging="360"/>
       </w:pPr>
     </w:lvl>
-    <w:lvl w:ilvl="1" w:tplc="60AC2D1C">
+    <w:lvl w:ilvl="1" w:tplc="7CC8960E">
       <w:numFmt w:val="decimal"/>
       <w:lvlText w:val=""/>
       <w:lvlJc w:val="left"/>
     </w:lvl>
-    <w:lvl w:ilvl="2" w:tplc="F73ED072">
+    <w:lvl w:ilvl="2" w:tplc="241ED680">
       <w:numFmt w:val="decimal"/>
       <w:lvlText w:val=""/>
       <w:lvlJc w:val="left"/>
     </w:lvl>
-    <w:lvl w:ilvl="3" w:tplc="557253B2">
+    <w:lvl w:ilvl="3" w:tplc="851E5C70">
       <w:numFmt w:val="decimal"/>
       <w:lvlText w:val=""/>
       <w:lvlJc w:val="left"/>
     </w:lvl>
-    <w:lvl w:ilvl="4" w:tplc="5FE2B880">
+    <w:lvl w:ilvl="4" w:tplc="A3BE2CA8">
       <w:numFmt w:val="decimal"/>
       <w:lvlText w:val=""/>
       <w:lvlJc w:val="left"/>
     </w:lvl>
-    <w:lvl w:ilvl="5" w:tplc="86D06612">
+    <w:lvl w:ilvl="5" w:tplc="B6FEB8CE">
       <w:numFmt w:val="decimal"/>
       <w:lvlText w:val=""/>
       <w:lvlJc w:val="left"/>
     </w:lvl>
-    <w:lvl w:ilvl="6" w:tplc="3EB87D9A">
+    <w:lvl w:ilvl="6" w:tplc="637AA496">
       <w:numFmt w:val="decimal"/>
       <w:lvlText w:val=""/>
       <w:lvlJc w:val="left"/>
     </w:lvl>
-    <w:lvl w:ilvl="7" w:tplc="EEEA2FF4">
+    <w:lvl w:ilvl="7" w:tplc="9CCE1116">
       <w:numFmt w:val="decimal"/>
       <w:lvlText w:val=""/>
       <w:lvlJc w:val="left"/>
     </w:lvl>
-    <w:lvl w:ilvl="8" w:tplc="118805E4">
+    <w:lvl w:ilvl="8" w:tplc="D346E59C">
       <w:numFmt w:val="decimal"/>
       <w:lvlText w:val=""/>
       <w:lvlJc w:val="left"/>
     </w:lvl>
   </w:abstractNum>
   <w:abstractNum w:abstractNumId="2" w15:restartNumberingAfterBreak="0">
-    <w:nsid w:val="7B03742D"/>
+    <w:nsid w:val="55A6062D"/>
     <w:multiLevelType w:val="hybridMultilevel"/>
-    <w:tmpl w:val="7B9C8E82"/>
-    <w:lvl w:ilvl="0" w:tplc="752A5416">
+    <w:tmpl w:val="957E8336"/>
+    <w:lvl w:ilvl="0" w:tplc="11BA6968">
       <w:start w:val="1"/>
       <w:numFmt w:val="bullet"/>
       <w:lvlText w:val="●"/>
@@ -19308,7 +19301,7 @@
         <w:ind w:left="720" w:hanging="360"/>
       </w:pPr>
     </w:lvl>
-    <w:lvl w:ilvl="1" w:tplc="2B4A09D6">
+    <w:lvl w:ilvl="1" w:tplc="23525CBE">
       <w:start w:val="1"/>
       <w:numFmt w:val="bullet"/>
       <w:lvlText w:val="○"/>
@@ -19317,7 +19310,7 @@
         <w:ind w:left="1440" w:hanging="360"/>
       </w:pPr>
     </w:lvl>
-    <w:lvl w:ilvl="2" w:tplc="A7E456D2">
+    <w:lvl w:ilvl="2" w:tplc="5D24AB8E">
       <w:start w:val="1"/>
       <w:numFmt w:val="bullet"/>
       <w:lvlText w:val="■"/>
@@ -19326,7 +19319,7 @@
         <w:ind w:left="2160" w:hanging="360"/>
       </w:pPr>
     </w:lvl>
-    <w:lvl w:ilvl="3" w:tplc="452C29D8">
+    <w:lvl w:ilvl="3" w:tplc="FA6828D6">
       <w:start w:val="1"/>
       <w:numFmt w:val="bullet"/>
       <w:lvlText w:val="●"/>
@@ -19335,7 +19328,7 @@
         <w:ind w:left="2880" w:hanging="360"/>
       </w:pPr>
     </w:lvl>
-    <w:lvl w:ilvl="4" w:tplc="CD98D056">
+    <w:lvl w:ilvl="4" w:tplc="2218727A">
       <w:start w:val="1"/>
       <w:numFmt w:val="bullet"/>
       <w:lvlText w:val="○"/>
@@ -19344,7 +19337,7 @@
         <w:ind w:left="3600" w:hanging="360"/>
       </w:pPr>
     </w:lvl>
-    <w:lvl w:ilvl="5" w:tplc="26A2A15C">
+    <w:lvl w:ilvl="5" w:tplc="2F8EA052">
       <w:start w:val="1"/>
       <w:numFmt w:val="bullet"/>
       <w:lvlText w:val="■"/>
@@ -19353,7 +19346,7 @@
         <w:ind w:left="4320" w:hanging="360"/>
       </w:pPr>
     </w:lvl>
-    <w:lvl w:ilvl="6" w:tplc="B69CF1FC">
+    <w:lvl w:ilvl="6" w:tplc="F242840E">
       <w:start w:val="1"/>
       <w:numFmt w:val="bullet"/>
       <w:lvlText w:val="●"/>
@@ -19362,7 +19355,7 @@
         <w:ind w:left="5040" w:hanging="360"/>
       </w:pPr>
     </w:lvl>
-    <w:lvl w:ilvl="7" w:tplc="D9EE1A86">
+    <w:lvl w:ilvl="7" w:tplc="A816E548">
       <w:start w:val="1"/>
       <w:numFmt w:val="bullet"/>
       <w:lvlText w:val="●"/>
@@ -19371,7 +19364,7 @@
         <w:ind w:left="5760" w:hanging="360"/>
       </w:pPr>
     </w:lvl>
-    <w:lvl w:ilvl="8" w:tplc="EB50E116">
+    <w:lvl w:ilvl="8" w:tplc="BDCCAB6E">
       <w:start w:val="1"/>
       <w:numFmt w:val="bullet"/>
       <w:lvlText w:val="●"/>
@@ -19381,43 +19374,43 @@
       </w:pPr>
     </w:lvl>
   </w:abstractNum>
-  <w:num w:numId="1" w16cid:durableId="1900436064">
+  <w:num w:numId="1" w16cid:durableId="264193115">
     <w:abstractNumId w:val="2"/>
     <w:lvlOverride w:ilvl="0">
       <w:startOverride w:val="1"/>
     </w:lvlOverride>
   </w:num>
-  <w:num w:numId="2" w16cid:durableId="762068274">
+  <w:num w:numId="2" w16cid:durableId="802968941">
     <w:abstractNumId w:val="0"/>
     <w:lvlOverride w:ilvl="0">
       <w:startOverride w:val="1"/>
     </w:lvlOverride>
   </w:num>
-  <w:num w:numId="3" w16cid:durableId="470102724">
+  <w:num w:numId="3" w16cid:durableId="2123958967">
     <w:abstractNumId w:val="1"/>
     <w:lvlOverride w:ilvl="0">
       <w:startOverride w:val="1"/>
     </w:lvlOverride>
   </w:num>
-  <w:num w:numId="4" w16cid:durableId="1926840439">
+  <w:num w:numId="4" w16cid:durableId="79303572">
     <w:abstractNumId w:val="1"/>
     <w:lvlOverride w:ilvl="0">
       <w:startOverride w:val="1"/>
     </w:lvlOverride>
   </w:num>
-  <w:num w:numId="5" w16cid:durableId="374504788">
+  <w:num w:numId="5" w16cid:durableId="1481968914">
     <w:abstractNumId w:val="1"/>
     <w:lvlOverride w:ilvl="0">
       <w:startOverride w:val="1"/>
     </w:lvlOverride>
   </w:num>
-  <w:num w:numId="6" w16cid:durableId="1483545494">
+  <w:num w:numId="6" w16cid:durableId="2046904090">
     <w:abstractNumId w:val="1"/>
     <w:lvlOverride w:ilvl="0">
       <w:startOverride w:val="1"/>
     </w:lvlOverride>
   </w:num>
-  <w:num w:numId="7" w16cid:durableId="983045509">
+  <w:num w:numId="7" w16cid:durableId="1289436993">
     <w:abstractNumId w:val="1"/>
     <w:lvlOverride w:ilvl="0">
       <w:startOverride w:val="1"/>
@@ -20051,7 +20044,7 @@
     <w:link w:val="Char1"/>
     <w:uiPriority w:val="99"/>
     <w:unhideWhenUsed/>
-    <w:rsid w:val="009757C8"/>
+    <w:rsid w:val="0023075D"/>
     <w:pPr>
       <w:tabs>
         <w:tab w:val="center" w:pos="4513"/>
@@ -20065,7 +20058,7 @@
     <w:basedOn w:val="a0"/>
     <w:link w:val="aa"/>
     <w:uiPriority w:val="99"/>
-    <w:rsid w:val="009757C8"/>
+    <w:rsid w:val="0023075D"/>
   </w:style>
   <w:style w:type="paragraph" w:styleId="ab">
     <w:name w:val="footer"/>
@@ -20073,7 +20066,7 @@
     <w:link w:val="Char2"/>
     <w:uiPriority w:val="99"/>
     <w:unhideWhenUsed/>
-    <w:rsid w:val="009757C8"/>
+    <w:rsid w:val="0023075D"/>
     <w:pPr>
       <w:tabs>
         <w:tab w:val="center" w:pos="4513"/>
@@ -20087,7 +20080,7 @@
     <w:basedOn w:val="a0"/>
     <w:link w:val="ab"/>
     <w:uiPriority w:val="99"/>
-    <w:rsid w:val="009757C8"/>
+    <w:rsid w:val="0023075D"/>
   </w:style>
   <w:style w:type="paragraph" w:styleId="11">
     <w:name w:val="toc 1"/>
@@ -20096,7 +20089,7 @@
     <w:autoRedefine/>
     <w:uiPriority w:val="39"/>
     <w:unhideWhenUsed/>
-    <w:rsid w:val="009757C8"/>
+    <w:rsid w:val="0023075D"/>
   </w:style>
   <w:style w:type="paragraph" w:styleId="20">
     <w:name w:val="toc 2"/>
@@ -20105,7 +20098,7 @@
     <w:autoRedefine/>
     <w:uiPriority w:val="39"/>
     <w:unhideWhenUsed/>
-    <w:rsid w:val="009757C8"/>
+    <w:rsid w:val="0023075D"/>
     <w:pPr>
       <w:ind w:leftChars="200" w:left="425"/>
     </w:pPr>

</xml_diff>

<commit_message>
docs(report): i18n now covers sentences with blanks; tests 79
Co-Authored-By: Claude Opus 5.5 <noreply@anthropic.com>
</commit_message>
<xml_diff>
--- a/개발보고서(공동개발자용)/곡반정와드_공동개발자_보고서.docx
+++ b/개발보고서(공동개발자용)/곡반정와드_공동개발자_보고서.docx
@@ -743,7 +743,7 @@
       <w:pPr>
         <w:pStyle w:val="1"/>
       </w:pPr>
-      <w:bookmarkStart w:id="0" w:name="_Toc241449957"/>
+      <w:bookmarkStart w:id="0" w:name="_Toc241528821"/>
       <w:r>
         <w:t>목차</w:t>
       </w:r>
@@ -752,7 +752,7 @@
     <w:sdt>
       <w:sdtPr>
         <w:alias w:val="목차"/>
-        <w:id w:val="-1107810369"/>
+        <w:id w:val="1684632929"/>
       </w:sdtPr>
       <w:sdtEndPr/>
       <w:sdtContent>
@@ -775,7 +775,7 @@
           <w:r>
             <w:fldChar w:fldCharType="separate"/>
           </w:r>
-          <w:hyperlink w:anchor="_Toc241449957" w:history="1">
+          <w:hyperlink w:anchor="_Toc241528821" w:history="1">
             <w:r>
               <w:rPr>
                 <w:rStyle w:val="a5"/>
@@ -799,7 +799,7 @@
               <w:rPr>
                 <w:noProof/>
               </w:rPr>
-              <w:instrText xml:space="preserve"> PAGEREF _Toc241449957 \h </w:instrText>
+              <w:instrText xml:space="preserve"> PAGEREF _Toc241528821 \h </w:instrText>
             </w:r>
             <w:r>
               <w:rPr>
@@ -836,7 +836,7 @@
               <w:noProof/>
             </w:rPr>
           </w:pPr>
-          <w:hyperlink w:anchor="_Toc241449958" w:history="1">
+          <w:hyperlink w:anchor="_Toc241528822" w:history="1">
             <w:r>
               <w:rPr>
                 <w:rStyle w:val="a5"/>
@@ -860,7 +860,7 @@
               <w:rPr>
                 <w:noProof/>
               </w:rPr>
-              <w:instrText xml:space="preserve"> PAGEREF _Toc241449958 \h </w:instrText>
+              <w:instrText xml:space="preserve"> PAGEREF _Toc241528822 \h </w:instrText>
             </w:r>
             <w:r>
               <w:rPr>
@@ -897,7 +897,7 @@
               <w:noProof/>
             </w:rPr>
           </w:pPr>
-          <w:hyperlink w:anchor="_Toc241449959" w:history="1">
+          <w:hyperlink w:anchor="_Toc241528823" w:history="1">
             <w:r>
               <w:rPr>
                 <w:rStyle w:val="a5"/>
@@ -921,7 +921,7 @@
               <w:rPr>
                 <w:noProof/>
               </w:rPr>
-              <w:instrText xml:space="preserve"> PAGEREF _Toc241449959 \h </w:instrText>
+              <w:instrText xml:space="preserve"> PAGEREF _Toc241528823 \h </w:instrText>
             </w:r>
             <w:r>
               <w:rPr>
@@ -959,7 +959,7 @@
               <w:noProof/>
             </w:rPr>
           </w:pPr>
-          <w:hyperlink w:anchor="_Toc241449960" w:history="1">
+          <w:hyperlink w:anchor="_Toc241528824" w:history="1">
             <w:r>
               <w:rPr>
                 <w:rStyle w:val="a5"/>
@@ -983,7 +983,7 @@
               <w:rPr>
                 <w:noProof/>
               </w:rPr>
-              <w:instrText xml:space="preserve"> PAGEREF _Toc241449960 \h </w:instrText>
+              <w:instrText xml:space="preserve"> PAGEREF _Toc241528824 \h </w:instrText>
             </w:r>
             <w:r>
               <w:rPr>
@@ -1020,7 +1020,7 @@
               <w:noProof/>
             </w:rPr>
           </w:pPr>
-          <w:hyperlink w:anchor="_Toc241449961" w:history="1">
+          <w:hyperlink w:anchor="_Toc241528825" w:history="1">
             <w:r>
               <w:rPr>
                 <w:rStyle w:val="a5"/>
@@ -1044,7 +1044,7 @@
               <w:rPr>
                 <w:noProof/>
               </w:rPr>
-              <w:instrText xml:space="preserve"> PAGEREF _Toc241449961 \h </w:instrText>
+              <w:instrText xml:space="preserve"> PAGEREF _Toc241528825 \h </w:instrText>
             </w:r>
             <w:r>
               <w:rPr>
@@ -1081,7 +1081,7 @@
               <w:noProof/>
             </w:rPr>
           </w:pPr>
-          <w:hyperlink w:anchor="_Toc241449962" w:history="1">
+          <w:hyperlink w:anchor="_Toc241528826" w:history="1">
             <w:r>
               <w:rPr>
                 <w:rStyle w:val="a5"/>
@@ -1105,7 +1105,7 @@
               <w:rPr>
                 <w:noProof/>
               </w:rPr>
-              <w:instrText xml:space="preserve"> PAGEREF _Toc241449962 \h </w:instrText>
+              <w:instrText xml:space="preserve"> PAGEREF _Toc241528826 \h </w:instrText>
             </w:r>
             <w:r>
               <w:rPr>
@@ -1143,7 +1143,7 @@
               <w:noProof/>
             </w:rPr>
           </w:pPr>
-          <w:hyperlink w:anchor="_Toc241449963" w:history="1">
+          <w:hyperlink w:anchor="_Toc241528827" w:history="1">
             <w:r>
               <w:rPr>
                 <w:rStyle w:val="a5"/>
@@ -1167,7 +1167,7 @@
               <w:rPr>
                 <w:noProof/>
               </w:rPr>
-              <w:instrText xml:space="preserve"> PAGEREF _Toc241449963 \h </w:instrText>
+              <w:instrText xml:space="preserve"> PAGEREF _Toc241528827 \h </w:instrText>
             </w:r>
             <w:r>
               <w:rPr>
@@ -1205,7 +1205,7 @@
               <w:noProof/>
             </w:rPr>
           </w:pPr>
-          <w:hyperlink w:anchor="_Toc241449964" w:history="1">
+          <w:hyperlink w:anchor="_Toc241528828" w:history="1">
             <w:r>
               <w:rPr>
                 <w:rStyle w:val="a5"/>
@@ -1229,7 +1229,7 @@
               <w:rPr>
                 <w:noProof/>
               </w:rPr>
-              <w:instrText xml:space="preserve"> PAGEREF _Toc241449964 \h </w:instrText>
+              <w:instrText xml:space="preserve"> PAGEREF _Toc241528828 \h </w:instrText>
             </w:r>
             <w:r>
               <w:rPr>
@@ -1267,7 +1267,7 @@
               <w:noProof/>
             </w:rPr>
           </w:pPr>
-          <w:hyperlink w:anchor="_Toc241449965" w:history="1">
+          <w:hyperlink w:anchor="_Toc241528829" w:history="1">
             <w:r>
               <w:rPr>
                 <w:rStyle w:val="a5"/>
@@ -1291,7 +1291,7 @@
               <w:rPr>
                 <w:noProof/>
               </w:rPr>
-              <w:instrText xml:space="preserve"> PAGEREF _Toc241449965 \h </w:instrText>
+              <w:instrText xml:space="preserve"> PAGEREF _Toc241528829 \h </w:instrText>
             </w:r>
             <w:r>
               <w:rPr>
@@ -1328,7 +1328,7 @@
               <w:noProof/>
             </w:rPr>
           </w:pPr>
-          <w:hyperlink w:anchor="_Toc241449966" w:history="1">
+          <w:hyperlink w:anchor="_Toc241528830" w:history="1">
             <w:r>
               <w:rPr>
                 <w:rStyle w:val="a5"/>
@@ -1352,7 +1352,7 @@
               <w:rPr>
                 <w:noProof/>
               </w:rPr>
-              <w:instrText xml:space="preserve"> PAGEREF _Toc241449966 \h </w:instrText>
+              <w:instrText xml:space="preserve"> PAGEREF _Toc241528830 \h </w:instrText>
             </w:r>
             <w:r>
               <w:rPr>
@@ -1390,7 +1390,7 @@
               <w:noProof/>
             </w:rPr>
           </w:pPr>
-          <w:hyperlink w:anchor="_Toc241449967" w:history="1">
+          <w:hyperlink w:anchor="_Toc241528831" w:history="1">
             <w:r>
               <w:rPr>
                 <w:rStyle w:val="a5"/>
@@ -1414,7 +1414,7 @@
               <w:rPr>
                 <w:noProof/>
               </w:rPr>
-              <w:instrText xml:space="preserve"> PAGEREF _Toc241449967 \h </w:instrText>
+              <w:instrText xml:space="preserve"> PAGEREF _Toc241528831 \h </w:instrText>
             </w:r>
             <w:r>
               <w:rPr>
@@ -1451,7 +1451,7 @@
               <w:noProof/>
             </w:rPr>
           </w:pPr>
-          <w:hyperlink w:anchor="_Toc241449968" w:history="1">
+          <w:hyperlink w:anchor="_Toc241528832" w:history="1">
             <w:r>
               <w:rPr>
                 <w:rStyle w:val="a5"/>
@@ -1475,7 +1475,7 @@
               <w:rPr>
                 <w:noProof/>
               </w:rPr>
-              <w:instrText xml:space="preserve"> PAGEREF _Toc241449968 \h </w:instrText>
+              <w:instrText xml:space="preserve"> PAGEREF _Toc241528832 \h </w:instrText>
             </w:r>
             <w:r>
               <w:rPr>
@@ -1513,7 +1513,7 @@
               <w:noProof/>
             </w:rPr>
           </w:pPr>
-          <w:hyperlink w:anchor="_Toc241449969" w:history="1">
+          <w:hyperlink w:anchor="_Toc241528833" w:history="1">
             <w:r>
               <w:rPr>
                 <w:rStyle w:val="a5"/>
@@ -1537,7 +1537,7 @@
               <w:rPr>
                 <w:noProof/>
               </w:rPr>
-              <w:instrText xml:space="preserve"> PAGEREF _Toc241449969 \h </w:instrText>
+              <w:instrText xml:space="preserve"> PAGEREF _Toc241528833 \h </w:instrText>
             </w:r>
             <w:r>
               <w:rPr>
@@ -1575,7 +1575,7 @@
               <w:noProof/>
             </w:rPr>
           </w:pPr>
-          <w:hyperlink w:anchor="_Toc241449970" w:history="1">
+          <w:hyperlink w:anchor="_Toc241528834" w:history="1">
             <w:r>
               <w:rPr>
                 <w:rStyle w:val="a5"/>
@@ -1599,7 +1599,7 @@
               <w:rPr>
                 <w:noProof/>
               </w:rPr>
-              <w:instrText xml:space="preserve"> PAGEREF _Toc241449970 \h </w:instrText>
+              <w:instrText xml:space="preserve"> PAGEREF _Toc241528834 \h </w:instrText>
             </w:r>
             <w:r>
               <w:rPr>
@@ -1637,7 +1637,7 @@
               <w:noProof/>
             </w:rPr>
           </w:pPr>
-          <w:hyperlink w:anchor="_Toc241449971" w:history="1">
+          <w:hyperlink w:anchor="_Toc241528835" w:history="1">
             <w:r>
               <w:rPr>
                 <w:rStyle w:val="a5"/>
@@ -1661,7 +1661,7 @@
               <w:rPr>
                 <w:noProof/>
               </w:rPr>
-              <w:instrText xml:space="preserve"> PAGEREF _Toc241449971 \h </w:instrText>
+              <w:instrText xml:space="preserve"> PAGEREF _Toc241528835 \h </w:instrText>
             </w:r>
             <w:r>
               <w:rPr>
@@ -1698,7 +1698,7 @@
               <w:noProof/>
             </w:rPr>
           </w:pPr>
-          <w:hyperlink w:anchor="_Toc241449972" w:history="1">
+          <w:hyperlink w:anchor="_Toc241528836" w:history="1">
             <w:r>
               <w:rPr>
                 <w:rStyle w:val="a5"/>
@@ -1722,7 +1722,7 @@
               <w:rPr>
                 <w:noProof/>
               </w:rPr>
-              <w:instrText xml:space="preserve"> PAGEREF _Toc241449972 \h </w:instrText>
+              <w:instrText xml:space="preserve"> PAGEREF _Toc241528836 \h </w:instrText>
             </w:r>
             <w:r>
               <w:rPr>
@@ -1760,7 +1760,7 @@
               <w:noProof/>
             </w:rPr>
           </w:pPr>
-          <w:hyperlink w:anchor="_Toc241449973" w:history="1">
+          <w:hyperlink w:anchor="_Toc241528837" w:history="1">
             <w:r>
               <w:rPr>
                 <w:rStyle w:val="a5"/>
@@ -1784,7 +1784,7 @@
               <w:rPr>
                 <w:noProof/>
               </w:rPr>
-              <w:instrText xml:space="preserve"> PAGEREF _Toc241449973 \h </w:instrText>
+              <w:instrText xml:space="preserve"> PAGEREF _Toc241528837 \h </w:instrText>
             </w:r>
             <w:r>
               <w:rPr>
@@ -1822,7 +1822,7 @@
               <w:noProof/>
             </w:rPr>
           </w:pPr>
-          <w:hyperlink w:anchor="_Toc241449974" w:history="1">
+          <w:hyperlink w:anchor="_Toc241528838" w:history="1">
             <w:r>
               <w:rPr>
                 <w:rStyle w:val="a5"/>
@@ -1846,7 +1846,7 @@
               <w:rPr>
                 <w:noProof/>
               </w:rPr>
-              <w:instrText xml:space="preserve"> PAGEREF _Toc241449974 \h </w:instrText>
+              <w:instrText xml:space="preserve"> PAGEREF _Toc241528838 \h </w:instrText>
             </w:r>
             <w:r>
               <w:rPr>
@@ -1884,7 +1884,7 @@
               <w:noProof/>
             </w:rPr>
           </w:pPr>
-          <w:hyperlink w:anchor="_Toc241449975" w:history="1">
+          <w:hyperlink w:anchor="_Toc241528839" w:history="1">
             <w:r>
               <w:rPr>
                 <w:rStyle w:val="a5"/>
@@ -1908,7 +1908,7 @@
               <w:rPr>
                 <w:noProof/>
               </w:rPr>
-              <w:instrText xml:space="preserve"> PAGEREF _Toc241449975 \h </w:instrText>
+              <w:instrText xml:space="preserve"> PAGEREF _Toc241528839 \h </w:instrText>
             </w:r>
             <w:r>
               <w:rPr>
@@ -1946,7 +1946,7 @@
               <w:noProof/>
             </w:rPr>
           </w:pPr>
-          <w:hyperlink w:anchor="_Toc241449976" w:history="1">
+          <w:hyperlink w:anchor="_Toc241528840" w:history="1">
             <w:r>
               <w:rPr>
                 <w:rStyle w:val="a5"/>
@@ -1970,7 +1970,7 @@
               <w:rPr>
                 <w:noProof/>
               </w:rPr>
-              <w:instrText xml:space="preserve"> PAGEREF _Toc241449976 \h </w:instrText>
+              <w:instrText xml:space="preserve"> PAGEREF _Toc241528840 \h </w:instrText>
             </w:r>
             <w:r>
               <w:rPr>
@@ -2007,7 +2007,7 @@
               <w:noProof/>
             </w:rPr>
           </w:pPr>
-          <w:hyperlink w:anchor="_Toc241449977" w:history="1">
+          <w:hyperlink w:anchor="_Toc241528841" w:history="1">
             <w:r>
               <w:rPr>
                 <w:rStyle w:val="a5"/>
@@ -2031,7 +2031,7 @@
               <w:rPr>
                 <w:noProof/>
               </w:rPr>
-              <w:instrText xml:space="preserve"> PAGEREF _Toc241449977 \h </w:instrText>
+              <w:instrText xml:space="preserve"> PAGEREF _Toc241528841 \h </w:instrText>
             </w:r>
             <w:r>
               <w:rPr>
@@ -2069,7 +2069,7 @@
               <w:noProof/>
             </w:rPr>
           </w:pPr>
-          <w:hyperlink w:anchor="_Toc241449978" w:history="1">
+          <w:hyperlink w:anchor="_Toc241528842" w:history="1">
             <w:r>
               <w:rPr>
                 <w:rStyle w:val="a5"/>
@@ -2093,7 +2093,7 @@
               <w:rPr>
                 <w:noProof/>
               </w:rPr>
-              <w:instrText xml:space="preserve"> PAGEREF _Toc241449978 \h </w:instrText>
+              <w:instrText xml:space="preserve"> PAGEREF _Toc241528842 \h </w:instrText>
             </w:r>
             <w:r>
               <w:rPr>
@@ -2131,7 +2131,7 @@
               <w:noProof/>
             </w:rPr>
           </w:pPr>
-          <w:hyperlink w:anchor="_Toc241449979" w:history="1">
+          <w:hyperlink w:anchor="_Toc241528843" w:history="1">
             <w:r>
               <w:rPr>
                 <w:rStyle w:val="a5"/>
@@ -2155,7 +2155,7 @@
               <w:rPr>
                 <w:noProof/>
               </w:rPr>
-              <w:instrText xml:space="preserve"> PAGEREF _Toc241449979 \h </w:instrText>
+              <w:instrText xml:space="preserve"> PAGEREF _Toc241528843 \h </w:instrText>
             </w:r>
             <w:r>
               <w:rPr>
@@ -2193,7 +2193,7 @@
               <w:noProof/>
             </w:rPr>
           </w:pPr>
-          <w:hyperlink w:anchor="_Toc241449980" w:history="1">
+          <w:hyperlink w:anchor="_Toc241528844" w:history="1">
             <w:r>
               <w:rPr>
                 <w:rStyle w:val="a5"/>
@@ -2217,7 +2217,7 @@
               <w:rPr>
                 <w:noProof/>
               </w:rPr>
-              <w:instrText xml:space="preserve"> PAGEREF _Toc241449980 \h </w:instrText>
+              <w:instrText xml:space="preserve"> PAGEREF _Toc241528844 \h </w:instrText>
             </w:r>
             <w:r>
               <w:rPr>
@@ -2255,7 +2255,7 @@
               <w:noProof/>
             </w:rPr>
           </w:pPr>
-          <w:hyperlink w:anchor="_Toc241449981" w:history="1">
+          <w:hyperlink w:anchor="_Toc241528845" w:history="1">
             <w:r>
               <w:rPr>
                 <w:rStyle w:val="a5"/>
@@ -2279,7 +2279,7 @@
               <w:rPr>
                 <w:noProof/>
               </w:rPr>
-              <w:instrText xml:space="preserve"> PAGEREF _Toc241449981 \h </w:instrText>
+              <w:instrText xml:space="preserve"> PAGEREF _Toc241528845 \h </w:instrText>
             </w:r>
             <w:r>
               <w:rPr>
@@ -2316,7 +2316,7 @@
               <w:noProof/>
             </w:rPr>
           </w:pPr>
-          <w:hyperlink w:anchor="_Toc241449982" w:history="1">
+          <w:hyperlink w:anchor="_Toc241528846" w:history="1">
             <w:r>
               <w:rPr>
                 <w:rStyle w:val="a5"/>
@@ -2340,7 +2340,7 @@
               <w:rPr>
                 <w:noProof/>
               </w:rPr>
-              <w:instrText xml:space="preserve"> PAGEREF _Toc241449982 \h </w:instrText>
+              <w:instrText xml:space="preserve"> PAGEREF _Toc241528846 \h </w:instrText>
             </w:r>
             <w:r>
               <w:rPr>
@@ -2379,7 +2379,7 @@
         <w:pStyle w:val="1"/>
         <w:pageBreakBefore/>
       </w:pPr>
-      <w:bookmarkStart w:id="1" w:name="_Toc241449958"/>
+      <w:bookmarkStart w:id="1" w:name="_Toc241528822"/>
       <w:r>
         <w:t xml:space="preserve">1. </w:t>
       </w:r>
@@ -2610,7 +2610,7 @@
           <w:left w:w="10" w:type="dxa"/>
           <w:right w:w="10" w:type="dxa"/>
         </w:tblCellMar>
-        <w:tblLook w:val="0000" w:firstRow="0" w:lastRow="0" w:firstColumn="0" w:lastColumn="0" w:noHBand="0" w:noVBand="0"/>
+        <w:tblLook w:val="04A0" w:firstRow="1" w:lastRow="0" w:firstColumn="1" w:lastColumn="0" w:noHBand="0" w:noVBand="1"/>
       </w:tblPr>
       <w:tblGrid>
         <w:gridCol w:w="2800"/>
@@ -4018,7 +4018,7 @@
                 <w:sz w:val="19"/>
                 <w:szCs w:val="19"/>
               </w:rPr>
-              <w:t xml:space="preserve"> 76</w:t>
+              <w:t xml:space="preserve"> 79</w:t>
             </w:r>
             <w:r>
               <w:rPr>
@@ -4202,7 +4202,7 @@
         <w:pStyle w:val="1"/>
         <w:pageBreakBefore/>
       </w:pPr>
-      <w:bookmarkStart w:id="2" w:name="_Toc241449959"/>
+      <w:bookmarkStart w:id="2" w:name="_Toc241528823"/>
       <w:r>
         <w:t xml:space="preserve">2. </w:t>
       </w:r>
@@ -4244,7 +4244,7 @@
           <w:left w:w="10" w:type="dxa"/>
           <w:right w:w="10" w:type="dxa"/>
         </w:tblCellMar>
-        <w:tblLook w:val="0000" w:firstRow="0" w:lastRow="0" w:firstColumn="0" w:lastColumn="0" w:noHBand="0" w:noVBand="0"/>
+        <w:tblLook w:val="04A0" w:firstRow="1" w:lastRow="0" w:firstColumn="1" w:lastColumn="0" w:noHBand="0" w:noVBand="1"/>
       </w:tblPr>
       <w:tblGrid>
         <w:gridCol w:w="1700"/>
@@ -5818,7 +5818,7 @@
       <w:pPr>
         <w:pStyle w:val="2"/>
       </w:pPr>
-      <w:bookmarkStart w:id="3" w:name="_Toc241449960"/>
+      <w:bookmarkStart w:id="3" w:name="_Toc241528824"/>
       <w:r>
         <w:t>통합</w:t>
       </w:r>
@@ -6306,7 +6306,7 @@
         <w:pStyle w:val="1"/>
         <w:pageBreakBefore/>
       </w:pPr>
-      <w:bookmarkStart w:id="4" w:name="_Toc241449961"/>
+      <w:bookmarkStart w:id="4" w:name="_Toc241528825"/>
       <w:r>
         <w:t xml:space="preserve">3. </w:t>
       </w:r>
@@ -6342,7 +6342,7 @@
           <w:left w:w="10" w:type="dxa"/>
           <w:right w:w="10" w:type="dxa"/>
         </w:tblCellMar>
-        <w:tblLook w:val="0000" w:firstRow="0" w:lastRow="0" w:firstColumn="0" w:lastColumn="0" w:noHBand="0" w:noVBand="0"/>
+        <w:tblLook w:val="04A0" w:firstRow="1" w:lastRow="0" w:firstColumn="1" w:lastColumn="0" w:noHBand="0" w:noVBand="1"/>
       </w:tblPr>
       <w:tblGrid>
         <w:gridCol w:w="3600"/>
@@ -8789,7 +8789,7 @@
         <w:pStyle w:val="1"/>
         <w:pageBreakBefore/>
       </w:pPr>
-      <w:bookmarkStart w:id="5" w:name="_Toc241449962"/>
+      <w:bookmarkStart w:id="5" w:name="_Toc241528826"/>
       <w:r>
         <w:t xml:space="preserve">4. </w:t>
       </w:r>
@@ -8802,7 +8802,7 @@
       <w:pPr>
         <w:pStyle w:val="2"/>
       </w:pPr>
-      <w:bookmarkStart w:id="6" w:name="_Toc241449963"/>
+      <w:bookmarkStart w:id="6" w:name="_Toc241528827"/>
       <w:r>
         <w:t>기술</w:t>
       </w:r>
@@ -8829,7 +8829,7 @@
           <w:left w:w="10" w:type="dxa"/>
           <w:right w:w="10" w:type="dxa"/>
         </w:tblCellMar>
-        <w:tblLook w:val="0000" w:firstRow="0" w:lastRow="0" w:firstColumn="0" w:lastColumn="0" w:noHBand="0" w:noVBand="0"/>
+        <w:tblLook w:val="04A0" w:firstRow="1" w:lastRow="0" w:firstColumn="1" w:lastColumn="0" w:noHBand="0" w:noVBand="1"/>
       </w:tblPr>
       <w:tblGrid>
         <w:gridCol w:w="2400"/>
@@ -9604,7 +9604,7 @@
       <w:pPr>
         <w:pStyle w:val="2"/>
       </w:pPr>
-      <w:bookmarkStart w:id="7" w:name="_Toc241449964"/>
+      <w:bookmarkStart w:id="7" w:name="_Toc241528828"/>
       <w:r>
         <w:t>요청이</w:t>
       </w:r>
@@ -9956,7 +9956,7 @@
       <w:pPr>
         <w:pStyle w:val="2"/>
       </w:pPr>
-      <w:bookmarkStart w:id="8" w:name="_Toc241449965"/>
+      <w:bookmarkStart w:id="8" w:name="_Toc241528829"/>
       <w:r>
         <w:t>폴더</w:t>
       </w:r>
@@ -9983,7 +9983,7 @@
           <w:left w:w="10" w:type="dxa"/>
           <w:right w:w="10" w:type="dxa"/>
         </w:tblCellMar>
-        <w:tblLook w:val="0000" w:firstRow="0" w:lastRow="0" w:firstColumn="0" w:lastColumn="0" w:noHBand="0" w:noVBand="0"/>
+        <w:tblLook w:val="04A0" w:firstRow="1" w:lastRow="0" w:firstColumn="1" w:lastColumn="0" w:noHBand="0" w:noVBand="1"/>
       </w:tblPr>
       <w:tblGrid>
         <w:gridCol w:w="3000"/>
@@ -11326,7 +11326,7 @@
         <w:pStyle w:val="1"/>
         <w:pageBreakBefore/>
       </w:pPr>
-      <w:bookmarkStart w:id="9" w:name="_Toc241449966"/>
+      <w:bookmarkStart w:id="9" w:name="_Toc241528830"/>
       <w:r>
         <w:t xml:space="preserve">5. </w:t>
       </w:r>
@@ -11460,7 +11460,7 @@
           <w:left w:w="10" w:type="dxa"/>
           <w:right w:w="10" w:type="dxa"/>
         </w:tblCellMar>
-        <w:tblLook w:val="0000" w:firstRow="0" w:lastRow="0" w:firstColumn="0" w:lastColumn="0" w:noHBand="0" w:noVBand="0"/>
+        <w:tblLook w:val="04A0" w:firstRow="1" w:lastRow="0" w:firstColumn="1" w:lastColumn="0" w:noHBand="0" w:noVBand="1"/>
       </w:tblPr>
       <w:tblGrid>
         <w:gridCol w:w="3211"/>
@@ -12191,7 +12191,7 @@
       <w:pPr>
         <w:pStyle w:val="2"/>
       </w:pPr>
-      <w:bookmarkStart w:id="10" w:name="_Toc241449967"/>
+      <w:bookmarkStart w:id="10" w:name="_Toc241528831"/>
       <w:r>
         <w:t>운영</w:t>
       </w:r>
@@ -12727,7 +12727,7 @@
         <w:pStyle w:val="1"/>
         <w:pageBreakBefore/>
       </w:pPr>
-      <w:bookmarkStart w:id="11" w:name="_Toc241449968"/>
+      <w:bookmarkStart w:id="11" w:name="_Toc241528832"/>
       <w:r>
         <w:t xml:space="preserve">6. </w:t>
       </w:r>
@@ -12746,7 +12746,7 @@
       <w:pPr>
         <w:pStyle w:val="2"/>
       </w:pPr>
-      <w:bookmarkStart w:id="12" w:name="_Toc241449969"/>
+      <w:bookmarkStart w:id="12" w:name="_Toc241528833"/>
       <w:r>
         <w:t>환경변수</w:t>
       </w:r>
@@ -12806,7 +12806,7 @@
           <w:left w:w="10" w:type="dxa"/>
           <w:right w:w="10" w:type="dxa"/>
         </w:tblCellMar>
-        <w:tblLook w:val="0000" w:firstRow="0" w:lastRow="0" w:firstColumn="0" w:lastColumn="0" w:noHBand="0" w:noVBand="0"/>
+        <w:tblLook w:val="04A0" w:firstRow="1" w:lastRow="0" w:firstColumn="1" w:lastColumn="0" w:noHBand="0" w:noVBand="1"/>
       </w:tblPr>
       <w:tblGrid>
         <w:gridCol w:w="4234"/>
@@ -13743,7 +13743,7 @@
       <w:pPr>
         <w:pStyle w:val="2"/>
       </w:pPr>
-      <w:bookmarkStart w:id="13" w:name="_Toc241449970"/>
+      <w:bookmarkStart w:id="13" w:name="_Toc241528834"/>
       <w:r>
         <w:t>배포</w:t>
       </w:r>
@@ -14035,7 +14035,7 @@
       <w:pPr>
         <w:pStyle w:val="2"/>
       </w:pPr>
-      <w:bookmarkStart w:id="14" w:name="_Toc241449971"/>
+      <w:bookmarkStart w:id="14" w:name="_Toc241528835"/>
       <w:r>
         <w:t>안드로이드</w:t>
       </w:r>
@@ -14454,7 +14454,7 @@
         <w:pStyle w:val="1"/>
         <w:pageBreakBefore/>
       </w:pPr>
-      <w:bookmarkStart w:id="15" w:name="_Toc241449972"/>
+      <w:bookmarkStart w:id="15" w:name="_Toc241528836"/>
       <w:r>
         <w:t xml:space="preserve">7. </w:t>
       </w:r>
@@ -14479,7 +14479,7 @@
       <w:pPr>
         <w:pStyle w:val="2"/>
       </w:pPr>
-      <w:bookmarkStart w:id="16" w:name="_Toc241449973"/>
+      <w:bookmarkStart w:id="16" w:name="_Toc241528837"/>
       <w:r>
         <w:t xml:space="preserve">APK </w:t>
       </w:r>
@@ -14524,7 +14524,7 @@
           <w:left w:w="10" w:type="dxa"/>
           <w:right w:w="10" w:type="dxa"/>
         </w:tblCellMar>
-        <w:tblLook w:val="0000" w:firstRow="0" w:lastRow="0" w:firstColumn="0" w:lastColumn="0" w:noHBand="0" w:noVBand="0"/>
+        <w:tblLook w:val="04A0" w:firstRow="1" w:lastRow="0" w:firstColumn="1" w:lastColumn="0" w:noHBand="0" w:noVBand="1"/>
       </w:tblPr>
       <w:tblGrid>
         <w:gridCol w:w="3200"/>
@@ -15617,7 +15617,7 @@
       <w:pPr>
         <w:pStyle w:val="2"/>
       </w:pPr>
-      <w:bookmarkStart w:id="17" w:name="_Toc241449974"/>
+      <w:bookmarkStart w:id="17" w:name="_Toc241528838"/>
       <w:r>
         <w:t>사이트</w:t>
       </w:r>
@@ -15975,7 +15975,7 @@
       <w:pPr>
         <w:pStyle w:val="2"/>
       </w:pPr>
-      <w:bookmarkStart w:id="18" w:name="_Toc241449975"/>
+      <w:bookmarkStart w:id="18" w:name="_Toc241528839"/>
       <w:r>
         <w:t>테스트</w:t>
       </w:r>
@@ -15990,7 +15990,7 @@
         </w:numPr>
       </w:pPr>
       <w:r>
-        <w:t>npm test: 76</w:t>
+        <w:t>npm test: 79</w:t>
       </w:r>
       <w:r>
         <w:t>개</w:t>
@@ -16369,7 +16369,7 @@
       <w:pPr>
         <w:pStyle w:val="2"/>
       </w:pPr>
-      <w:bookmarkStart w:id="19" w:name="_Toc241449976"/>
+      <w:bookmarkStart w:id="19" w:name="_Toc241528840"/>
       <w:r>
         <w:t>알려진</w:t>
       </w:r>
@@ -16498,82 +16498,70 @@
         </w:numPr>
       </w:pPr>
       <w:r>
-        <w:t>스페인어</w:t>
-      </w:r>
-      <w:r>
-        <w:t>·</w:t>
-      </w:r>
-      <w:r>
-        <w:t>필리핀어에서</w:t>
-      </w:r>
-      <w:r>
-        <w:t xml:space="preserve"> </w:t>
-      </w:r>
-      <w:r>
-        <w:t>숫자</w:t>
-      </w:r>
-      <w:r>
-        <w:t xml:space="preserve"> </w:t>
-      </w:r>
-      <w:r>
-        <w:t>등이</w:t>
-      </w:r>
-      <w:r>
-        <w:t xml:space="preserve"> </w:t>
-      </w:r>
-      <w:r>
-        <w:t>끼어</w:t>
-      </w:r>
-      <w:r>
-        <w:t xml:space="preserve"> </w:t>
-      </w:r>
-      <w:r>
-        <w:t>있는</w:t>
-      </w:r>
-      <w:r>
-        <w:t xml:space="preserve"> </w:t>
-      </w:r>
-      <w:r>
-        <w:t>일부</w:t>
-      </w:r>
-      <w:r>
-        <w:t xml:space="preserve"> </w:t>
-      </w:r>
-      <w:r>
-        <w:t>문장</w:t>
+        <w:t>화면의</w:t>
+      </w:r>
+      <w:r>
+        <w:t xml:space="preserve"> 'WEEK 40', '01 · READ' </w:t>
+      </w:r>
+      <w:r>
+        <w:t>같은</w:t>
+      </w:r>
+      <w:r>
+        <w:t xml:space="preserve"> </w:t>
+      </w:r>
+      <w:r>
+        <w:t>디자인용</w:t>
+      </w:r>
+      <w:r>
+        <w:t xml:space="preserve"> </w:t>
+      </w:r>
+      <w:r>
+        <w:t>장식</w:t>
+      </w:r>
+      <w:r>
+        <w:t xml:space="preserve"> </w:t>
+      </w:r>
+      <w:r>
+        <w:t>글자는</w:t>
+      </w:r>
+      <w:r>
+        <w:t xml:space="preserve"> </w:t>
+      </w:r>
+      <w:r>
+        <w:t>모든</w:t>
+      </w:r>
+      <w:r>
+        <w:t xml:space="preserve"> </w:t>
+      </w:r>
+      <w:r>
+        <w:t>언어에서</w:t>
+      </w:r>
+      <w:r>
+        <w:t xml:space="preserve"> </w:t>
+      </w:r>
+      <w:r>
+        <w:t>영어로</w:t>
+      </w:r>
+      <w:r>
+        <w:t xml:space="preserve"> </w:t>
+      </w:r>
+      <w:r>
+        <w:t>둔다</w:t>
       </w:r>
       <w:r>
         <w:t>(</w:t>
       </w:r>
       <w:r>
-        <w:t>템플릿</w:t>
-      </w:r>
-      <w:r>
-        <w:t xml:space="preserve"> </w:t>
-      </w:r>
-      <w:r>
-        <w:t>문장</w:t>
-      </w:r>
-      <w:r>
-        <w:t>)</w:t>
-      </w:r>
-      <w:r>
-        <w:t>은</w:t>
-      </w:r>
-      <w:r>
-        <w:t xml:space="preserve"> </w:t>
-      </w:r>
-      <w:r>
-        <w:t>영어로</w:t>
-      </w:r>
-      <w:r>
-        <w:t xml:space="preserve"> </w:t>
-      </w:r>
-      <w:r>
-        <w:t>보임</w:t>
-      </w:r>
-      <w:r>
-        <w:t>.</w:t>
+        <w:t>원래</w:t>
+      </w:r>
+      <w:r>
+        <w:t xml:space="preserve"> gospel-class </w:t>
+      </w:r>
+      <w:r>
+        <w:t>디자인</w:t>
+      </w:r>
+      <w:r>
+        <w:t>).</w:t>
       </w:r>
     </w:p>
     <w:p>
@@ -16812,7 +16800,7 @@
         <w:pStyle w:val="1"/>
         <w:pageBreakBefore/>
       </w:pPr>
-      <w:bookmarkStart w:id="20" w:name="_Toc241449977"/>
+      <w:bookmarkStart w:id="20" w:name="_Toc241528841"/>
       <w:r>
         <w:t xml:space="preserve">8. </w:t>
       </w:r>
@@ -16837,7 +16825,7 @@
       <w:pPr>
         <w:pStyle w:val="2"/>
       </w:pPr>
-      <w:bookmarkStart w:id="21" w:name="_Toc241449978"/>
+      <w:bookmarkStart w:id="21" w:name="_Toc241528842"/>
       <w:r>
         <w:t>처음</w:t>
       </w:r>
@@ -17033,7 +17021,7 @@
       <w:pPr>
         <w:pStyle w:val="2"/>
       </w:pPr>
-      <w:bookmarkStart w:id="22" w:name="_Toc241449979"/>
+      <w:bookmarkStart w:id="22" w:name="_Toc241528843"/>
       <w:r>
         <w:t>새</w:t>
       </w:r>
@@ -17448,7 +17436,7 @@
       <w:pPr>
         <w:pStyle w:val="2"/>
       </w:pPr>
-      <w:bookmarkStart w:id="23" w:name="_Toc241449980"/>
+      <w:bookmarkStart w:id="23" w:name="_Toc241528844"/>
       <w:r>
         <w:t>지켜</w:t>
       </w:r>
@@ -17704,7 +17692,7 @@
       <w:pPr>
         <w:pStyle w:val="2"/>
       </w:pPr>
-      <w:bookmarkStart w:id="24" w:name="_Toc241449981"/>
+      <w:bookmarkStart w:id="24" w:name="_Toc241528845"/>
       <w:r>
         <w:t>다음에</w:t>
       </w:r>
@@ -17743,52 +17731,64 @@
         </w:numPr>
       </w:pPr>
       <w:r>
-        <w:t>스페인어</w:t>
-      </w:r>
-      <w:r>
-        <w:t>·</w:t>
-      </w:r>
-      <w:r>
-        <w:t>필리핀어</w:t>
-      </w:r>
-      <w:r>
-        <w:t xml:space="preserve"> </w:t>
-      </w:r>
-      <w:r>
-        <w:t>템플릿</w:t>
-      </w:r>
-      <w:r>
-        <w:t xml:space="preserve"> </w:t>
-      </w:r>
-      <w:r>
-        <w:t>문장까지</w:t>
-      </w:r>
-      <w:r>
-        <w:t xml:space="preserve"> </w:t>
-      </w:r>
-      <w:r>
-        <w:t>번역되도록</w:t>
-      </w:r>
-      <w:r>
-        <w:t xml:space="preserve"> </w:t>
-      </w:r>
-      <w:r>
-        <w:t>번역</w:t>
-      </w:r>
-      <w:r>
-        <w:t xml:space="preserve"> </w:t>
-      </w:r>
-      <w:r>
-        <w:t>함수</w:t>
-      </w:r>
-      <w:r>
-        <w:t xml:space="preserve"> </w:t>
-      </w:r>
-      <w:r>
-        <w:t>확장</w:t>
-      </w:r>
-      <w:r>
-        <w:t>.</w:t>
+        <w:t>학습지</w:t>
+      </w:r>
+      <w:r>
+        <w:t xml:space="preserve"> </w:t>
+      </w:r>
+      <w:r>
+        <w:t>가져오기에</w:t>
+      </w:r>
+      <w:r>
+        <w:t xml:space="preserve"> </w:t>
+      </w:r>
+      <w:r>
+        <w:t>압축</w:t>
+      </w:r>
+      <w:r>
+        <w:t xml:space="preserve"> </w:t>
+      </w:r>
+      <w:r>
+        <w:t>해제</w:t>
+      </w:r>
+      <w:r>
+        <w:t xml:space="preserve"> </w:t>
+      </w:r>
+      <w:r>
+        <w:t>크기</w:t>
+      </w:r>
+      <w:r>
+        <w:t xml:space="preserve"> </w:t>
+      </w:r>
+      <w:r>
+        <w:t>제한</w:t>
+      </w:r>
+      <w:r>
+        <w:t xml:space="preserve"> </w:t>
+      </w:r>
+      <w:r>
+        <w:t>추가</w:t>
+      </w:r>
+      <w:r>
+        <w:t>(</w:t>
+      </w:r>
+      <w:r>
+        <w:t>아주</w:t>
+      </w:r>
+      <w:r>
+        <w:t xml:space="preserve"> </w:t>
+      </w:r>
+      <w:r>
+        <w:t>큰</w:t>
+      </w:r>
+      <w:r>
+        <w:t xml:space="preserve"> docx·hwpx </w:t>
+      </w:r>
+      <w:r>
+        <w:t>대비</w:t>
+      </w:r>
+      <w:r>
+        <w:t>).</w:t>
       </w:r>
     </w:p>
     <w:p>
@@ -17928,7 +17928,7 @@
         <w:pStyle w:val="1"/>
         <w:pageBreakBefore/>
       </w:pPr>
-      <w:bookmarkStart w:id="25" w:name="_Toc241449982"/>
+      <w:bookmarkStart w:id="25" w:name="_Toc241528846"/>
       <w:r>
         <w:t>부록</w:t>
       </w:r>
@@ -17967,7 +17967,7 @@
           <w:left w:w="10" w:type="dxa"/>
           <w:right w:w="10" w:type="dxa"/>
         </w:tblCellMar>
-        <w:tblLook w:val="0000" w:firstRow="0" w:lastRow="0" w:firstColumn="0" w:lastColumn="0" w:noHBand="0" w:noVBand="0"/>
+        <w:tblLook w:val="04A0" w:firstRow="1" w:lastRow="0" w:firstColumn="1" w:lastColumn="0" w:noHBand="0" w:noVBand="1"/>
       </w:tblPr>
       <w:tblGrid>
         <w:gridCol w:w="4400"/>
@@ -19181,10 +19181,118 @@
 <file path=word/numbering.xml><?xml version="1.0" encoding="utf-8"?>
 <w:numbering xmlns:wpc="http://schemas.microsoft.com/office/word/2010/wordprocessingCanvas" xmlns:cx="http://schemas.microsoft.com/office/drawing/2014/chartex" xmlns:cx1="http://schemas.microsoft.com/office/drawing/2015/9/8/chartex" xmlns:cx2="http://schemas.microsoft.com/office/drawing/2015/10/21/chartex" xmlns:cx3="http://schemas.microsoft.com/office/drawing/2016/5/9/chartex" xmlns:cx4="http://schemas.microsoft.com/office/drawing/2016/5/10/chartex" xmlns:cx5="http://schemas.microsoft.com/office/drawing/2016/5/11/chartex" xmlns:cx6="http://schemas.microsoft.com/office/drawing/2016/5/12/chartex" xmlns:cx7="http://schemas.microsoft.com/office/drawing/2016/5/13/chartex" xmlns:cx8="http://schemas.microsoft.com/office/drawing/2016/5/14/chartex" xmlns:mc="http://schemas.openxmlformats.org/markup-compatibility/2006" xmlns:aink="http://schemas.microsoft.com/office/drawing/2016/ink" xmlns:am3d="http://schemas.microsoft.com/office/drawing/2017/model3d" xmlns:o="urn:schemas-microsoft-com:office:office" xmlns:oel="http://schemas.microsoft.com/office/2019/extlst" xmlns:r="http://schemas.openxmlformats.org/officeDocument/2006/relationships" xmlns:m="http://schemas.openxmlformats.org/officeDocument/2006/math" xmlns:v="urn:schemas-microsoft-com:vml" xmlns:wp14="http://schemas.microsoft.com/office/word/2010/wordprocessingDrawing" xmlns:wp="http://schemas.openxmlformats.org/drawingml/2006/wordprocessingDrawing" xmlns:w10="urn:schemas-microsoft-com:office:word" xmlns:w="http://schemas.openxmlformats.org/wordprocessingml/2006/main" xmlns:w14="http://schemas.microsoft.com/office/word/2010/wordml" xmlns:w15="http://schemas.microsoft.com/office/word/2012/wordml" xmlns:w16cex="http://schemas.microsoft.com/office/word/2018/wordml/cex" xmlns:w16cid="http://schemas.microsoft.com/office/word/2016/wordml/cid" xmlns:w16="http://schemas.microsoft.com/office/word/2018/wordml" xmlns:w16du="http://schemas.microsoft.com/office/word/2023/wordml/word16du" xmlns:w16sdtdh="http://schemas.microsoft.com/office/word/2020/wordml/sdtdatahash" xmlns:w16sdtfl="http://schemas.microsoft.com/office/word/2024/wordml/sdtformatlock" xmlns:w16se="http://schemas.microsoft.com/office/word/2015/wordml/symex" xmlns:wpg="http://schemas.microsoft.com/office/word/2010/wordprocessingGroup" xmlns:wpi="http://schemas.microsoft.com/office/word/2010/wordprocessingInk" xmlns:wne="http://schemas.microsoft.com/office/word/2006/wordml" xmlns:wps="http://schemas.microsoft.com/office/word/2010/wordprocessingShape" mc:Ignorable="w14 w15 w16se w16cid w16 w16cex w16sdtdh w16sdtfl w16du wp14">
   <w:abstractNum w:abstractNumId="0" w15:restartNumberingAfterBreak="0">
-    <w:nsid w:val="0EE35B20"/>
+    <w:nsid w:val="0A005194"/>
     <w:multiLevelType w:val="hybridMultilevel"/>
-    <w:tmpl w:val="BEEA8D40"/>
-    <w:lvl w:ilvl="0" w:tplc="6F70A46E">
+    <w:tmpl w:val="E0AA7952"/>
+    <w:lvl w:ilvl="0" w:tplc="BE32073C">
+      <w:start w:val="1"/>
+      <w:numFmt w:val="bullet"/>
+      <w:lvlText w:val="•"/>
+      <w:lvlJc w:val="left"/>
+      <w:pPr>
+        <w:ind w:left="540" w:hanging="360"/>
+      </w:pPr>
+    </w:lvl>
+    <w:lvl w:ilvl="1" w:tplc="EE40B008">
+      <w:numFmt w:val="decimal"/>
+      <w:lvlText w:val=""/>
+      <w:lvlJc w:val="left"/>
+    </w:lvl>
+    <w:lvl w:ilvl="2" w:tplc="C534DD72">
+      <w:numFmt w:val="decimal"/>
+      <w:lvlText w:val=""/>
+      <w:lvlJc w:val="left"/>
+    </w:lvl>
+    <w:lvl w:ilvl="3" w:tplc="0FBE5FBA">
+      <w:numFmt w:val="decimal"/>
+      <w:lvlText w:val=""/>
+      <w:lvlJc w:val="left"/>
+    </w:lvl>
+    <w:lvl w:ilvl="4" w:tplc="DA207A1A">
+      <w:numFmt w:val="decimal"/>
+      <w:lvlText w:val=""/>
+      <w:lvlJc w:val="left"/>
+    </w:lvl>
+    <w:lvl w:ilvl="5" w:tplc="95206C24">
+      <w:numFmt w:val="decimal"/>
+      <w:lvlText w:val=""/>
+      <w:lvlJc w:val="left"/>
+    </w:lvl>
+    <w:lvl w:ilvl="6" w:tplc="02D62E2A">
+      <w:numFmt w:val="decimal"/>
+      <w:lvlText w:val=""/>
+      <w:lvlJc w:val="left"/>
+    </w:lvl>
+    <w:lvl w:ilvl="7" w:tplc="8460E7CA">
+      <w:numFmt w:val="decimal"/>
+      <w:lvlText w:val=""/>
+      <w:lvlJc w:val="left"/>
+    </w:lvl>
+    <w:lvl w:ilvl="8" w:tplc="ECF646CC">
+      <w:numFmt w:val="decimal"/>
+      <w:lvlText w:val=""/>
+      <w:lvlJc w:val="left"/>
+    </w:lvl>
+  </w:abstractNum>
+  <w:abstractNum w:abstractNumId="1" w15:restartNumberingAfterBreak="0">
+    <w:nsid w:val="28E93DA6"/>
+    <w:multiLevelType w:val="hybridMultilevel"/>
+    <w:tmpl w:val="9FA06D22"/>
+    <w:lvl w:ilvl="0" w:tplc="37D2C614">
+      <w:start w:val="1"/>
+      <w:numFmt w:val="decimal"/>
+      <w:lvlText w:val="%1."/>
+      <w:lvlJc w:val="left"/>
+      <w:pPr>
+        <w:ind w:left="540" w:hanging="360"/>
+      </w:pPr>
+    </w:lvl>
+    <w:lvl w:ilvl="1" w:tplc="85744D16">
+      <w:numFmt w:val="decimal"/>
+      <w:lvlText w:val=""/>
+      <w:lvlJc w:val="left"/>
+    </w:lvl>
+    <w:lvl w:ilvl="2" w:tplc="BDE0DB22">
+      <w:numFmt w:val="decimal"/>
+      <w:lvlText w:val=""/>
+      <w:lvlJc w:val="left"/>
+    </w:lvl>
+    <w:lvl w:ilvl="3" w:tplc="52DE8C5C">
+      <w:numFmt w:val="decimal"/>
+      <w:lvlText w:val=""/>
+      <w:lvlJc w:val="left"/>
+    </w:lvl>
+    <w:lvl w:ilvl="4" w:tplc="200E1D12">
+      <w:numFmt w:val="decimal"/>
+      <w:lvlText w:val=""/>
+      <w:lvlJc w:val="left"/>
+    </w:lvl>
+    <w:lvl w:ilvl="5" w:tplc="AD1221F4">
+      <w:numFmt w:val="decimal"/>
+      <w:lvlText w:val=""/>
+      <w:lvlJc w:val="left"/>
+    </w:lvl>
+    <w:lvl w:ilvl="6" w:tplc="D1265A76">
+      <w:numFmt w:val="decimal"/>
+      <w:lvlText w:val=""/>
+      <w:lvlJc w:val="left"/>
+    </w:lvl>
+    <w:lvl w:ilvl="7" w:tplc="DDF6C604">
+      <w:numFmt w:val="decimal"/>
+      <w:lvlText w:val=""/>
+      <w:lvlJc w:val="left"/>
+    </w:lvl>
+    <w:lvl w:ilvl="8" w:tplc="09D0DC6E">
+      <w:numFmt w:val="decimal"/>
+      <w:lvlText w:val=""/>
+      <w:lvlJc w:val="left"/>
+    </w:lvl>
+  </w:abstractNum>
+  <w:abstractNum w:abstractNumId="2" w15:restartNumberingAfterBreak="0">
+    <w:nsid w:val="7D864E57"/>
+    <w:multiLevelType w:val="hybridMultilevel"/>
+    <w:tmpl w:val="87BEED28"/>
+    <w:lvl w:ilvl="0" w:tplc="AE76832A">
       <w:start w:val="1"/>
       <w:numFmt w:val="bullet"/>
       <w:lvlText w:val="●"/>
@@ -19193,7 +19301,7 @@
         <w:ind w:left="720" w:hanging="360"/>
       </w:pPr>
     </w:lvl>
-    <w:lvl w:ilvl="1" w:tplc="A72A6D90">
+    <w:lvl w:ilvl="1" w:tplc="4144447A">
       <w:start w:val="1"/>
       <w:numFmt w:val="bullet"/>
       <w:lvlText w:val="○"/>
@@ -19202,7 +19310,7 @@
         <w:ind w:left="1440" w:hanging="360"/>
       </w:pPr>
     </w:lvl>
-    <w:lvl w:ilvl="2" w:tplc="CCEAA2FC">
+    <w:lvl w:ilvl="2" w:tplc="9020AEFC">
       <w:start w:val="1"/>
       <w:numFmt w:val="bullet"/>
       <w:lvlText w:val="■"/>
@@ -19211,7 +19319,7 @@
         <w:ind w:left="2160" w:hanging="360"/>
       </w:pPr>
     </w:lvl>
-    <w:lvl w:ilvl="3" w:tplc="0A22FBEA">
+    <w:lvl w:ilvl="3" w:tplc="805CC00C">
       <w:start w:val="1"/>
       <w:numFmt w:val="bullet"/>
       <w:lvlText w:val="●"/>
@@ -19220,7 +19328,7 @@
         <w:ind w:left="2880" w:hanging="360"/>
       </w:pPr>
     </w:lvl>
-    <w:lvl w:ilvl="4" w:tplc="E0A24AC2">
+    <w:lvl w:ilvl="4" w:tplc="FE325BFA">
       <w:start w:val="1"/>
       <w:numFmt w:val="bullet"/>
       <w:lvlText w:val="○"/>
@@ -19229,7 +19337,7 @@
         <w:ind w:left="3600" w:hanging="360"/>
       </w:pPr>
     </w:lvl>
-    <w:lvl w:ilvl="5" w:tplc="7CC87FC8">
+    <w:lvl w:ilvl="5" w:tplc="0EBEE9AE">
       <w:start w:val="1"/>
       <w:numFmt w:val="bullet"/>
       <w:lvlText w:val="■"/>
@@ -19238,7 +19346,7 @@
         <w:ind w:left="4320" w:hanging="360"/>
       </w:pPr>
     </w:lvl>
-    <w:lvl w:ilvl="6" w:tplc="82A6C120">
+    <w:lvl w:ilvl="6" w:tplc="75A6BEA0">
       <w:start w:val="1"/>
       <w:numFmt w:val="bullet"/>
       <w:lvlText w:val="●"/>
@@ -19247,7 +19355,7 @@
         <w:ind w:left="5040" w:hanging="360"/>
       </w:pPr>
     </w:lvl>
-    <w:lvl w:ilvl="7" w:tplc="6F28D5BA">
+    <w:lvl w:ilvl="7" w:tplc="9B06D2C0">
       <w:start w:val="1"/>
       <w:numFmt w:val="bullet"/>
       <w:lvlText w:val="●"/>
@@ -19256,7 +19364,7 @@
         <w:ind w:left="5760" w:hanging="360"/>
       </w:pPr>
     </w:lvl>
-    <w:lvl w:ilvl="8" w:tplc="FBB606F6">
+    <w:lvl w:ilvl="8" w:tplc="C206E208">
       <w:start w:val="1"/>
       <w:numFmt w:val="bullet"/>
       <w:lvlText w:val="●"/>
@@ -19266,151 +19374,43 @@
       </w:pPr>
     </w:lvl>
   </w:abstractNum>
-  <w:abstractNum w:abstractNumId="1" w15:restartNumberingAfterBreak="0">
-    <w:nsid w:val="46C830DA"/>
-    <w:multiLevelType w:val="hybridMultilevel"/>
-    <w:tmpl w:val="BB16B89E"/>
-    <w:lvl w:ilvl="0" w:tplc="F4564174">
-      <w:start w:val="1"/>
-      <w:numFmt w:val="decimal"/>
-      <w:lvlText w:val="%1."/>
-      <w:lvlJc w:val="left"/>
-      <w:pPr>
-        <w:ind w:left="540" w:hanging="360"/>
-      </w:pPr>
-    </w:lvl>
-    <w:lvl w:ilvl="1" w:tplc="83E0A2A6">
-      <w:numFmt w:val="decimal"/>
-      <w:lvlText w:val=""/>
-      <w:lvlJc w:val="left"/>
-    </w:lvl>
-    <w:lvl w:ilvl="2" w:tplc="5E988136">
-      <w:numFmt w:val="decimal"/>
-      <w:lvlText w:val=""/>
-      <w:lvlJc w:val="left"/>
-    </w:lvl>
-    <w:lvl w:ilvl="3" w:tplc="8F6CB536">
-      <w:numFmt w:val="decimal"/>
-      <w:lvlText w:val=""/>
-      <w:lvlJc w:val="left"/>
-    </w:lvl>
-    <w:lvl w:ilvl="4" w:tplc="7D7C8996">
-      <w:numFmt w:val="decimal"/>
-      <w:lvlText w:val=""/>
-      <w:lvlJc w:val="left"/>
-    </w:lvl>
-    <w:lvl w:ilvl="5" w:tplc="D7BA940E">
-      <w:numFmt w:val="decimal"/>
-      <w:lvlText w:val=""/>
-      <w:lvlJc w:val="left"/>
-    </w:lvl>
-    <w:lvl w:ilvl="6" w:tplc="450C71D8">
-      <w:numFmt w:val="decimal"/>
-      <w:lvlText w:val=""/>
-      <w:lvlJc w:val="left"/>
-    </w:lvl>
-    <w:lvl w:ilvl="7" w:tplc="FCAAAA44">
-      <w:numFmt w:val="decimal"/>
-      <w:lvlText w:val=""/>
-      <w:lvlJc w:val="left"/>
-    </w:lvl>
-    <w:lvl w:ilvl="8" w:tplc="642A1962">
-      <w:numFmt w:val="decimal"/>
-      <w:lvlText w:val=""/>
-      <w:lvlJc w:val="left"/>
-    </w:lvl>
-  </w:abstractNum>
-  <w:abstractNum w:abstractNumId="2" w15:restartNumberingAfterBreak="0">
-    <w:nsid w:val="61CF1DB0"/>
-    <w:multiLevelType w:val="hybridMultilevel"/>
-    <w:tmpl w:val="21D41F70"/>
-    <w:lvl w:ilvl="0" w:tplc="6AD030CE">
-      <w:start w:val="1"/>
-      <w:numFmt w:val="bullet"/>
-      <w:lvlText w:val="•"/>
-      <w:lvlJc w:val="left"/>
-      <w:pPr>
-        <w:ind w:left="540" w:hanging="360"/>
-      </w:pPr>
-    </w:lvl>
-    <w:lvl w:ilvl="1" w:tplc="AF363B8E">
-      <w:numFmt w:val="decimal"/>
-      <w:lvlText w:val=""/>
-      <w:lvlJc w:val="left"/>
-    </w:lvl>
-    <w:lvl w:ilvl="2" w:tplc="2CA64DF8">
-      <w:numFmt w:val="decimal"/>
-      <w:lvlText w:val=""/>
-      <w:lvlJc w:val="left"/>
-    </w:lvl>
-    <w:lvl w:ilvl="3" w:tplc="A018642A">
-      <w:numFmt w:val="decimal"/>
-      <w:lvlText w:val=""/>
-      <w:lvlJc w:val="left"/>
-    </w:lvl>
-    <w:lvl w:ilvl="4" w:tplc="0A58190C">
-      <w:numFmt w:val="decimal"/>
-      <w:lvlText w:val=""/>
-      <w:lvlJc w:val="left"/>
-    </w:lvl>
-    <w:lvl w:ilvl="5" w:tplc="36966782">
-      <w:numFmt w:val="decimal"/>
-      <w:lvlText w:val=""/>
-      <w:lvlJc w:val="left"/>
-    </w:lvl>
-    <w:lvl w:ilvl="6" w:tplc="80FA71EE">
-      <w:numFmt w:val="decimal"/>
-      <w:lvlText w:val=""/>
-      <w:lvlJc w:val="left"/>
-    </w:lvl>
-    <w:lvl w:ilvl="7" w:tplc="5BDC8338">
-      <w:numFmt w:val="decimal"/>
-      <w:lvlText w:val=""/>
-      <w:lvlJc w:val="left"/>
-    </w:lvl>
-    <w:lvl w:ilvl="8" w:tplc="5C2A2D56">
-      <w:numFmt w:val="decimal"/>
-      <w:lvlText w:val=""/>
-      <w:lvlJc w:val="left"/>
-    </w:lvl>
-  </w:abstractNum>
-  <w:num w:numId="1" w16cid:durableId="988560239">
+  <w:num w:numId="1" w16cid:durableId="1153105938">
+    <w:abstractNumId w:val="2"/>
+    <w:lvlOverride w:ilvl="0">
+      <w:startOverride w:val="1"/>
+    </w:lvlOverride>
+  </w:num>
+  <w:num w:numId="2" w16cid:durableId="1076443342">
     <w:abstractNumId w:val="0"/>
     <w:lvlOverride w:ilvl="0">
       <w:startOverride w:val="1"/>
     </w:lvlOverride>
   </w:num>
-  <w:num w:numId="2" w16cid:durableId="1574926170">
-    <w:abstractNumId w:val="2"/>
-    <w:lvlOverride w:ilvl="0">
-      <w:startOverride w:val="1"/>
-    </w:lvlOverride>
-  </w:num>
-  <w:num w:numId="3" w16cid:durableId="1879392297">
+  <w:num w:numId="3" w16cid:durableId="1686394435">
     <w:abstractNumId w:val="1"/>
     <w:lvlOverride w:ilvl="0">
       <w:startOverride w:val="1"/>
     </w:lvlOverride>
   </w:num>
-  <w:num w:numId="4" w16cid:durableId="1426992939">
+  <w:num w:numId="4" w16cid:durableId="213348005">
     <w:abstractNumId w:val="1"/>
     <w:lvlOverride w:ilvl="0">
       <w:startOverride w:val="1"/>
     </w:lvlOverride>
   </w:num>
-  <w:num w:numId="5" w16cid:durableId="1667854629">
+  <w:num w:numId="5" w16cid:durableId="809517726">
     <w:abstractNumId w:val="1"/>
     <w:lvlOverride w:ilvl="0">
       <w:startOverride w:val="1"/>
     </w:lvlOverride>
   </w:num>
-  <w:num w:numId="6" w16cid:durableId="508057727">
+  <w:num w:numId="6" w16cid:durableId="329990804">
     <w:abstractNumId w:val="1"/>
     <w:lvlOverride w:ilvl="0">
       <w:startOverride w:val="1"/>
     </w:lvlOverride>
   </w:num>
-  <w:num w:numId="7" w16cid:durableId="231893936">
+  <w:num w:numId="7" w16cid:durableId="1139807707">
     <w:abstractNumId w:val="1"/>
     <w:lvlOverride w:ilvl="0">
       <w:startOverride w:val="1"/>
@@ -20044,7 +20044,7 @@
     <w:link w:val="Char1"/>
     <w:uiPriority w:val="99"/>
     <w:unhideWhenUsed/>
-    <w:rsid w:val="00493F44"/>
+    <w:rsid w:val="008B5FE6"/>
     <w:pPr>
       <w:tabs>
         <w:tab w:val="center" w:pos="4513"/>
@@ -20058,7 +20058,7 @@
     <w:basedOn w:val="a0"/>
     <w:link w:val="aa"/>
     <w:uiPriority w:val="99"/>
-    <w:rsid w:val="00493F44"/>
+    <w:rsid w:val="008B5FE6"/>
   </w:style>
   <w:style w:type="paragraph" w:styleId="ab">
     <w:name w:val="footer"/>
@@ -20066,7 +20066,7 @@
     <w:link w:val="Char2"/>
     <w:uiPriority w:val="99"/>
     <w:unhideWhenUsed/>
-    <w:rsid w:val="00493F44"/>
+    <w:rsid w:val="008B5FE6"/>
     <w:pPr>
       <w:tabs>
         <w:tab w:val="center" w:pos="4513"/>
@@ -20080,7 +20080,7 @@
     <w:basedOn w:val="a0"/>
     <w:link w:val="ab"/>
     <w:uiPriority w:val="99"/>
-    <w:rsid w:val="00493F44"/>
+    <w:rsid w:val="008B5FE6"/>
   </w:style>
   <w:style w:type="paragraph" w:styleId="11">
     <w:name w:val="toc 1"/>
@@ -20089,7 +20089,7 @@
     <w:autoRedefine/>
     <w:uiPriority w:val="39"/>
     <w:unhideWhenUsed/>
-    <w:rsid w:val="00493F44"/>
+    <w:rsid w:val="008B5FE6"/>
   </w:style>
   <w:style w:type="paragraph" w:styleId="20">
     <w:name w:val="toc 2"/>
@@ -20098,7 +20098,7 @@
     <w:autoRedefine/>
     <w:uiPriority w:val="39"/>
     <w:unhideWhenUsed/>
-    <w:rsid w:val="00493F44"/>
+    <w:rsid w:val="008B5FE6"/>
     <w:pPr>
       <w:ind w:leftChars="200" w:left="425"/>
     </w:pPr>

</xml_diff>

<commit_message>
feat: refuse worksheet zips that expand too much; scripture reader opens without a nickname
- zipTooLarge reads the zip directory before any library unpacks docx/hwpx
  (over 40 MB unpacked, over 3000 entries, zip64 or unreadable → file_too_complex)
- /scriptures joins the public pages (verse notes post as 익명 like /think)

Co-Authored-By: Claude Opus 5.5 <noreply@anthropic.com>
</commit_message>
<xml_diff>
--- a/개발보고서(공동개발자용)/곡반정와드_공동개발자_보고서.docx
+++ b/개발보고서(공동개발자용)/곡반정와드_공동개발자_보고서.docx
@@ -743,7 +743,7 @@
       <w:pPr>
         <w:pStyle w:val="1"/>
       </w:pPr>
-      <w:bookmarkStart w:id="0" w:name="_Toc241528821"/>
+      <w:bookmarkStart w:id="0" w:name="_Toc241529535"/>
       <w:r>
         <w:t>목차</w:t>
       </w:r>
@@ -752,7 +752,7 @@
     <w:sdt>
       <w:sdtPr>
         <w:alias w:val="목차"/>
-        <w:id w:val="1684632929"/>
+        <w:id w:val="-1444766560"/>
       </w:sdtPr>
       <w:sdtEndPr/>
       <w:sdtContent>
@@ -775,7 +775,7 @@
           <w:r>
             <w:fldChar w:fldCharType="separate"/>
           </w:r>
-          <w:hyperlink w:anchor="_Toc241528821" w:history="1">
+          <w:hyperlink w:anchor="_Toc241529535" w:history="1">
             <w:r>
               <w:rPr>
                 <w:rStyle w:val="a5"/>
@@ -799,7 +799,7 @@
               <w:rPr>
                 <w:noProof/>
               </w:rPr>
-              <w:instrText xml:space="preserve"> PAGEREF _Toc241528821 \h </w:instrText>
+              <w:instrText xml:space="preserve"> PAGEREF _Toc241529535 \h </w:instrText>
             </w:r>
             <w:r>
               <w:rPr>
@@ -836,7 +836,7 @@
               <w:noProof/>
             </w:rPr>
           </w:pPr>
-          <w:hyperlink w:anchor="_Toc241528822" w:history="1">
+          <w:hyperlink w:anchor="_Toc241529536" w:history="1">
             <w:r>
               <w:rPr>
                 <w:rStyle w:val="a5"/>
@@ -860,7 +860,7 @@
               <w:rPr>
                 <w:noProof/>
               </w:rPr>
-              <w:instrText xml:space="preserve"> PAGEREF _Toc241528822 \h </w:instrText>
+              <w:instrText xml:space="preserve"> PAGEREF _Toc241529536 \h </w:instrText>
             </w:r>
             <w:r>
               <w:rPr>
@@ -897,7 +897,7 @@
               <w:noProof/>
             </w:rPr>
           </w:pPr>
-          <w:hyperlink w:anchor="_Toc241528823" w:history="1">
+          <w:hyperlink w:anchor="_Toc241529537" w:history="1">
             <w:r>
               <w:rPr>
                 <w:rStyle w:val="a5"/>
@@ -921,7 +921,7 @@
               <w:rPr>
                 <w:noProof/>
               </w:rPr>
-              <w:instrText xml:space="preserve"> PAGEREF _Toc241528823 \h </w:instrText>
+              <w:instrText xml:space="preserve"> PAGEREF _Toc241529537 \h </w:instrText>
             </w:r>
             <w:r>
               <w:rPr>
@@ -959,7 +959,7 @@
               <w:noProof/>
             </w:rPr>
           </w:pPr>
-          <w:hyperlink w:anchor="_Toc241528824" w:history="1">
+          <w:hyperlink w:anchor="_Toc241529538" w:history="1">
             <w:r>
               <w:rPr>
                 <w:rStyle w:val="a5"/>
@@ -983,7 +983,7 @@
               <w:rPr>
                 <w:noProof/>
               </w:rPr>
-              <w:instrText xml:space="preserve"> PAGEREF _Toc241528824 \h </w:instrText>
+              <w:instrText xml:space="preserve"> PAGEREF _Toc241529538 \h </w:instrText>
             </w:r>
             <w:r>
               <w:rPr>
@@ -1020,7 +1020,7 @@
               <w:noProof/>
             </w:rPr>
           </w:pPr>
-          <w:hyperlink w:anchor="_Toc241528825" w:history="1">
+          <w:hyperlink w:anchor="_Toc241529539" w:history="1">
             <w:r>
               <w:rPr>
                 <w:rStyle w:val="a5"/>
@@ -1044,7 +1044,7 @@
               <w:rPr>
                 <w:noProof/>
               </w:rPr>
-              <w:instrText xml:space="preserve"> PAGEREF _Toc241528825 \h </w:instrText>
+              <w:instrText xml:space="preserve"> PAGEREF _Toc241529539 \h </w:instrText>
             </w:r>
             <w:r>
               <w:rPr>
@@ -1081,7 +1081,7 @@
               <w:noProof/>
             </w:rPr>
           </w:pPr>
-          <w:hyperlink w:anchor="_Toc241528826" w:history="1">
+          <w:hyperlink w:anchor="_Toc241529540" w:history="1">
             <w:r>
               <w:rPr>
                 <w:rStyle w:val="a5"/>
@@ -1105,7 +1105,7 @@
               <w:rPr>
                 <w:noProof/>
               </w:rPr>
-              <w:instrText xml:space="preserve"> PAGEREF _Toc241528826 \h </w:instrText>
+              <w:instrText xml:space="preserve"> PAGEREF _Toc241529540 \h </w:instrText>
             </w:r>
             <w:r>
               <w:rPr>
@@ -1143,7 +1143,7 @@
               <w:noProof/>
             </w:rPr>
           </w:pPr>
-          <w:hyperlink w:anchor="_Toc241528827" w:history="1">
+          <w:hyperlink w:anchor="_Toc241529541" w:history="1">
             <w:r>
               <w:rPr>
                 <w:rStyle w:val="a5"/>
@@ -1167,7 +1167,7 @@
               <w:rPr>
                 <w:noProof/>
               </w:rPr>
-              <w:instrText xml:space="preserve"> PAGEREF _Toc241528827 \h </w:instrText>
+              <w:instrText xml:space="preserve"> PAGEREF _Toc241529541 \h </w:instrText>
             </w:r>
             <w:r>
               <w:rPr>
@@ -1205,7 +1205,7 @@
               <w:noProof/>
             </w:rPr>
           </w:pPr>
-          <w:hyperlink w:anchor="_Toc241528828" w:history="1">
+          <w:hyperlink w:anchor="_Toc241529542" w:history="1">
             <w:r>
               <w:rPr>
                 <w:rStyle w:val="a5"/>
@@ -1229,7 +1229,7 @@
               <w:rPr>
                 <w:noProof/>
               </w:rPr>
-              <w:instrText xml:space="preserve"> PAGEREF _Toc241528828 \h </w:instrText>
+              <w:instrText xml:space="preserve"> PAGEREF _Toc241529542 \h </w:instrText>
             </w:r>
             <w:r>
               <w:rPr>
@@ -1267,7 +1267,7 @@
               <w:noProof/>
             </w:rPr>
           </w:pPr>
-          <w:hyperlink w:anchor="_Toc241528829" w:history="1">
+          <w:hyperlink w:anchor="_Toc241529543" w:history="1">
             <w:r>
               <w:rPr>
                 <w:rStyle w:val="a5"/>
@@ -1291,7 +1291,7 @@
               <w:rPr>
                 <w:noProof/>
               </w:rPr>
-              <w:instrText xml:space="preserve"> PAGEREF _Toc241528829 \h </w:instrText>
+              <w:instrText xml:space="preserve"> PAGEREF _Toc241529543 \h </w:instrText>
             </w:r>
             <w:r>
               <w:rPr>
@@ -1328,7 +1328,7 @@
               <w:noProof/>
             </w:rPr>
           </w:pPr>
-          <w:hyperlink w:anchor="_Toc241528830" w:history="1">
+          <w:hyperlink w:anchor="_Toc241529544" w:history="1">
             <w:r>
               <w:rPr>
                 <w:rStyle w:val="a5"/>
@@ -1352,7 +1352,7 @@
               <w:rPr>
                 <w:noProof/>
               </w:rPr>
-              <w:instrText xml:space="preserve"> PAGEREF _Toc241528830 \h </w:instrText>
+              <w:instrText xml:space="preserve"> PAGEREF _Toc241529544 \h </w:instrText>
             </w:r>
             <w:r>
               <w:rPr>
@@ -1390,7 +1390,7 @@
               <w:noProof/>
             </w:rPr>
           </w:pPr>
-          <w:hyperlink w:anchor="_Toc241528831" w:history="1">
+          <w:hyperlink w:anchor="_Toc241529545" w:history="1">
             <w:r>
               <w:rPr>
                 <w:rStyle w:val="a5"/>
@@ -1414,7 +1414,7 @@
               <w:rPr>
                 <w:noProof/>
               </w:rPr>
-              <w:instrText xml:space="preserve"> PAGEREF _Toc241528831 \h </w:instrText>
+              <w:instrText xml:space="preserve"> PAGEREF _Toc241529545 \h </w:instrText>
             </w:r>
             <w:r>
               <w:rPr>
@@ -1451,7 +1451,7 @@
               <w:noProof/>
             </w:rPr>
           </w:pPr>
-          <w:hyperlink w:anchor="_Toc241528832" w:history="1">
+          <w:hyperlink w:anchor="_Toc241529546" w:history="1">
             <w:r>
               <w:rPr>
                 <w:rStyle w:val="a5"/>
@@ -1475,7 +1475,7 @@
               <w:rPr>
                 <w:noProof/>
               </w:rPr>
-              <w:instrText xml:space="preserve"> PAGEREF _Toc241528832 \h </w:instrText>
+              <w:instrText xml:space="preserve"> PAGEREF _Toc241529546 \h </w:instrText>
             </w:r>
             <w:r>
               <w:rPr>
@@ -1513,7 +1513,7 @@
               <w:noProof/>
             </w:rPr>
           </w:pPr>
-          <w:hyperlink w:anchor="_Toc241528833" w:history="1">
+          <w:hyperlink w:anchor="_Toc241529547" w:history="1">
             <w:r>
               <w:rPr>
                 <w:rStyle w:val="a5"/>
@@ -1537,7 +1537,7 @@
               <w:rPr>
                 <w:noProof/>
               </w:rPr>
-              <w:instrText xml:space="preserve"> PAGEREF _Toc241528833 \h </w:instrText>
+              <w:instrText xml:space="preserve"> PAGEREF _Toc241529547 \h </w:instrText>
             </w:r>
             <w:r>
               <w:rPr>
@@ -1575,7 +1575,7 @@
               <w:noProof/>
             </w:rPr>
           </w:pPr>
-          <w:hyperlink w:anchor="_Toc241528834" w:history="1">
+          <w:hyperlink w:anchor="_Toc241529548" w:history="1">
             <w:r>
               <w:rPr>
                 <w:rStyle w:val="a5"/>
@@ -1599,7 +1599,7 @@
               <w:rPr>
                 <w:noProof/>
               </w:rPr>
-              <w:instrText xml:space="preserve"> PAGEREF _Toc241528834 \h </w:instrText>
+              <w:instrText xml:space="preserve"> PAGEREF _Toc241529548 \h </w:instrText>
             </w:r>
             <w:r>
               <w:rPr>
@@ -1637,7 +1637,7 @@
               <w:noProof/>
             </w:rPr>
           </w:pPr>
-          <w:hyperlink w:anchor="_Toc241528835" w:history="1">
+          <w:hyperlink w:anchor="_Toc241529549" w:history="1">
             <w:r>
               <w:rPr>
                 <w:rStyle w:val="a5"/>
@@ -1661,7 +1661,7 @@
               <w:rPr>
                 <w:noProof/>
               </w:rPr>
-              <w:instrText xml:space="preserve"> PAGEREF _Toc241528835 \h </w:instrText>
+              <w:instrText xml:space="preserve"> PAGEREF _Toc241529549 \h </w:instrText>
             </w:r>
             <w:r>
               <w:rPr>
@@ -1698,7 +1698,7 @@
               <w:noProof/>
             </w:rPr>
           </w:pPr>
-          <w:hyperlink w:anchor="_Toc241528836" w:history="1">
+          <w:hyperlink w:anchor="_Toc241529550" w:history="1">
             <w:r>
               <w:rPr>
                 <w:rStyle w:val="a5"/>
@@ -1722,7 +1722,7 @@
               <w:rPr>
                 <w:noProof/>
               </w:rPr>
-              <w:instrText xml:space="preserve"> PAGEREF _Toc241528836 \h </w:instrText>
+              <w:instrText xml:space="preserve"> PAGEREF _Toc241529550 \h </w:instrText>
             </w:r>
             <w:r>
               <w:rPr>
@@ -1760,7 +1760,7 @@
               <w:noProof/>
             </w:rPr>
           </w:pPr>
-          <w:hyperlink w:anchor="_Toc241528837" w:history="1">
+          <w:hyperlink w:anchor="_Toc241529551" w:history="1">
             <w:r>
               <w:rPr>
                 <w:rStyle w:val="a5"/>
@@ -1784,7 +1784,7 @@
               <w:rPr>
                 <w:noProof/>
               </w:rPr>
-              <w:instrText xml:space="preserve"> PAGEREF _Toc241528837 \h </w:instrText>
+              <w:instrText xml:space="preserve"> PAGEREF _Toc241529551 \h </w:instrText>
             </w:r>
             <w:r>
               <w:rPr>
@@ -1822,7 +1822,7 @@
               <w:noProof/>
             </w:rPr>
           </w:pPr>
-          <w:hyperlink w:anchor="_Toc241528838" w:history="1">
+          <w:hyperlink w:anchor="_Toc241529552" w:history="1">
             <w:r>
               <w:rPr>
                 <w:rStyle w:val="a5"/>
@@ -1846,7 +1846,7 @@
               <w:rPr>
                 <w:noProof/>
               </w:rPr>
-              <w:instrText xml:space="preserve"> PAGEREF _Toc241528838 \h </w:instrText>
+              <w:instrText xml:space="preserve"> PAGEREF _Toc241529552 \h </w:instrText>
             </w:r>
             <w:r>
               <w:rPr>
@@ -1884,7 +1884,7 @@
               <w:noProof/>
             </w:rPr>
           </w:pPr>
-          <w:hyperlink w:anchor="_Toc241528839" w:history="1">
+          <w:hyperlink w:anchor="_Toc241529553" w:history="1">
             <w:r>
               <w:rPr>
                 <w:rStyle w:val="a5"/>
@@ -1908,7 +1908,7 @@
               <w:rPr>
                 <w:noProof/>
               </w:rPr>
-              <w:instrText xml:space="preserve"> PAGEREF _Toc241528839 \h </w:instrText>
+              <w:instrText xml:space="preserve"> PAGEREF _Toc241529553 \h </w:instrText>
             </w:r>
             <w:r>
               <w:rPr>
@@ -1946,7 +1946,7 @@
               <w:noProof/>
             </w:rPr>
           </w:pPr>
-          <w:hyperlink w:anchor="_Toc241528840" w:history="1">
+          <w:hyperlink w:anchor="_Toc241529554" w:history="1">
             <w:r>
               <w:rPr>
                 <w:rStyle w:val="a5"/>
@@ -1970,7 +1970,7 @@
               <w:rPr>
                 <w:noProof/>
               </w:rPr>
-              <w:instrText xml:space="preserve"> PAGEREF _Toc241528840 \h </w:instrText>
+              <w:instrText xml:space="preserve"> PAGEREF _Toc241529554 \h </w:instrText>
             </w:r>
             <w:r>
               <w:rPr>
@@ -2007,7 +2007,7 @@
               <w:noProof/>
             </w:rPr>
           </w:pPr>
-          <w:hyperlink w:anchor="_Toc241528841" w:history="1">
+          <w:hyperlink w:anchor="_Toc241529555" w:history="1">
             <w:r>
               <w:rPr>
                 <w:rStyle w:val="a5"/>
@@ -2031,7 +2031,7 @@
               <w:rPr>
                 <w:noProof/>
               </w:rPr>
-              <w:instrText xml:space="preserve"> PAGEREF _Toc241528841 \h </w:instrText>
+              <w:instrText xml:space="preserve"> PAGEREF _Toc241529555 \h </w:instrText>
             </w:r>
             <w:r>
               <w:rPr>
@@ -2069,7 +2069,7 @@
               <w:noProof/>
             </w:rPr>
           </w:pPr>
-          <w:hyperlink w:anchor="_Toc241528842" w:history="1">
+          <w:hyperlink w:anchor="_Toc241529556" w:history="1">
             <w:r>
               <w:rPr>
                 <w:rStyle w:val="a5"/>
@@ -2093,7 +2093,7 @@
               <w:rPr>
                 <w:noProof/>
               </w:rPr>
-              <w:instrText xml:space="preserve"> PAGEREF _Toc241528842 \h </w:instrText>
+              <w:instrText xml:space="preserve"> PAGEREF _Toc241529556 \h </w:instrText>
             </w:r>
             <w:r>
               <w:rPr>
@@ -2131,7 +2131,7 @@
               <w:noProof/>
             </w:rPr>
           </w:pPr>
-          <w:hyperlink w:anchor="_Toc241528843" w:history="1">
+          <w:hyperlink w:anchor="_Toc241529557" w:history="1">
             <w:r>
               <w:rPr>
                 <w:rStyle w:val="a5"/>
@@ -2155,7 +2155,7 @@
               <w:rPr>
                 <w:noProof/>
               </w:rPr>
-              <w:instrText xml:space="preserve"> PAGEREF _Toc241528843 \h </w:instrText>
+              <w:instrText xml:space="preserve"> PAGEREF _Toc241529557 \h </w:instrText>
             </w:r>
             <w:r>
               <w:rPr>
@@ -2193,7 +2193,7 @@
               <w:noProof/>
             </w:rPr>
           </w:pPr>
-          <w:hyperlink w:anchor="_Toc241528844" w:history="1">
+          <w:hyperlink w:anchor="_Toc241529558" w:history="1">
             <w:r>
               <w:rPr>
                 <w:rStyle w:val="a5"/>
@@ -2217,7 +2217,7 @@
               <w:rPr>
                 <w:noProof/>
               </w:rPr>
-              <w:instrText xml:space="preserve"> PAGEREF _Toc241528844 \h </w:instrText>
+              <w:instrText xml:space="preserve"> PAGEREF _Toc241529558 \h </w:instrText>
             </w:r>
             <w:r>
               <w:rPr>
@@ -2255,7 +2255,7 @@
               <w:noProof/>
             </w:rPr>
           </w:pPr>
-          <w:hyperlink w:anchor="_Toc241528845" w:history="1">
+          <w:hyperlink w:anchor="_Toc241529559" w:history="1">
             <w:r>
               <w:rPr>
                 <w:rStyle w:val="a5"/>
@@ -2279,7 +2279,7 @@
               <w:rPr>
                 <w:noProof/>
               </w:rPr>
-              <w:instrText xml:space="preserve"> PAGEREF _Toc241528845 \h </w:instrText>
+              <w:instrText xml:space="preserve"> PAGEREF _Toc241529559 \h </w:instrText>
             </w:r>
             <w:r>
               <w:rPr>
@@ -2316,7 +2316,7 @@
               <w:noProof/>
             </w:rPr>
           </w:pPr>
-          <w:hyperlink w:anchor="_Toc241528846" w:history="1">
+          <w:hyperlink w:anchor="_Toc241529560" w:history="1">
             <w:r>
               <w:rPr>
                 <w:rStyle w:val="a5"/>
@@ -2340,7 +2340,7 @@
               <w:rPr>
                 <w:noProof/>
               </w:rPr>
-              <w:instrText xml:space="preserve"> PAGEREF _Toc241528846 \h </w:instrText>
+              <w:instrText xml:space="preserve"> PAGEREF _Toc241529560 \h </w:instrText>
             </w:r>
             <w:r>
               <w:rPr>
@@ -2379,7 +2379,7 @@
         <w:pStyle w:val="1"/>
         <w:pageBreakBefore/>
       </w:pPr>
-      <w:bookmarkStart w:id="1" w:name="_Toc241528822"/>
+      <w:bookmarkStart w:id="1" w:name="_Toc241529536"/>
       <w:r>
         <w:t xml:space="preserve">1. </w:t>
       </w:r>
@@ -4018,7 +4018,7 @@
                 <w:sz w:val="19"/>
                 <w:szCs w:val="19"/>
               </w:rPr>
-              <w:t xml:space="preserve"> 79</w:t>
+              <w:t xml:space="preserve"> 80</w:t>
             </w:r>
             <w:r>
               <w:rPr>
@@ -4202,7 +4202,7 @@
         <w:pStyle w:val="1"/>
         <w:pageBreakBefore/>
       </w:pPr>
-      <w:bookmarkStart w:id="2" w:name="_Toc241528823"/>
+      <w:bookmarkStart w:id="2" w:name="_Toc241529537"/>
       <w:r>
         <w:t xml:space="preserve">2. </w:t>
       </w:r>
@@ -5818,7 +5818,7 @@
       <w:pPr>
         <w:pStyle w:val="2"/>
       </w:pPr>
-      <w:bookmarkStart w:id="3" w:name="_Toc241528824"/>
+      <w:bookmarkStart w:id="3" w:name="_Toc241529538"/>
       <w:r>
         <w:t>통합</w:t>
       </w:r>
@@ -6306,7 +6306,7 @@
         <w:pStyle w:val="1"/>
         <w:pageBreakBefore/>
       </w:pPr>
-      <w:bookmarkStart w:id="4" w:name="_Toc241528825"/>
+      <w:bookmarkStart w:id="4" w:name="_Toc241529539"/>
       <w:r>
         <w:t xml:space="preserve">3. </w:t>
       </w:r>
@@ -8789,7 +8789,7 @@
         <w:pStyle w:val="1"/>
         <w:pageBreakBefore/>
       </w:pPr>
-      <w:bookmarkStart w:id="5" w:name="_Toc241528826"/>
+      <w:bookmarkStart w:id="5" w:name="_Toc241529540"/>
       <w:r>
         <w:t xml:space="preserve">4. </w:t>
       </w:r>
@@ -8802,7 +8802,7 @@
       <w:pPr>
         <w:pStyle w:val="2"/>
       </w:pPr>
-      <w:bookmarkStart w:id="6" w:name="_Toc241528827"/>
+      <w:bookmarkStart w:id="6" w:name="_Toc241529541"/>
       <w:r>
         <w:t>기술</w:t>
       </w:r>
@@ -9604,7 +9604,7 @@
       <w:pPr>
         <w:pStyle w:val="2"/>
       </w:pPr>
-      <w:bookmarkStart w:id="7" w:name="_Toc241528828"/>
+      <w:bookmarkStart w:id="7" w:name="_Toc241529542"/>
       <w:r>
         <w:t>요청이</w:t>
       </w:r>
@@ -9956,7 +9956,7 @@
       <w:pPr>
         <w:pStyle w:val="2"/>
       </w:pPr>
-      <w:bookmarkStart w:id="8" w:name="_Toc241528829"/>
+      <w:bookmarkStart w:id="8" w:name="_Toc241529543"/>
       <w:r>
         <w:t>폴더</w:t>
       </w:r>
@@ -11326,7 +11326,7 @@
         <w:pStyle w:val="1"/>
         <w:pageBreakBefore/>
       </w:pPr>
-      <w:bookmarkStart w:id="9" w:name="_Toc241528830"/>
+      <w:bookmarkStart w:id="9" w:name="_Toc241529544"/>
       <w:r>
         <w:t xml:space="preserve">5. </w:t>
       </w:r>
@@ -12191,7 +12191,7 @@
       <w:pPr>
         <w:pStyle w:val="2"/>
       </w:pPr>
-      <w:bookmarkStart w:id="10" w:name="_Toc241528831"/>
+      <w:bookmarkStart w:id="10" w:name="_Toc241529545"/>
       <w:r>
         <w:t>운영</w:t>
       </w:r>
@@ -12727,7 +12727,7 @@
         <w:pStyle w:val="1"/>
         <w:pageBreakBefore/>
       </w:pPr>
-      <w:bookmarkStart w:id="11" w:name="_Toc241528832"/>
+      <w:bookmarkStart w:id="11" w:name="_Toc241529546"/>
       <w:r>
         <w:t xml:space="preserve">6. </w:t>
       </w:r>
@@ -12746,7 +12746,7 @@
       <w:pPr>
         <w:pStyle w:val="2"/>
       </w:pPr>
-      <w:bookmarkStart w:id="12" w:name="_Toc241528833"/>
+      <w:bookmarkStart w:id="12" w:name="_Toc241529547"/>
       <w:r>
         <w:t>환경변수</w:t>
       </w:r>
@@ -13743,7 +13743,7 @@
       <w:pPr>
         <w:pStyle w:val="2"/>
       </w:pPr>
-      <w:bookmarkStart w:id="13" w:name="_Toc241528834"/>
+      <w:bookmarkStart w:id="13" w:name="_Toc241529548"/>
       <w:r>
         <w:t>배포</w:t>
       </w:r>
@@ -14035,7 +14035,7 @@
       <w:pPr>
         <w:pStyle w:val="2"/>
       </w:pPr>
-      <w:bookmarkStart w:id="14" w:name="_Toc241528835"/>
+      <w:bookmarkStart w:id="14" w:name="_Toc241529549"/>
       <w:r>
         <w:t>안드로이드</w:t>
       </w:r>
@@ -14454,7 +14454,7 @@
         <w:pStyle w:val="1"/>
         <w:pageBreakBefore/>
       </w:pPr>
-      <w:bookmarkStart w:id="15" w:name="_Toc241528836"/>
+      <w:bookmarkStart w:id="15" w:name="_Toc241529550"/>
       <w:r>
         <w:t xml:space="preserve">7. </w:t>
       </w:r>
@@ -14479,7 +14479,7 @@
       <w:pPr>
         <w:pStyle w:val="2"/>
       </w:pPr>
-      <w:bookmarkStart w:id="16" w:name="_Toc241528837"/>
+      <w:bookmarkStart w:id="16" w:name="_Toc241529551"/>
       <w:r>
         <w:t xml:space="preserve">APK </w:t>
       </w:r>
@@ -15617,7 +15617,7 @@
       <w:pPr>
         <w:pStyle w:val="2"/>
       </w:pPr>
-      <w:bookmarkStart w:id="17" w:name="_Toc241528838"/>
+      <w:bookmarkStart w:id="17" w:name="_Toc241529552"/>
       <w:r>
         <w:t>사이트</w:t>
       </w:r>
@@ -15975,7 +15975,7 @@
       <w:pPr>
         <w:pStyle w:val="2"/>
       </w:pPr>
-      <w:bookmarkStart w:id="18" w:name="_Toc241528839"/>
+      <w:bookmarkStart w:id="18" w:name="_Toc241529553"/>
       <w:r>
         <w:t>테스트</w:t>
       </w:r>
@@ -15990,7 +15990,7 @@
         </w:numPr>
       </w:pPr>
       <w:r>
-        <w:t>npm test: 79</w:t>
+        <w:t>npm test: 80</w:t>
       </w:r>
       <w:r>
         <w:t>개</w:t>
@@ -16369,7 +16369,7 @@
       <w:pPr>
         <w:pStyle w:val="2"/>
       </w:pPr>
-      <w:bookmarkStart w:id="19" w:name="_Toc241528840"/>
+      <w:bookmarkStart w:id="19" w:name="_Toc241529554"/>
       <w:r>
         <w:t>알려진</w:t>
       </w:r>
@@ -16800,7 +16800,7 @@
         <w:pStyle w:val="1"/>
         <w:pageBreakBefore/>
       </w:pPr>
-      <w:bookmarkStart w:id="20" w:name="_Toc241528841"/>
+      <w:bookmarkStart w:id="20" w:name="_Toc241529555"/>
       <w:r>
         <w:t xml:space="preserve">8. </w:t>
       </w:r>
@@ -16825,7 +16825,7 @@
       <w:pPr>
         <w:pStyle w:val="2"/>
       </w:pPr>
-      <w:bookmarkStart w:id="21" w:name="_Toc241528842"/>
+      <w:bookmarkStart w:id="21" w:name="_Toc241529556"/>
       <w:r>
         <w:t>처음</w:t>
       </w:r>
@@ -17021,7 +17021,7 @@
       <w:pPr>
         <w:pStyle w:val="2"/>
       </w:pPr>
-      <w:bookmarkStart w:id="22" w:name="_Toc241528843"/>
+      <w:bookmarkStart w:id="22" w:name="_Toc241529557"/>
       <w:r>
         <w:t>새</w:t>
       </w:r>
@@ -17436,7 +17436,7 @@
       <w:pPr>
         <w:pStyle w:val="2"/>
       </w:pPr>
-      <w:bookmarkStart w:id="23" w:name="_Toc241528844"/>
+      <w:bookmarkStart w:id="23" w:name="_Toc241529558"/>
       <w:r>
         <w:t>지켜</w:t>
       </w:r>
@@ -17692,7 +17692,7 @@
       <w:pPr>
         <w:pStyle w:val="2"/>
       </w:pPr>
-      <w:bookmarkStart w:id="24" w:name="_Toc241528845"/>
+      <w:bookmarkStart w:id="24" w:name="_Toc241529559"/>
       <w:r>
         <w:t>다음에</w:t>
       </w:r>
@@ -17731,61 +17731,67 @@
         </w:numPr>
       </w:pPr>
       <w:r>
-        <w:t>학습지</w:t>
-      </w:r>
-      <w:r>
-        <w:t xml:space="preserve"> </w:t>
-      </w:r>
-      <w:r>
-        <w:t>가져오기에</w:t>
-      </w:r>
-      <w:r>
-        <w:t xml:space="preserve"> </w:t>
-      </w:r>
-      <w:r>
-        <w:t>압축</w:t>
-      </w:r>
-      <w:r>
-        <w:t xml:space="preserve"> </w:t>
-      </w:r>
-      <w:r>
-        <w:t>해제</w:t>
-      </w:r>
-      <w:r>
-        <w:t xml:space="preserve"> </w:t>
-      </w:r>
-      <w:r>
-        <w:t>크기</w:t>
-      </w:r>
-      <w:r>
-        <w:t xml:space="preserve"> </w:t>
-      </w:r>
-      <w:r>
-        <w:t>제한</w:t>
-      </w:r>
-      <w:r>
-        <w:t xml:space="preserve"> </w:t>
-      </w:r>
-      <w:r>
-        <w:t>추가</w:t>
+        <w:t>보안</w:t>
+      </w:r>
+      <w:r>
+        <w:t xml:space="preserve"> </w:t>
+      </w:r>
+      <w:r>
+        <w:t>헤더</w:t>
+      </w:r>
+      <w:r>
+        <w:t>(CSP)</w:t>
+      </w:r>
+      <w:r>
+        <w:t>에서</w:t>
+      </w:r>
+      <w:r>
+        <w:t xml:space="preserve"> unsafe-eval </w:t>
+      </w:r>
+      <w:r>
+        <w:t>빼기</w:t>
+      </w:r>
+      <w:r>
+        <w:t xml:space="preserve"> </w:t>
+      </w:r>
+      <w:r>
+        <w:t>검토</w:t>
       </w:r>
       <w:r>
         <w:t>(</w:t>
       </w:r>
       <w:r>
-        <w:t>아주</w:t>
-      </w:r>
-      <w:r>
-        <w:t xml:space="preserve"> </w:t>
-      </w:r>
-      <w:r>
-        <w:t>큰</w:t>
-      </w:r>
-      <w:r>
-        <w:t xml:space="preserve"> docx·hwpx </w:t>
-      </w:r>
-      <w:r>
-        <w:t>대비</w:t>
+        <w:t>원래</w:t>
+      </w:r>
+      <w:r>
+        <w:t xml:space="preserve"> gospel-class </w:t>
+      </w:r>
+      <w:r>
+        <w:t>설정</w:t>
+      </w:r>
+      <w:r>
+        <w:t xml:space="preserve">, </w:t>
+      </w:r>
+      <w:r>
+        <w:t>모든</w:t>
+      </w:r>
+      <w:r>
+        <w:t xml:space="preserve"> </w:t>
+      </w:r>
+      <w:r>
+        <w:t>화면</w:t>
+      </w:r>
+      <w:r>
+        <w:t xml:space="preserve"> </w:t>
+      </w:r>
+      <w:r>
+        <w:t>시험</w:t>
+      </w:r>
+      <w:r>
+        <w:t xml:space="preserve"> </w:t>
+      </w:r>
+      <w:r>
+        <w:t>후</w:t>
       </w:r>
       <w:r>
         <w:t>).</w:t>
@@ -17928,7 +17934,7 @@
         <w:pStyle w:val="1"/>
         <w:pageBreakBefore/>
       </w:pPr>
-      <w:bookmarkStart w:id="25" w:name="_Toc241528846"/>
+      <w:bookmarkStart w:id="25" w:name="_Toc241529560"/>
       <w:r>
         <w:t>부록</w:t>
       </w:r>
@@ -19181,118 +19187,10 @@
 <file path=word/numbering.xml><?xml version="1.0" encoding="utf-8"?>
 <w:numbering xmlns:wpc="http://schemas.microsoft.com/office/word/2010/wordprocessingCanvas" xmlns:cx="http://schemas.microsoft.com/office/drawing/2014/chartex" xmlns:cx1="http://schemas.microsoft.com/office/drawing/2015/9/8/chartex" xmlns:cx2="http://schemas.microsoft.com/office/drawing/2015/10/21/chartex" xmlns:cx3="http://schemas.microsoft.com/office/drawing/2016/5/9/chartex" xmlns:cx4="http://schemas.microsoft.com/office/drawing/2016/5/10/chartex" xmlns:cx5="http://schemas.microsoft.com/office/drawing/2016/5/11/chartex" xmlns:cx6="http://schemas.microsoft.com/office/drawing/2016/5/12/chartex" xmlns:cx7="http://schemas.microsoft.com/office/drawing/2016/5/13/chartex" xmlns:cx8="http://schemas.microsoft.com/office/drawing/2016/5/14/chartex" xmlns:mc="http://schemas.openxmlformats.org/markup-compatibility/2006" xmlns:aink="http://schemas.microsoft.com/office/drawing/2016/ink" xmlns:am3d="http://schemas.microsoft.com/office/drawing/2017/model3d" xmlns:o="urn:schemas-microsoft-com:office:office" xmlns:oel="http://schemas.microsoft.com/office/2019/extlst" xmlns:r="http://schemas.openxmlformats.org/officeDocument/2006/relationships" xmlns:m="http://schemas.openxmlformats.org/officeDocument/2006/math" xmlns:v="urn:schemas-microsoft-com:vml" xmlns:wp14="http://schemas.microsoft.com/office/word/2010/wordprocessingDrawing" xmlns:wp="http://schemas.openxmlformats.org/drawingml/2006/wordprocessingDrawing" xmlns:w10="urn:schemas-microsoft-com:office:word" xmlns:w="http://schemas.openxmlformats.org/wordprocessingml/2006/main" xmlns:w14="http://schemas.microsoft.com/office/word/2010/wordml" xmlns:w15="http://schemas.microsoft.com/office/word/2012/wordml" xmlns:w16cex="http://schemas.microsoft.com/office/word/2018/wordml/cex" xmlns:w16cid="http://schemas.microsoft.com/office/word/2016/wordml/cid" xmlns:w16="http://schemas.microsoft.com/office/word/2018/wordml" xmlns:w16du="http://schemas.microsoft.com/office/word/2023/wordml/word16du" xmlns:w16sdtdh="http://schemas.microsoft.com/office/word/2020/wordml/sdtdatahash" xmlns:w16sdtfl="http://schemas.microsoft.com/office/word/2024/wordml/sdtformatlock" xmlns:w16se="http://schemas.microsoft.com/office/word/2015/wordml/symex" xmlns:wpg="http://schemas.microsoft.com/office/word/2010/wordprocessingGroup" xmlns:wpi="http://schemas.microsoft.com/office/word/2010/wordprocessingInk" xmlns:wne="http://schemas.microsoft.com/office/word/2006/wordml" xmlns:wps="http://schemas.microsoft.com/office/word/2010/wordprocessingShape" mc:Ignorable="w14 w15 w16se w16cid w16 w16cex w16sdtdh w16sdtfl w16du wp14">
   <w:abstractNum w:abstractNumId="0" w15:restartNumberingAfterBreak="0">
-    <w:nsid w:val="0A005194"/>
+    <w:nsid w:val="1FA93FDF"/>
     <w:multiLevelType w:val="hybridMultilevel"/>
-    <w:tmpl w:val="E0AA7952"/>
-    <w:lvl w:ilvl="0" w:tplc="BE32073C">
-      <w:start w:val="1"/>
-      <w:numFmt w:val="bullet"/>
-      <w:lvlText w:val="•"/>
-      <w:lvlJc w:val="left"/>
-      <w:pPr>
-        <w:ind w:left="540" w:hanging="360"/>
-      </w:pPr>
-    </w:lvl>
-    <w:lvl w:ilvl="1" w:tplc="EE40B008">
-      <w:numFmt w:val="decimal"/>
-      <w:lvlText w:val=""/>
-      <w:lvlJc w:val="left"/>
-    </w:lvl>
-    <w:lvl w:ilvl="2" w:tplc="C534DD72">
-      <w:numFmt w:val="decimal"/>
-      <w:lvlText w:val=""/>
-      <w:lvlJc w:val="left"/>
-    </w:lvl>
-    <w:lvl w:ilvl="3" w:tplc="0FBE5FBA">
-      <w:numFmt w:val="decimal"/>
-      <w:lvlText w:val=""/>
-      <w:lvlJc w:val="left"/>
-    </w:lvl>
-    <w:lvl w:ilvl="4" w:tplc="DA207A1A">
-      <w:numFmt w:val="decimal"/>
-      <w:lvlText w:val=""/>
-      <w:lvlJc w:val="left"/>
-    </w:lvl>
-    <w:lvl w:ilvl="5" w:tplc="95206C24">
-      <w:numFmt w:val="decimal"/>
-      <w:lvlText w:val=""/>
-      <w:lvlJc w:val="left"/>
-    </w:lvl>
-    <w:lvl w:ilvl="6" w:tplc="02D62E2A">
-      <w:numFmt w:val="decimal"/>
-      <w:lvlText w:val=""/>
-      <w:lvlJc w:val="left"/>
-    </w:lvl>
-    <w:lvl w:ilvl="7" w:tplc="8460E7CA">
-      <w:numFmt w:val="decimal"/>
-      <w:lvlText w:val=""/>
-      <w:lvlJc w:val="left"/>
-    </w:lvl>
-    <w:lvl w:ilvl="8" w:tplc="ECF646CC">
-      <w:numFmt w:val="decimal"/>
-      <w:lvlText w:val=""/>
-      <w:lvlJc w:val="left"/>
-    </w:lvl>
-  </w:abstractNum>
-  <w:abstractNum w:abstractNumId="1" w15:restartNumberingAfterBreak="0">
-    <w:nsid w:val="28E93DA6"/>
-    <w:multiLevelType w:val="hybridMultilevel"/>
-    <w:tmpl w:val="9FA06D22"/>
-    <w:lvl w:ilvl="0" w:tplc="37D2C614">
-      <w:start w:val="1"/>
-      <w:numFmt w:val="decimal"/>
-      <w:lvlText w:val="%1."/>
-      <w:lvlJc w:val="left"/>
-      <w:pPr>
-        <w:ind w:left="540" w:hanging="360"/>
-      </w:pPr>
-    </w:lvl>
-    <w:lvl w:ilvl="1" w:tplc="85744D16">
-      <w:numFmt w:val="decimal"/>
-      <w:lvlText w:val=""/>
-      <w:lvlJc w:val="left"/>
-    </w:lvl>
-    <w:lvl w:ilvl="2" w:tplc="BDE0DB22">
-      <w:numFmt w:val="decimal"/>
-      <w:lvlText w:val=""/>
-      <w:lvlJc w:val="left"/>
-    </w:lvl>
-    <w:lvl w:ilvl="3" w:tplc="52DE8C5C">
-      <w:numFmt w:val="decimal"/>
-      <w:lvlText w:val=""/>
-      <w:lvlJc w:val="left"/>
-    </w:lvl>
-    <w:lvl w:ilvl="4" w:tplc="200E1D12">
-      <w:numFmt w:val="decimal"/>
-      <w:lvlText w:val=""/>
-      <w:lvlJc w:val="left"/>
-    </w:lvl>
-    <w:lvl w:ilvl="5" w:tplc="AD1221F4">
-      <w:numFmt w:val="decimal"/>
-      <w:lvlText w:val=""/>
-      <w:lvlJc w:val="left"/>
-    </w:lvl>
-    <w:lvl w:ilvl="6" w:tplc="D1265A76">
-      <w:numFmt w:val="decimal"/>
-      <w:lvlText w:val=""/>
-      <w:lvlJc w:val="left"/>
-    </w:lvl>
-    <w:lvl w:ilvl="7" w:tplc="DDF6C604">
-      <w:numFmt w:val="decimal"/>
-      <w:lvlText w:val=""/>
-      <w:lvlJc w:val="left"/>
-    </w:lvl>
-    <w:lvl w:ilvl="8" w:tplc="09D0DC6E">
-      <w:numFmt w:val="decimal"/>
-      <w:lvlText w:val=""/>
-      <w:lvlJc w:val="left"/>
-    </w:lvl>
-  </w:abstractNum>
-  <w:abstractNum w:abstractNumId="2" w15:restartNumberingAfterBreak="0">
-    <w:nsid w:val="7D864E57"/>
-    <w:multiLevelType w:val="hybridMultilevel"/>
-    <w:tmpl w:val="87BEED28"/>
-    <w:lvl w:ilvl="0" w:tplc="AE76832A">
+    <w:tmpl w:val="42284E56"/>
+    <w:lvl w:ilvl="0" w:tplc="98EAC908">
       <w:start w:val="1"/>
       <w:numFmt w:val="bullet"/>
       <w:lvlText w:val="●"/>
@@ -19301,7 +19199,7 @@
         <w:ind w:left="720" w:hanging="360"/>
       </w:pPr>
     </w:lvl>
-    <w:lvl w:ilvl="1" w:tplc="4144447A">
+    <w:lvl w:ilvl="1" w:tplc="DB9EB7E0">
       <w:start w:val="1"/>
       <w:numFmt w:val="bullet"/>
       <w:lvlText w:val="○"/>
@@ -19310,7 +19208,7 @@
         <w:ind w:left="1440" w:hanging="360"/>
       </w:pPr>
     </w:lvl>
-    <w:lvl w:ilvl="2" w:tplc="9020AEFC">
+    <w:lvl w:ilvl="2" w:tplc="BC4ADEBA">
       <w:start w:val="1"/>
       <w:numFmt w:val="bullet"/>
       <w:lvlText w:val="■"/>
@@ -19319,7 +19217,7 @@
         <w:ind w:left="2160" w:hanging="360"/>
       </w:pPr>
     </w:lvl>
-    <w:lvl w:ilvl="3" w:tplc="805CC00C">
+    <w:lvl w:ilvl="3" w:tplc="21507C32">
       <w:start w:val="1"/>
       <w:numFmt w:val="bullet"/>
       <w:lvlText w:val="●"/>
@@ -19328,7 +19226,7 @@
         <w:ind w:left="2880" w:hanging="360"/>
       </w:pPr>
     </w:lvl>
-    <w:lvl w:ilvl="4" w:tplc="FE325BFA">
+    <w:lvl w:ilvl="4" w:tplc="2FC88C00">
       <w:start w:val="1"/>
       <w:numFmt w:val="bullet"/>
       <w:lvlText w:val="○"/>
@@ -19337,7 +19235,7 @@
         <w:ind w:left="3600" w:hanging="360"/>
       </w:pPr>
     </w:lvl>
-    <w:lvl w:ilvl="5" w:tplc="0EBEE9AE">
+    <w:lvl w:ilvl="5" w:tplc="5BCAC984">
       <w:start w:val="1"/>
       <w:numFmt w:val="bullet"/>
       <w:lvlText w:val="■"/>
@@ -19346,7 +19244,7 @@
         <w:ind w:left="4320" w:hanging="360"/>
       </w:pPr>
     </w:lvl>
-    <w:lvl w:ilvl="6" w:tplc="75A6BEA0">
+    <w:lvl w:ilvl="6" w:tplc="619299AC">
       <w:start w:val="1"/>
       <w:numFmt w:val="bullet"/>
       <w:lvlText w:val="●"/>
@@ -19355,7 +19253,7 @@
         <w:ind w:left="5040" w:hanging="360"/>
       </w:pPr>
     </w:lvl>
-    <w:lvl w:ilvl="7" w:tplc="9B06D2C0">
+    <w:lvl w:ilvl="7" w:tplc="F7CAA622">
       <w:start w:val="1"/>
       <w:numFmt w:val="bullet"/>
       <w:lvlText w:val="●"/>
@@ -19364,7 +19262,7 @@
         <w:ind w:left="5760" w:hanging="360"/>
       </w:pPr>
     </w:lvl>
-    <w:lvl w:ilvl="8" w:tplc="C206E208">
+    <w:lvl w:ilvl="8" w:tplc="D668F23C">
       <w:start w:val="1"/>
       <w:numFmt w:val="bullet"/>
       <w:lvlText w:val="●"/>
@@ -19374,44 +19272,152 @@
       </w:pPr>
     </w:lvl>
   </w:abstractNum>
-  <w:num w:numId="1" w16cid:durableId="1153105938">
+  <w:abstractNum w:abstractNumId="1" w15:restartNumberingAfterBreak="0">
+    <w:nsid w:val="2CDE06D6"/>
+    <w:multiLevelType w:val="hybridMultilevel"/>
+    <w:tmpl w:val="DA0C9474"/>
+    <w:lvl w:ilvl="0" w:tplc="A7ACF342">
+      <w:start w:val="1"/>
+      <w:numFmt w:val="bullet"/>
+      <w:lvlText w:val="•"/>
+      <w:lvlJc w:val="left"/>
+      <w:pPr>
+        <w:ind w:left="540" w:hanging="360"/>
+      </w:pPr>
+    </w:lvl>
+    <w:lvl w:ilvl="1" w:tplc="F4CE262E">
+      <w:numFmt w:val="decimal"/>
+      <w:lvlText w:val=""/>
+      <w:lvlJc w:val="left"/>
+    </w:lvl>
+    <w:lvl w:ilvl="2" w:tplc="13CAA026">
+      <w:numFmt w:val="decimal"/>
+      <w:lvlText w:val=""/>
+      <w:lvlJc w:val="left"/>
+    </w:lvl>
+    <w:lvl w:ilvl="3" w:tplc="4364CC10">
+      <w:numFmt w:val="decimal"/>
+      <w:lvlText w:val=""/>
+      <w:lvlJc w:val="left"/>
+    </w:lvl>
+    <w:lvl w:ilvl="4" w:tplc="22349AE0">
+      <w:numFmt w:val="decimal"/>
+      <w:lvlText w:val=""/>
+      <w:lvlJc w:val="left"/>
+    </w:lvl>
+    <w:lvl w:ilvl="5" w:tplc="F3BC0680">
+      <w:numFmt w:val="decimal"/>
+      <w:lvlText w:val=""/>
+      <w:lvlJc w:val="left"/>
+    </w:lvl>
+    <w:lvl w:ilvl="6" w:tplc="A76A3D20">
+      <w:numFmt w:val="decimal"/>
+      <w:lvlText w:val=""/>
+      <w:lvlJc w:val="left"/>
+    </w:lvl>
+    <w:lvl w:ilvl="7" w:tplc="6A3AA418">
+      <w:numFmt w:val="decimal"/>
+      <w:lvlText w:val=""/>
+      <w:lvlJc w:val="left"/>
+    </w:lvl>
+    <w:lvl w:ilvl="8" w:tplc="9E12B426">
+      <w:numFmt w:val="decimal"/>
+      <w:lvlText w:val=""/>
+      <w:lvlJc w:val="left"/>
+    </w:lvl>
+  </w:abstractNum>
+  <w:abstractNum w:abstractNumId="2" w15:restartNumberingAfterBreak="0">
+    <w:nsid w:val="4422207F"/>
+    <w:multiLevelType w:val="hybridMultilevel"/>
+    <w:tmpl w:val="ABB01E98"/>
+    <w:lvl w:ilvl="0" w:tplc="F73C748A">
+      <w:start w:val="1"/>
+      <w:numFmt w:val="decimal"/>
+      <w:lvlText w:val="%1."/>
+      <w:lvlJc w:val="left"/>
+      <w:pPr>
+        <w:ind w:left="540" w:hanging="360"/>
+      </w:pPr>
+    </w:lvl>
+    <w:lvl w:ilvl="1" w:tplc="61F2015E">
+      <w:numFmt w:val="decimal"/>
+      <w:lvlText w:val=""/>
+      <w:lvlJc w:val="left"/>
+    </w:lvl>
+    <w:lvl w:ilvl="2" w:tplc="AFD89DDE">
+      <w:numFmt w:val="decimal"/>
+      <w:lvlText w:val=""/>
+      <w:lvlJc w:val="left"/>
+    </w:lvl>
+    <w:lvl w:ilvl="3" w:tplc="BA5620FE">
+      <w:numFmt w:val="decimal"/>
+      <w:lvlText w:val=""/>
+      <w:lvlJc w:val="left"/>
+    </w:lvl>
+    <w:lvl w:ilvl="4" w:tplc="117E4ECE">
+      <w:numFmt w:val="decimal"/>
+      <w:lvlText w:val=""/>
+      <w:lvlJc w:val="left"/>
+    </w:lvl>
+    <w:lvl w:ilvl="5" w:tplc="91027DCC">
+      <w:numFmt w:val="decimal"/>
+      <w:lvlText w:val=""/>
+      <w:lvlJc w:val="left"/>
+    </w:lvl>
+    <w:lvl w:ilvl="6" w:tplc="67940512">
+      <w:numFmt w:val="decimal"/>
+      <w:lvlText w:val=""/>
+      <w:lvlJc w:val="left"/>
+    </w:lvl>
+    <w:lvl w:ilvl="7" w:tplc="E524269C">
+      <w:numFmt w:val="decimal"/>
+      <w:lvlText w:val=""/>
+      <w:lvlJc w:val="left"/>
+    </w:lvl>
+    <w:lvl w:ilvl="8" w:tplc="8084C59C">
+      <w:numFmt w:val="decimal"/>
+      <w:lvlText w:val=""/>
+      <w:lvlJc w:val="left"/>
+    </w:lvl>
+  </w:abstractNum>
+  <w:num w:numId="1" w16cid:durableId="84425020">
+    <w:abstractNumId w:val="0"/>
+    <w:lvlOverride w:ilvl="0">
+      <w:startOverride w:val="1"/>
+    </w:lvlOverride>
+  </w:num>
+  <w:num w:numId="2" w16cid:durableId="2014531813">
+    <w:abstractNumId w:val="1"/>
+    <w:lvlOverride w:ilvl="0">
+      <w:startOverride w:val="1"/>
+    </w:lvlOverride>
+  </w:num>
+  <w:num w:numId="3" w16cid:durableId="1806309526">
     <w:abstractNumId w:val="2"/>
     <w:lvlOverride w:ilvl="0">
       <w:startOverride w:val="1"/>
     </w:lvlOverride>
   </w:num>
-  <w:num w:numId="2" w16cid:durableId="1076443342">
-    <w:abstractNumId w:val="0"/>
+  <w:num w:numId="4" w16cid:durableId="1027752685">
+    <w:abstractNumId w:val="2"/>
     <w:lvlOverride w:ilvl="0">
       <w:startOverride w:val="1"/>
     </w:lvlOverride>
   </w:num>
-  <w:num w:numId="3" w16cid:durableId="1686394435">
-    <w:abstractNumId w:val="1"/>
+  <w:num w:numId="5" w16cid:durableId="364528407">
+    <w:abstractNumId w:val="2"/>
     <w:lvlOverride w:ilvl="0">
       <w:startOverride w:val="1"/>
     </w:lvlOverride>
   </w:num>
-  <w:num w:numId="4" w16cid:durableId="213348005">
-    <w:abstractNumId w:val="1"/>
+  <w:num w:numId="6" w16cid:durableId="168563361">
+    <w:abstractNumId w:val="2"/>
     <w:lvlOverride w:ilvl="0">
       <w:startOverride w:val="1"/>
     </w:lvlOverride>
   </w:num>
-  <w:num w:numId="5" w16cid:durableId="809517726">
-    <w:abstractNumId w:val="1"/>
-    <w:lvlOverride w:ilvl="0">
-      <w:startOverride w:val="1"/>
-    </w:lvlOverride>
-  </w:num>
-  <w:num w:numId="6" w16cid:durableId="329990804">
-    <w:abstractNumId w:val="1"/>
-    <w:lvlOverride w:ilvl="0">
-      <w:startOverride w:val="1"/>
-    </w:lvlOverride>
-  </w:num>
-  <w:num w:numId="7" w16cid:durableId="1139807707">
-    <w:abstractNumId w:val="1"/>
+  <w:num w:numId="7" w16cid:durableId="1071002418">
+    <w:abstractNumId w:val="2"/>
     <w:lvlOverride w:ilvl="0">
       <w:startOverride w:val="1"/>
     </w:lvlOverride>
@@ -20044,7 +20050,7 @@
     <w:link w:val="Char1"/>
     <w:uiPriority w:val="99"/>
     <w:unhideWhenUsed/>
-    <w:rsid w:val="008B5FE6"/>
+    <w:rsid w:val="00D66DCB"/>
     <w:pPr>
       <w:tabs>
         <w:tab w:val="center" w:pos="4513"/>
@@ -20058,7 +20064,7 @@
     <w:basedOn w:val="a0"/>
     <w:link w:val="aa"/>
     <w:uiPriority w:val="99"/>
-    <w:rsid w:val="008B5FE6"/>
+    <w:rsid w:val="00D66DCB"/>
   </w:style>
   <w:style w:type="paragraph" w:styleId="ab">
     <w:name w:val="footer"/>
@@ -20066,7 +20072,7 @@
     <w:link w:val="Char2"/>
     <w:uiPriority w:val="99"/>
     <w:unhideWhenUsed/>
-    <w:rsid w:val="008B5FE6"/>
+    <w:rsid w:val="00D66DCB"/>
     <w:pPr>
       <w:tabs>
         <w:tab w:val="center" w:pos="4513"/>
@@ -20080,7 +20086,7 @@
     <w:basedOn w:val="a0"/>
     <w:link w:val="ab"/>
     <w:uiPriority w:val="99"/>
-    <w:rsid w:val="008B5FE6"/>
+    <w:rsid w:val="00D66DCB"/>
   </w:style>
   <w:style w:type="paragraph" w:styleId="11">
     <w:name w:val="toc 1"/>
@@ -20089,7 +20095,7 @@
     <w:autoRedefine/>
     <w:uiPriority w:val="39"/>
     <w:unhideWhenUsed/>
-    <w:rsid w:val="008B5FE6"/>
+    <w:rsid w:val="00D66DCB"/>
   </w:style>
   <w:style w:type="paragraph" w:styleId="20">
     <w:name w:val="toc 2"/>
@@ -20098,7 +20104,7 @@
     <w:autoRedefine/>
     <w:uiPriority w:val="39"/>
     <w:unhideWhenUsed/>
-    <w:rsid w:val="008B5FE6"/>
+    <w:rsid w:val="00D66DCB"/>
     <w:pPr>
       <w:ind w:leftChars="200" w:left="425"/>
     </w:pPr>

</xml_diff>

<commit_message>
security: production CSP no longer allows eval
- contentSecurityPolicy(dev) keeps 'unsafe-eval' only for the local dev server;
  CSP_STRICT=1 runs dev with the production policy
- checked: client bundle's eval-like code is old-browser fallbacks and zod's
  guarded probe; 25 pages + quote card, text selection, present mode and
  insight popup ran under the strict policy with no CSP violations
- cdp.mjs now records browser log errors (CSP violations)

Co-Authored-By: Claude Opus 5.5 <noreply@anthropic.com>
</commit_message>
<xml_diff>
--- a/개발보고서(공동개발자용)/곡반정와드_공동개발자_보고서.docx
+++ b/개발보고서(공동개발자용)/곡반정와드_공동개발자_보고서.docx
@@ -743,7 +743,7 @@
       <w:pPr>
         <w:pStyle w:val="1"/>
       </w:pPr>
-      <w:bookmarkStart w:id="0" w:name="_Toc241529535"/>
+      <w:bookmarkStart w:id="0" w:name="_Toc241531691"/>
       <w:r>
         <w:t>목차</w:t>
       </w:r>
@@ -752,7 +752,7 @@
     <w:sdt>
       <w:sdtPr>
         <w:alias w:val="목차"/>
-        <w:id w:val="-1444766560"/>
+        <w:id w:val="205835405"/>
       </w:sdtPr>
       <w:sdtEndPr/>
       <w:sdtContent>
@@ -775,7 +775,7 @@
           <w:r>
             <w:fldChar w:fldCharType="separate"/>
           </w:r>
-          <w:hyperlink w:anchor="_Toc241529535" w:history="1">
+          <w:hyperlink w:anchor="_Toc241531691" w:history="1">
             <w:r>
               <w:rPr>
                 <w:rStyle w:val="a5"/>
@@ -799,7 +799,7 @@
               <w:rPr>
                 <w:noProof/>
               </w:rPr>
-              <w:instrText xml:space="preserve"> PAGEREF _Toc241529535 \h </w:instrText>
+              <w:instrText xml:space="preserve"> PAGEREF _Toc241531691 \h </w:instrText>
             </w:r>
             <w:r>
               <w:rPr>
@@ -836,7 +836,7 @@
               <w:noProof/>
             </w:rPr>
           </w:pPr>
-          <w:hyperlink w:anchor="_Toc241529536" w:history="1">
+          <w:hyperlink w:anchor="_Toc241531692" w:history="1">
             <w:r>
               <w:rPr>
                 <w:rStyle w:val="a5"/>
@@ -860,7 +860,7 @@
               <w:rPr>
                 <w:noProof/>
               </w:rPr>
-              <w:instrText xml:space="preserve"> PAGEREF _Toc241529536 \h </w:instrText>
+              <w:instrText xml:space="preserve"> PAGEREF _Toc241531692 \h </w:instrText>
             </w:r>
             <w:r>
               <w:rPr>
@@ -897,7 +897,7 @@
               <w:noProof/>
             </w:rPr>
           </w:pPr>
-          <w:hyperlink w:anchor="_Toc241529537" w:history="1">
+          <w:hyperlink w:anchor="_Toc241531693" w:history="1">
             <w:r>
               <w:rPr>
                 <w:rStyle w:val="a5"/>
@@ -921,7 +921,7 @@
               <w:rPr>
                 <w:noProof/>
               </w:rPr>
-              <w:instrText xml:space="preserve"> PAGEREF _Toc241529537 \h </w:instrText>
+              <w:instrText xml:space="preserve"> PAGEREF _Toc241531693 \h </w:instrText>
             </w:r>
             <w:r>
               <w:rPr>
@@ -959,7 +959,7 @@
               <w:noProof/>
             </w:rPr>
           </w:pPr>
-          <w:hyperlink w:anchor="_Toc241529538" w:history="1">
+          <w:hyperlink w:anchor="_Toc241531694" w:history="1">
             <w:r>
               <w:rPr>
                 <w:rStyle w:val="a5"/>
@@ -983,7 +983,7 @@
               <w:rPr>
                 <w:noProof/>
               </w:rPr>
-              <w:instrText xml:space="preserve"> PAGEREF _Toc241529538 \h </w:instrText>
+              <w:instrText xml:space="preserve"> PAGEREF _Toc241531694 \h </w:instrText>
             </w:r>
             <w:r>
               <w:rPr>
@@ -1020,7 +1020,7 @@
               <w:noProof/>
             </w:rPr>
           </w:pPr>
-          <w:hyperlink w:anchor="_Toc241529539" w:history="1">
+          <w:hyperlink w:anchor="_Toc241531695" w:history="1">
             <w:r>
               <w:rPr>
                 <w:rStyle w:val="a5"/>
@@ -1044,7 +1044,7 @@
               <w:rPr>
                 <w:noProof/>
               </w:rPr>
-              <w:instrText xml:space="preserve"> PAGEREF _Toc241529539 \h </w:instrText>
+              <w:instrText xml:space="preserve"> PAGEREF _Toc241531695 \h </w:instrText>
             </w:r>
             <w:r>
               <w:rPr>
@@ -1081,7 +1081,7 @@
               <w:noProof/>
             </w:rPr>
           </w:pPr>
-          <w:hyperlink w:anchor="_Toc241529540" w:history="1">
+          <w:hyperlink w:anchor="_Toc241531696" w:history="1">
             <w:r>
               <w:rPr>
                 <w:rStyle w:val="a5"/>
@@ -1105,7 +1105,7 @@
               <w:rPr>
                 <w:noProof/>
               </w:rPr>
-              <w:instrText xml:space="preserve"> PAGEREF _Toc241529540 \h </w:instrText>
+              <w:instrText xml:space="preserve"> PAGEREF _Toc241531696 \h </w:instrText>
             </w:r>
             <w:r>
               <w:rPr>
@@ -1143,7 +1143,7 @@
               <w:noProof/>
             </w:rPr>
           </w:pPr>
-          <w:hyperlink w:anchor="_Toc241529541" w:history="1">
+          <w:hyperlink w:anchor="_Toc241531697" w:history="1">
             <w:r>
               <w:rPr>
                 <w:rStyle w:val="a5"/>
@@ -1167,7 +1167,7 @@
               <w:rPr>
                 <w:noProof/>
               </w:rPr>
-              <w:instrText xml:space="preserve"> PAGEREF _Toc241529541 \h </w:instrText>
+              <w:instrText xml:space="preserve"> PAGEREF _Toc241531697 \h </w:instrText>
             </w:r>
             <w:r>
               <w:rPr>
@@ -1205,7 +1205,7 @@
               <w:noProof/>
             </w:rPr>
           </w:pPr>
-          <w:hyperlink w:anchor="_Toc241529542" w:history="1">
+          <w:hyperlink w:anchor="_Toc241531698" w:history="1">
             <w:r>
               <w:rPr>
                 <w:rStyle w:val="a5"/>
@@ -1229,7 +1229,7 @@
               <w:rPr>
                 <w:noProof/>
               </w:rPr>
-              <w:instrText xml:space="preserve"> PAGEREF _Toc241529542 \h </w:instrText>
+              <w:instrText xml:space="preserve"> PAGEREF _Toc241531698 \h </w:instrText>
             </w:r>
             <w:r>
               <w:rPr>
@@ -1267,7 +1267,7 @@
               <w:noProof/>
             </w:rPr>
           </w:pPr>
-          <w:hyperlink w:anchor="_Toc241529543" w:history="1">
+          <w:hyperlink w:anchor="_Toc241531699" w:history="1">
             <w:r>
               <w:rPr>
                 <w:rStyle w:val="a5"/>
@@ -1291,7 +1291,7 @@
               <w:rPr>
                 <w:noProof/>
               </w:rPr>
-              <w:instrText xml:space="preserve"> PAGEREF _Toc241529543 \h </w:instrText>
+              <w:instrText xml:space="preserve"> PAGEREF _Toc241531699 \h </w:instrText>
             </w:r>
             <w:r>
               <w:rPr>
@@ -1328,7 +1328,7 @@
               <w:noProof/>
             </w:rPr>
           </w:pPr>
-          <w:hyperlink w:anchor="_Toc241529544" w:history="1">
+          <w:hyperlink w:anchor="_Toc241531700" w:history="1">
             <w:r>
               <w:rPr>
                 <w:rStyle w:val="a5"/>
@@ -1352,7 +1352,7 @@
               <w:rPr>
                 <w:noProof/>
               </w:rPr>
-              <w:instrText xml:space="preserve"> PAGEREF _Toc241529544 \h </w:instrText>
+              <w:instrText xml:space="preserve"> PAGEREF _Toc241531700 \h </w:instrText>
             </w:r>
             <w:r>
               <w:rPr>
@@ -1390,7 +1390,7 @@
               <w:noProof/>
             </w:rPr>
           </w:pPr>
-          <w:hyperlink w:anchor="_Toc241529545" w:history="1">
+          <w:hyperlink w:anchor="_Toc241531701" w:history="1">
             <w:r>
               <w:rPr>
                 <w:rStyle w:val="a5"/>
@@ -1414,7 +1414,7 @@
               <w:rPr>
                 <w:noProof/>
               </w:rPr>
-              <w:instrText xml:space="preserve"> PAGEREF _Toc241529545 \h </w:instrText>
+              <w:instrText xml:space="preserve"> PAGEREF _Toc241531701 \h </w:instrText>
             </w:r>
             <w:r>
               <w:rPr>
@@ -1451,7 +1451,7 @@
               <w:noProof/>
             </w:rPr>
           </w:pPr>
-          <w:hyperlink w:anchor="_Toc241529546" w:history="1">
+          <w:hyperlink w:anchor="_Toc241531702" w:history="1">
             <w:r>
               <w:rPr>
                 <w:rStyle w:val="a5"/>
@@ -1475,7 +1475,7 @@
               <w:rPr>
                 <w:noProof/>
               </w:rPr>
-              <w:instrText xml:space="preserve"> PAGEREF _Toc241529546 \h </w:instrText>
+              <w:instrText xml:space="preserve"> PAGEREF _Toc241531702 \h </w:instrText>
             </w:r>
             <w:r>
               <w:rPr>
@@ -1513,7 +1513,7 @@
               <w:noProof/>
             </w:rPr>
           </w:pPr>
-          <w:hyperlink w:anchor="_Toc241529547" w:history="1">
+          <w:hyperlink w:anchor="_Toc241531703" w:history="1">
             <w:r>
               <w:rPr>
                 <w:rStyle w:val="a5"/>
@@ -1537,7 +1537,7 @@
               <w:rPr>
                 <w:noProof/>
               </w:rPr>
-              <w:instrText xml:space="preserve"> PAGEREF _Toc241529547 \h </w:instrText>
+              <w:instrText xml:space="preserve"> PAGEREF _Toc241531703 \h </w:instrText>
             </w:r>
             <w:r>
               <w:rPr>
@@ -1575,7 +1575,7 @@
               <w:noProof/>
             </w:rPr>
           </w:pPr>
-          <w:hyperlink w:anchor="_Toc241529548" w:history="1">
+          <w:hyperlink w:anchor="_Toc241531704" w:history="1">
             <w:r>
               <w:rPr>
                 <w:rStyle w:val="a5"/>
@@ -1599,7 +1599,7 @@
               <w:rPr>
                 <w:noProof/>
               </w:rPr>
-              <w:instrText xml:space="preserve"> PAGEREF _Toc241529548 \h </w:instrText>
+              <w:instrText xml:space="preserve"> PAGEREF _Toc241531704 \h </w:instrText>
             </w:r>
             <w:r>
               <w:rPr>
@@ -1637,7 +1637,7 @@
               <w:noProof/>
             </w:rPr>
           </w:pPr>
-          <w:hyperlink w:anchor="_Toc241529549" w:history="1">
+          <w:hyperlink w:anchor="_Toc241531705" w:history="1">
             <w:r>
               <w:rPr>
                 <w:rStyle w:val="a5"/>
@@ -1661,7 +1661,7 @@
               <w:rPr>
                 <w:noProof/>
               </w:rPr>
-              <w:instrText xml:space="preserve"> PAGEREF _Toc241529549 \h </w:instrText>
+              <w:instrText xml:space="preserve"> PAGEREF _Toc241531705 \h </w:instrText>
             </w:r>
             <w:r>
               <w:rPr>
@@ -1698,7 +1698,7 @@
               <w:noProof/>
             </w:rPr>
           </w:pPr>
-          <w:hyperlink w:anchor="_Toc241529550" w:history="1">
+          <w:hyperlink w:anchor="_Toc241531706" w:history="1">
             <w:r>
               <w:rPr>
                 <w:rStyle w:val="a5"/>
@@ -1722,7 +1722,7 @@
               <w:rPr>
                 <w:noProof/>
               </w:rPr>
-              <w:instrText xml:space="preserve"> PAGEREF _Toc241529550 \h </w:instrText>
+              <w:instrText xml:space="preserve"> PAGEREF _Toc241531706 \h </w:instrText>
             </w:r>
             <w:r>
               <w:rPr>
@@ -1760,7 +1760,7 @@
               <w:noProof/>
             </w:rPr>
           </w:pPr>
-          <w:hyperlink w:anchor="_Toc241529551" w:history="1">
+          <w:hyperlink w:anchor="_Toc241531707" w:history="1">
             <w:r>
               <w:rPr>
                 <w:rStyle w:val="a5"/>
@@ -1784,7 +1784,7 @@
               <w:rPr>
                 <w:noProof/>
               </w:rPr>
-              <w:instrText xml:space="preserve"> PAGEREF _Toc241529551 \h </w:instrText>
+              <w:instrText xml:space="preserve"> PAGEREF _Toc241531707 \h </w:instrText>
             </w:r>
             <w:r>
               <w:rPr>
@@ -1822,7 +1822,7 @@
               <w:noProof/>
             </w:rPr>
           </w:pPr>
-          <w:hyperlink w:anchor="_Toc241529552" w:history="1">
+          <w:hyperlink w:anchor="_Toc241531708" w:history="1">
             <w:r>
               <w:rPr>
                 <w:rStyle w:val="a5"/>
@@ -1846,7 +1846,7 @@
               <w:rPr>
                 <w:noProof/>
               </w:rPr>
-              <w:instrText xml:space="preserve"> PAGEREF _Toc241529552 \h </w:instrText>
+              <w:instrText xml:space="preserve"> PAGEREF _Toc241531708 \h </w:instrText>
             </w:r>
             <w:r>
               <w:rPr>
@@ -1884,7 +1884,7 @@
               <w:noProof/>
             </w:rPr>
           </w:pPr>
-          <w:hyperlink w:anchor="_Toc241529553" w:history="1">
+          <w:hyperlink w:anchor="_Toc241531709" w:history="1">
             <w:r>
               <w:rPr>
                 <w:rStyle w:val="a5"/>
@@ -1908,7 +1908,7 @@
               <w:rPr>
                 <w:noProof/>
               </w:rPr>
-              <w:instrText xml:space="preserve"> PAGEREF _Toc241529553 \h </w:instrText>
+              <w:instrText xml:space="preserve"> PAGEREF _Toc241531709 \h </w:instrText>
             </w:r>
             <w:r>
               <w:rPr>
@@ -1946,7 +1946,7 @@
               <w:noProof/>
             </w:rPr>
           </w:pPr>
-          <w:hyperlink w:anchor="_Toc241529554" w:history="1">
+          <w:hyperlink w:anchor="_Toc241531710" w:history="1">
             <w:r>
               <w:rPr>
                 <w:rStyle w:val="a5"/>
@@ -1970,7 +1970,7 @@
               <w:rPr>
                 <w:noProof/>
               </w:rPr>
-              <w:instrText xml:space="preserve"> PAGEREF _Toc241529554 \h </w:instrText>
+              <w:instrText xml:space="preserve"> PAGEREF _Toc241531710 \h </w:instrText>
             </w:r>
             <w:r>
               <w:rPr>
@@ -2007,7 +2007,7 @@
               <w:noProof/>
             </w:rPr>
           </w:pPr>
-          <w:hyperlink w:anchor="_Toc241529555" w:history="1">
+          <w:hyperlink w:anchor="_Toc241531711" w:history="1">
             <w:r>
               <w:rPr>
                 <w:rStyle w:val="a5"/>
@@ -2031,7 +2031,7 @@
               <w:rPr>
                 <w:noProof/>
               </w:rPr>
-              <w:instrText xml:space="preserve"> PAGEREF _Toc241529555 \h </w:instrText>
+              <w:instrText xml:space="preserve"> PAGEREF _Toc241531711 \h </w:instrText>
             </w:r>
             <w:r>
               <w:rPr>
@@ -2069,7 +2069,7 @@
               <w:noProof/>
             </w:rPr>
           </w:pPr>
-          <w:hyperlink w:anchor="_Toc241529556" w:history="1">
+          <w:hyperlink w:anchor="_Toc241531712" w:history="1">
             <w:r>
               <w:rPr>
                 <w:rStyle w:val="a5"/>
@@ -2093,7 +2093,7 @@
               <w:rPr>
                 <w:noProof/>
               </w:rPr>
-              <w:instrText xml:space="preserve"> PAGEREF _Toc241529556 \h </w:instrText>
+              <w:instrText xml:space="preserve"> PAGEREF _Toc241531712 \h </w:instrText>
             </w:r>
             <w:r>
               <w:rPr>
@@ -2131,7 +2131,7 @@
               <w:noProof/>
             </w:rPr>
           </w:pPr>
-          <w:hyperlink w:anchor="_Toc241529557" w:history="1">
+          <w:hyperlink w:anchor="_Toc241531713" w:history="1">
             <w:r>
               <w:rPr>
                 <w:rStyle w:val="a5"/>
@@ -2155,7 +2155,7 @@
               <w:rPr>
                 <w:noProof/>
               </w:rPr>
-              <w:instrText xml:space="preserve"> PAGEREF _Toc241529557 \h </w:instrText>
+              <w:instrText xml:space="preserve"> PAGEREF _Toc241531713 \h </w:instrText>
             </w:r>
             <w:r>
               <w:rPr>
@@ -2193,7 +2193,7 @@
               <w:noProof/>
             </w:rPr>
           </w:pPr>
-          <w:hyperlink w:anchor="_Toc241529558" w:history="1">
+          <w:hyperlink w:anchor="_Toc241531714" w:history="1">
             <w:r>
               <w:rPr>
                 <w:rStyle w:val="a5"/>
@@ -2217,7 +2217,7 @@
               <w:rPr>
                 <w:noProof/>
               </w:rPr>
-              <w:instrText xml:space="preserve"> PAGEREF _Toc241529558 \h </w:instrText>
+              <w:instrText xml:space="preserve"> PAGEREF _Toc241531714 \h </w:instrText>
             </w:r>
             <w:r>
               <w:rPr>
@@ -2255,7 +2255,7 @@
               <w:noProof/>
             </w:rPr>
           </w:pPr>
-          <w:hyperlink w:anchor="_Toc241529559" w:history="1">
+          <w:hyperlink w:anchor="_Toc241531715" w:history="1">
             <w:r>
               <w:rPr>
                 <w:rStyle w:val="a5"/>
@@ -2279,7 +2279,7 @@
               <w:rPr>
                 <w:noProof/>
               </w:rPr>
-              <w:instrText xml:space="preserve"> PAGEREF _Toc241529559 \h </w:instrText>
+              <w:instrText xml:space="preserve"> PAGEREF _Toc241531715 \h </w:instrText>
             </w:r>
             <w:r>
               <w:rPr>
@@ -2316,7 +2316,7 @@
               <w:noProof/>
             </w:rPr>
           </w:pPr>
-          <w:hyperlink w:anchor="_Toc241529560" w:history="1">
+          <w:hyperlink w:anchor="_Toc241531716" w:history="1">
             <w:r>
               <w:rPr>
                 <w:rStyle w:val="a5"/>
@@ -2340,7 +2340,7 @@
               <w:rPr>
                 <w:noProof/>
               </w:rPr>
-              <w:instrText xml:space="preserve"> PAGEREF _Toc241529560 \h </w:instrText>
+              <w:instrText xml:space="preserve"> PAGEREF _Toc241531716 \h </w:instrText>
             </w:r>
             <w:r>
               <w:rPr>
@@ -2379,7 +2379,7 @@
         <w:pStyle w:val="1"/>
         <w:pageBreakBefore/>
       </w:pPr>
-      <w:bookmarkStart w:id="1" w:name="_Toc241529536"/>
+      <w:bookmarkStart w:id="1" w:name="_Toc241531692"/>
       <w:r>
         <w:t xml:space="preserve">1. </w:t>
       </w:r>
@@ -4018,7 +4018,7 @@
                 <w:sz w:val="19"/>
                 <w:szCs w:val="19"/>
               </w:rPr>
-              <w:t xml:space="preserve"> 80</w:t>
+              <w:t xml:space="preserve"> 82</w:t>
             </w:r>
             <w:r>
               <w:rPr>
@@ -4202,7 +4202,7 @@
         <w:pStyle w:val="1"/>
         <w:pageBreakBefore/>
       </w:pPr>
-      <w:bookmarkStart w:id="2" w:name="_Toc241529537"/>
+      <w:bookmarkStart w:id="2" w:name="_Toc241531693"/>
       <w:r>
         <w:t xml:space="preserve">2. </w:t>
       </w:r>
@@ -5818,7 +5818,7 @@
       <w:pPr>
         <w:pStyle w:val="2"/>
       </w:pPr>
-      <w:bookmarkStart w:id="3" w:name="_Toc241529538"/>
+      <w:bookmarkStart w:id="3" w:name="_Toc241531694"/>
       <w:r>
         <w:t>통합</w:t>
       </w:r>
@@ -6306,7 +6306,7 @@
         <w:pStyle w:val="1"/>
         <w:pageBreakBefore/>
       </w:pPr>
-      <w:bookmarkStart w:id="4" w:name="_Toc241529539"/>
+      <w:bookmarkStart w:id="4" w:name="_Toc241531695"/>
       <w:r>
         <w:t xml:space="preserve">3. </w:t>
       </w:r>
@@ -8789,7 +8789,7 @@
         <w:pStyle w:val="1"/>
         <w:pageBreakBefore/>
       </w:pPr>
-      <w:bookmarkStart w:id="5" w:name="_Toc241529540"/>
+      <w:bookmarkStart w:id="5" w:name="_Toc241531696"/>
       <w:r>
         <w:t xml:space="preserve">4. </w:t>
       </w:r>
@@ -8802,7 +8802,7 @@
       <w:pPr>
         <w:pStyle w:val="2"/>
       </w:pPr>
-      <w:bookmarkStart w:id="6" w:name="_Toc241529541"/>
+      <w:bookmarkStart w:id="6" w:name="_Toc241531697"/>
       <w:r>
         <w:t>기술</w:t>
       </w:r>
@@ -9604,7 +9604,7 @@
       <w:pPr>
         <w:pStyle w:val="2"/>
       </w:pPr>
-      <w:bookmarkStart w:id="7" w:name="_Toc241529542"/>
+      <w:bookmarkStart w:id="7" w:name="_Toc241531698"/>
       <w:r>
         <w:t>요청이</w:t>
       </w:r>
@@ -9956,7 +9956,7 @@
       <w:pPr>
         <w:pStyle w:val="2"/>
       </w:pPr>
-      <w:bookmarkStart w:id="8" w:name="_Toc241529543"/>
+      <w:bookmarkStart w:id="8" w:name="_Toc241531699"/>
       <w:r>
         <w:t>폴더</w:t>
       </w:r>
@@ -11326,7 +11326,7 @@
         <w:pStyle w:val="1"/>
         <w:pageBreakBefore/>
       </w:pPr>
-      <w:bookmarkStart w:id="9" w:name="_Toc241529544"/>
+      <w:bookmarkStart w:id="9" w:name="_Toc241531700"/>
       <w:r>
         <w:t xml:space="preserve">5. </w:t>
       </w:r>
@@ -12191,7 +12191,7 @@
       <w:pPr>
         <w:pStyle w:val="2"/>
       </w:pPr>
-      <w:bookmarkStart w:id="10" w:name="_Toc241529545"/>
+      <w:bookmarkStart w:id="10" w:name="_Toc241531701"/>
       <w:r>
         <w:t>운영</w:t>
       </w:r>
@@ -12727,7 +12727,7 @@
         <w:pStyle w:val="1"/>
         <w:pageBreakBefore/>
       </w:pPr>
-      <w:bookmarkStart w:id="11" w:name="_Toc241529546"/>
+      <w:bookmarkStart w:id="11" w:name="_Toc241531702"/>
       <w:r>
         <w:t xml:space="preserve">6. </w:t>
       </w:r>
@@ -12746,7 +12746,7 @@
       <w:pPr>
         <w:pStyle w:val="2"/>
       </w:pPr>
-      <w:bookmarkStart w:id="12" w:name="_Toc241529547"/>
+      <w:bookmarkStart w:id="12" w:name="_Toc241531703"/>
       <w:r>
         <w:t>환경변수</w:t>
       </w:r>
@@ -13743,7 +13743,7 @@
       <w:pPr>
         <w:pStyle w:val="2"/>
       </w:pPr>
-      <w:bookmarkStart w:id="13" w:name="_Toc241529548"/>
+      <w:bookmarkStart w:id="13" w:name="_Toc241531704"/>
       <w:r>
         <w:t>배포</w:t>
       </w:r>
@@ -14035,7 +14035,7 @@
       <w:pPr>
         <w:pStyle w:val="2"/>
       </w:pPr>
-      <w:bookmarkStart w:id="14" w:name="_Toc241529549"/>
+      <w:bookmarkStart w:id="14" w:name="_Toc241531705"/>
       <w:r>
         <w:t>안드로이드</w:t>
       </w:r>
@@ -14454,7 +14454,7 @@
         <w:pStyle w:val="1"/>
         <w:pageBreakBefore/>
       </w:pPr>
-      <w:bookmarkStart w:id="15" w:name="_Toc241529550"/>
+      <w:bookmarkStart w:id="15" w:name="_Toc241531706"/>
       <w:r>
         <w:t xml:space="preserve">7. </w:t>
       </w:r>
@@ -14479,7 +14479,7 @@
       <w:pPr>
         <w:pStyle w:val="2"/>
       </w:pPr>
-      <w:bookmarkStart w:id="16" w:name="_Toc241529551"/>
+      <w:bookmarkStart w:id="16" w:name="_Toc241531707"/>
       <w:r>
         <w:t xml:space="preserve">APK </w:t>
       </w:r>
@@ -15617,7 +15617,7 @@
       <w:pPr>
         <w:pStyle w:val="2"/>
       </w:pPr>
-      <w:bookmarkStart w:id="17" w:name="_Toc241529552"/>
+      <w:bookmarkStart w:id="17" w:name="_Toc241531708"/>
       <w:r>
         <w:t>사이트</w:t>
       </w:r>
@@ -15884,7 +15884,103 @@
         <w:t xml:space="preserve"> </w:t>
       </w:r>
       <w:r>
-        <w:t>불러옴</w:t>
+        <w:t>불러오고</w:t>
+      </w:r>
+      <w:r>
+        <w:t xml:space="preserve">, </w:t>
+      </w:r>
+      <w:r>
+        <w:t>운영에서는</w:t>
+      </w:r>
+      <w:r>
+        <w:t xml:space="preserve"> </w:t>
+      </w:r>
+      <w:r>
+        <w:t>글자를</w:t>
+      </w:r>
+      <w:r>
+        <w:t xml:space="preserve"> </w:t>
+      </w:r>
+      <w:r>
+        <w:t>코드로</w:t>
+      </w:r>
+      <w:r>
+        <w:t xml:space="preserve"> </w:t>
+      </w:r>
+      <w:r>
+        <w:t>실행하는</w:t>
+      </w:r>
+      <w:r>
+        <w:t xml:space="preserve"> </w:t>
+      </w:r>
+      <w:r>
+        <w:t>것</w:t>
+      </w:r>
+      <w:r>
+        <w:t>(eval)</w:t>
+      </w:r>
+      <w:r>
+        <w:t>도</w:t>
+      </w:r>
+      <w:r>
+        <w:t xml:space="preserve"> </w:t>
+      </w:r>
+      <w:r>
+        <w:t>금지</w:t>
+      </w:r>
+      <w:r>
+        <w:t xml:space="preserve">. </w:t>
+      </w:r>
+      <w:r>
+        <w:t>개발용</w:t>
+      </w:r>
+      <w:r>
+        <w:t xml:space="preserve"> </w:t>
+      </w:r>
+      <w:r>
+        <w:t>사이트는</w:t>
+      </w:r>
+      <w:r>
+        <w:t xml:space="preserve"> CSP_STRICT=1</w:t>
+      </w:r>
+      <w:r>
+        <w:t>로</w:t>
+      </w:r>
+      <w:r>
+        <w:t xml:space="preserve"> </w:t>
+      </w:r>
+      <w:r>
+        <w:t>켜면</w:t>
+      </w:r>
+      <w:r>
+        <w:t xml:space="preserve"> </w:t>
+      </w:r>
+      <w:r>
+        <w:t>같은</w:t>
+      </w:r>
+      <w:r>
+        <w:t xml:space="preserve"> </w:t>
+      </w:r>
+      <w:r>
+        <w:t>규칙으로</w:t>
+      </w:r>
+      <w:r>
+        <w:t xml:space="preserve"> </w:t>
+      </w:r>
+      <w:r>
+        <w:t>시험할</w:t>
+      </w:r>
+      <w:r>
+        <w:t xml:space="preserve"> </w:t>
+      </w:r>
+      <w:r>
+        <w:t>수</w:t>
+      </w:r>
+      <w:r>
+        <w:t xml:space="preserve"> </w:t>
+      </w:r>
+      <w:r>
+        <w:t>있음</w:t>
       </w:r>
       <w:r>
         <w:t>.</w:t>
@@ -15975,7 +16071,7 @@
       <w:pPr>
         <w:pStyle w:val="2"/>
       </w:pPr>
-      <w:bookmarkStart w:id="18" w:name="_Toc241529553"/>
+      <w:bookmarkStart w:id="18" w:name="_Toc241531709"/>
       <w:r>
         <w:t>테스트</w:t>
       </w:r>
@@ -15990,7 +16086,7 @@
         </w:numPr>
       </w:pPr>
       <w:r>
-        <w:t>npm test: 80</w:t>
+        <w:t>npm test: 82</w:t>
       </w:r>
       <w:r>
         <w:t>개</w:t>
@@ -16369,7 +16465,7 @@
       <w:pPr>
         <w:pStyle w:val="2"/>
       </w:pPr>
-      <w:bookmarkStart w:id="19" w:name="_Toc241529554"/>
+      <w:bookmarkStart w:id="19" w:name="_Toc241531710"/>
       <w:r>
         <w:t>알려진</w:t>
       </w:r>
@@ -16800,7 +16896,7 @@
         <w:pStyle w:val="1"/>
         <w:pageBreakBefore/>
       </w:pPr>
-      <w:bookmarkStart w:id="20" w:name="_Toc241529555"/>
+      <w:bookmarkStart w:id="20" w:name="_Toc241531711"/>
       <w:r>
         <w:t xml:space="preserve">8. </w:t>
       </w:r>
@@ -16825,7 +16921,7 @@
       <w:pPr>
         <w:pStyle w:val="2"/>
       </w:pPr>
-      <w:bookmarkStart w:id="21" w:name="_Toc241529556"/>
+      <w:bookmarkStart w:id="21" w:name="_Toc241531712"/>
       <w:r>
         <w:t>처음</w:t>
       </w:r>
@@ -17021,7 +17117,7 @@
       <w:pPr>
         <w:pStyle w:val="2"/>
       </w:pPr>
-      <w:bookmarkStart w:id="22" w:name="_Toc241529557"/>
+      <w:bookmarkStart w:id="22" w:name="_Toc241531713"/>
       <w:r>
         <w:t>새</w:t>
       </w:r>
@@ -17436,7 +17532,7 @@
       <w:pPr>
         <w:pStyle w:val="2"/>
       </w:pPr>
-      <w:bookmarkStart w:id="23" w:name="_Toc241529558"/>
+      <w:bookmarkStart w:id="23" w:name="_Toc241531714"/>
       <w:r>
         <w:t>지켜</w:t>
       </w:r>
@@ -17692,7 +17788,7 @@
       <w:pPr>
         <w:pStyle w:val="2"/>
       </w:pPr>
-      <w:bookmarkStart w:id="24" w:name="_Toc241529559"/>
+      <w:bookmarkStart w:id="24" w:name="_Toc241531715"/>
       <w:r>
         <w:t>다음에</w:t>
       </w:r>
@@ -17731,70 +17827,106 @@
         </w:numPr>
       </w:pPr>
       <w:r>
-        <w:t>보안</w:t>
-      </w:r>
-      <w:r>
-        <w:t xml:space="preserve"> </w:t>
-      </w:r>
-      <w:r>
-        <w:t>헤더</w:t>
-      </w:r>
-      <w:r>
-        <w:t>(CSP)</w:t>
-      </w:r>
-      <w:r>
-        <w:t>에서</w:t>
-      </w:r>
-      <w:r>
-        <w:t xml:space="preserve"> unsafe-eval </w:t>
-      </w:r>
-      <w:r>
-        <w:t>빼기</w:t>
-      </w:r>
-      <w:r>
-        <w:t xml:space="preserve"> </w:t>
-      </w:r>
-      <w:r>
-        <w:t>검토</w:t>
+        <w:t>운영</w:t>
+      </w:r>
+      <w:r>
+        <w:t xml:space="preserve"> </w:t>
+      </w:r>
+      <w:r>
+        <w:t>사이트에서</w:t>
+      </w:r>
+      <w:r>
+        <w:t xml:space="preserve"> </w:t>
+      </w:r>
+      <w:r>
+        <w:t>교사</w:t>
+      </w:r>
+      <w:r>
+        <w:t xml:space="preserve"> </w:t>
+      </w:r>
+      <w:r>
+        <w:t>전용</w:t>
+      </w:r>
+      <w:r>
+        <w:t xml:space="preserve"> </w:t>
+      </w:r>
+      <w:r>
+        <w:t>화면</w:t>
       </w:r>
       <w:r>
         <w:t>(</w:t>
       </w:r>
       <w:r>
-        <w:t>원래</w:t>
-      </w:r>
-      <w:r>
-        <w:t xml:space="preserve"> gospel-class </w:t>
-      </w:r>
-      <w:r>
-        <w:t>설정</w:t>
-      </w:r>
-      <w:r>
-        <w:t xml:space="preserve">, </w:t>
-      </w:r>
-      <w:r>
-        <w:t>모든</w:t>
-      </w:r>
-      <w:r>
-        <w:t xml:space="preserve"> </w:t>
-      </w:r>
-      <w:r>
-        <w:t>화면</w:t>
-      </w:r>
-      <w:r>
-        <w:t xml:space="preserve"> </w:t>
-      </w:r>
-      <w:r>
-        <w:t>시험</w:t>
-      </w:r>
-      <w:r>
-        <w:t xml:space="preserve"> </w:t>
-      </w:r>
-      <w:r>
-        <w:t>후</w:t>
-      </w:r>
-      <w:r>
-        <w:t>).</w:t>
+        <w:t>슬라이드</w:t>
+      </w:r>
+      <w:r>
+        <w:t xml:space="preserve"> </w:t>
+      </w:r>
+      <w:r>
+        <w:t>자료</w:t>
+      </w:r>
+      <w:r>
+        <w:t xml:space="preserve">·PDF </w:t>
+      </w:r>
+      <w:r>
+        <w:t>저장</w:t>
+      </w:r>
+      <w:r>
+        <w:t>)</w:t>
+      </w:r>
+      <w:r>
+        <w:t>을</w:t>
+      </w:r>
+      <w:r>
+        <w:t xml:space="preserve"> </w:t>
+      </w:r>
+      <w:r>
+        <w:t>한</w:t>
+      </w:r>
+      <w:r>
+        <w:t xml:space="preserve"> </w:t>
+      </w:r>
+      <w:r>
+        <w:t>번씩</w:t>
+      </w:r>
+      <w:r>
+        <w:t xml:space="preserve"> </w:t>
+      </w:r>
+      <w:r>
+        <w:t>써</w:t>
+      </w:r>
+      <w:r>
+        <w:t xml:space="preserve"> </w:t>
+      </w:r>
+      <w:r>
+        <w:t>보며</w:t>
+      </w:r>
+      <w:r>
+        <w:t xml:space="preserve"> </w:t>
+      </w:r>
+      <w:r>
+        <w:t>브라우저</w:t>
+      </w:r>
+      <w:r>
+        <w:t xml:space="preserve"> </w:t>
+      </w:r>
+      <w:r>
+        <w:t>경고가</w:t>
+      </w:r>
+      <w:r>
+        <w:t xml:space="preserve"> </w:t>
+      </w:r>
+      <w:r>
+        <w:t>없는지</w:t>
+      </w:r>
+      <w:r>
+        <w:t xml:space="preserve"> </w:t>
+      </w:r>
+      <w:r>
+        <w:t>확인</w:t>
+      </w:r>
+      <w:r>
+        <w:t>.</w:t>
       </w:r>
     </w:p>
     <w:p>
@@ -17934,7 +18066,7 @@
         <w:pStyle w:val="1"/>
         <w:pageBreakBefore/>
       </w:pPr>
-      <w:bookmarkStart w:id="25" w:name="_Toc241529560"/>
+      <w:bookmarkStart w:id="25" w:name="_Toc241531716"/>
       <w:r>
         <w:t>부록</w:t>
       </w:r>
@@ -19187,10 +19319,10 @@
 <file path=word/numbering.xml><?xml version="1.0" encoding="utf-8"?>
 <w:numbering xmlns:wpc="http://schemas.microsoft.com/office/word/2010/wordprocessingCanvas" xmlns:cx="http://schemas.microsoft.com/office/drawing/2014/chartex" xmlns:cx1="http://schemas.microsoft.com/office/drawing/2015/9/8/chartex" xmlns:cx2="http://schemas.microsoft.com/office/drawing/2015/10/21/chartex" xmlns:cx3="http://schemas.microsoft.com/office/drawing/2016/5/9/chartex" xmlns:cx4="http://schemas.microsoft.com/office/drawing/2016/5/10/chartex" xmlns:cx5="http://schemas.microsoft.com/office/drawing/2016/5/11/chartex" xmlns:cx6="http://schemas.microsoft.com/office/drawing/2016/5/12/chartex" xmlns:cx7="http://schemas.microsoft.com/office/drawing/2016/5/13/chartex" xmlns:cx8="http://schemas.microsoft.com/office/drawing/2016/5/14/chartex" xmlns:mc="http://schemas.openxmlformats.org/markup-compatibility/2006" xmlns:aink="http://schemas.microsoft.com/office/drawing/2016/ink" xmlns:am3d="http://schemas.microsoft.com/office/drawing/2017/model3d" xmlns:o="urn:schemas-microsoft-com:office:office" xmlns:oel="http://schemas.microsoft.com/office/2019/extlst" xmlns:r="http://schemas.openxmlformats.org/officeDocument/2006/relationships" xmlns:m="http://schemas.openxmlformats.org/officeDocument/2006/math" xmlns:v="urn:schemas-microsoft-com:vml" xmlns:wp14="http://schemas.microsoft.com/office/word/2010/wordprocessingDrawing" xmlns:wp="http://schemas.openxmlformats.org/drawingml/2006/wordprocessingDrawing" xmlns:w10="urn:schemas-microsoft-com:office:word" xmlns:w="http://schemas.openxmlformats.org/wordprocessingml/2006/main" xmlns:w14="http://schemas.microsoft.com/office/word/2010/wordml" xmlns:w15="http://schemas.microsoft.com/office/word/2012/wordml" xmlns:w16cex="http://schemas.microsoft.com/office/word/2018/wordml/cex" xmlns:w16cid="http://schemas.microsoft.com/office/word/2016/wordml/cid" xmlns:w16="http://schemas.microsoft.com/office/word/2018/wordml" xmlns:w16du="http://schemas.microsoft.com/office/word/2023/wordml/word16du" xmlns:w16sdtdh="http://schemas.microsoft.com/office/word/2020/wordml/sdtdatahash" xmlns:w16sdtfl="http://schemas.microsoft.com/office/word/2024/wordml/sdtformatlock" xmlns:w16se="http://schemas.microsoft.com/office/word/2015/wordml/symex" xmlns:wpg="http://schemas.microsoft.com/office/word/2010/wordprocessingGroup" xmlns:wpi="http://schemas.microsoft.com/office/word/2010/wordprocessingInk" xmlns:wne="http://schemas.microsoft.com/office/word/2006/wordml" xmlns:wps="http://schemas.microsoft.com/office/word/2010/wordprocessingShape" mc:Ignorable="w14 w15 w16se w16cid w16 w16cex w16sdtdh w16sdtfl w16du wp14">
   <w:abstractNum w:abstractNumId="0" w15:restartNumberingAfterBreak="0">
-    <w:nsid w:val="1FA93FDF"/>
+    <w:nsid w:val="05263E9A"/>
     <w:multiLevelType w:val="hybridMultilevel"/>
-    <w:tmpl w:val="42284E56"/>
-    <w:lvl w:ilvl="0" w:tplc="98EAC908">
+    <w:tmpl w:val="D628414E"/>
+    <w:lvl w:ilvl="0" w:tplc="C6F653A6">
       <w:start w:val="1"/>
       <w:numFmt w:val="bullet"/>
       <w:lvlText w:val="●"/>
@@ -19199,7 +19331,7 @@
         <w:ind w:left="720" w:hanging="360"/>
       </w:pPr>
     </w:lvl>
-    <w:lvl w:ilvl="1" w:tplc="DB9EB7E0">
+    <w:lvl w:ilvl="1" w:tplc="9C448E40">
       <w:start w:val="1"/>
       <w:numFmt w:val="bullet"/>
       <w:lvlText w:val="○"/>
@@ -19208,7 +19340,7 @@
         <w:ind w:left="1440" w:hanging="360"/>
       </w:pPr>
     </w:lvl>
-    <w:lvl w:ilvl="2" w:tplc="BC4ADEBA">
+    <w:lvl w:ilvl="2" w:tplc="A0C66DBE">
       <w:start w:val="1"/>
       <w:numFmt w:val="bullet"/>
       <w:lvlText w:val="■"/>
@@ -19217,7 +19349,7 @@
         <w:ind w:left="2160" w:hanging="360"/>
       </w:pPr>
     </w:lvl>
-    <w:lvl w:ilvl="3" w:tplc="21507C32">
+    <w:lvl w:ilvl="3" w:tplc="A178E2E6">
       <w:start w:val="1"/>
       <w:numFmt w:val="bullet"/>
       <w:lvlText w:val="●"/>
@@ -19226,7 +19358,7 @@
         <w:ind w:left="2880" w:hanging="360"/>
       </w:pPr>
     </w:lvl>
-    <w:lvl w:ilvl="4" w:tplc="2FC88C00">
+    <w:lvl w:ilvl="4" w:tplc="375A0410">
       <w:start w:val="1"/>
       <w:numFmt w:val="bullet"/>
       <w:lvlText w:val="○"/>
@@ -19235,7 +19367,7 @@
         <w:ind w:left="3600" w:hanging="360"/>
       </w:pPr>
     </w:lvl>
-    <w:lvl w:ilvl="5" w:tplc="5BCAC984">
+    <w:lvl w:ilvl="5" w:tplc="2C1C7A62">
       <w:start w:val="1"/>
       <w:numFmt w:val="bullet"/>
       <w:lvlText w:val="■"/>
@@ -19244,7 +19376,7 @@
         <w:ind w:left="4320" w:hanging="360"/>
       </w:pPr>
     </w:lvl>
-    <w:lvl w:ilvl="6" w:tplc="619299AC">
+    <w:lvl w:ilvl="6" w:tplc="A10E2D4E">
       <w:start w:val="1"/>
       <w:numFmt w:val="bullet"/>
       <w:lvlText w:val="●"/>
@@ -19253,7 +19385,7 @@
         <w:ind w:left="5040" w:hanging="360"/>
       </w:pPr>
     </w:lvl>
-    <w:lvl w:ilvl="7" w:tplc="F7CAA622">
+    <w:lvl w:ilvl="7" w:tplc="96387392">
       <w:start w:val="1"/>
       <w:numFmt w:val="bullet"/>
       <w:lvlText w:val="●"/>
@@ -19262,7 +19394,7 @@
         <w:ind w:left="5760" w:hanging="360"/>
       </w:pPr>
     </w:lvl>
-    <w:lvl w:ilvl="8" w:tplc="D668F23C">
+    <w:lvl w:ilvl="8" w:tplc="146003FC">
       <w:start w:val="1"/>
       <w:numFmt w:val="bullet"/>
       <w:lvlText w:val="●"/>
@@ -19273,10 +19405,10 @@
     </w:lvl>
   </w:abstractNum>
   <w:abstractNum w:abstractNumId="1" w15:restartNumberingAfterBreak="0">
-    <w:nsid w:val="2CDE06D6"/>
+    <w:nsid w:val="418D0B0C"/>
     <w:multiLevelType w:val="hybridMultilevel"/>
-    <w:tmpl w:val="DA0C9474"/>
-    <w:lvl w:ilvl="0" w:tplc="A7ACF342">
+    <w:tmpl w:val="FCE45842"/>
+    <w:lvl w:ilvl="0" w:tplc="73D40A46">
       <w:start w:val="1"/>
       <w:numFmt w:val="bullet"/>
       <w:lvlText w:val="•"/>
@@ -19285,52 +19417,52 @@
         <w:ind w:left="540" w:hanging="360"/>
       </w:pPr>
     </w:lvl>
-    <w:lvl w:ilvl="1" w:tplc="F4CE262E">
+    <w:lvl w:ilvl="1" w:tplc="5C267DCE">
       <w:numFmt w:val="decimal"/>
       <w:lvlText w:val=""/>
       <w:lvlJc w:val="left"/>
     </w:lvl>
-    <w:lvl w:ilvl="2" w:tplc="13CAA026">
+    <w:lvl w:ilvl="2" w:tplc="DE002DBA">
       <w:numFmt w:val="decimal"/>
       <w:lvlText w:val=""/>
       <w:lvlJc w:val="left"/>
     </w:lvl>
-    <w:lvl w:ilvl="3" w:tplc="4364CC10">
+    <w:lvl w:ilvl="3" w:tplc="7D1C1B3A">
       <w:numFmt w:val="decimal"/>
       <w:lvlText w:val=""/>
       <w:lvlJc w:val="left"/>
     </w:lvl>
-    <w:lvl w:ilvl="4" w:tplc="22349AE0">
+    <w:lvl w:ilvl="4" w:tplc="CDF0141C">
       <w:numFmt w:val="decimal"/>
       <w:lvlText w:val=""/>
       <w:lvlJc w:val="left"/>
     </w:lvl>
-    <w:lvl w:ilvl="5" w:tplc="F3BC0680">
+    <w:lvl w:ilvl="5" w:tplc="CC149AB8">
       <w:numFmt w:val="decimal"/>
       <w:lvlText w:val=""/>
       <w:lvlJc w:val="left"/>
     </w:lvl>
-    <w:lvl w:ilvl="6" w:tplc="A76A3D20">
+    <w:lvl w:ilvl="6" w:tplc="02BC5628">
       <w:numFmt w:val="decimal"/>
       <w:lvlText w:val=""/>
       <w:lvlJc w:val="left"/>
     </w:lvl>
-    <w:lvl w:ilvl="7" w:tplc="6A3AA418">
+    <w:lvl w:ilvl="7" w:tplc="90BE7446">
       <w:numFmt w:val="decimal"/>
       <w:lvlText w:val=""/>
       <w:lvlJc w:val="left"/>
     </w:lvl>
-    <w:lvl w:ilvl="8" w:tplc="9E12B426">
+    <w:lvl w:ilvl="8" w:tplc="270C50E0">
       <w:numFmt w:val="decimal"/>
       <w:lvlText w:val=""/>
       <w:lvlJc w:val="left"/>
     </w:lvl>
   </w:abstractNum>
   <w:abstractNum w:abstractNumId="2" w15:restartNumberingAfterBreak="0">
-    <w:nsid w:val="4422207F"/>
+    <w:nsid w:val="58F02B32"/>
     <w:multiLevelType w:val="hybridMultilevel"/>
-    <w:tmpl w:val="ABB01E98"/>
-    <w:lvl w:ilvl="0" w:tplc="F73C748A">
+    <w:tmpl w:val="D25EF152"/>
+    <w:lvl w:ilvl="0" w:tplc="6230292C">
       <w:start w:val="1"/>
       <w:numFmt w:val="decimal"/>
       <w:lvlText w:val="%1."/>
@@ -19339,84 +19471,84 @@
         <w:ind w:left="540" w:hanging="360"/>
       </w:pPr>
     </w:lvl>
-    <w:lvl w:ilvl="1" w:tplc="61F2015E">
+    <w:lvl w:ilvl="1" w:tplc="E734361C">
       <w:numFmt w:val="decimal"/>
       <w:lvlText w:val=""/>
       <w:lvlJc w:val="left"/>
     </w:lvl>
-    <w:lvl w:ilvl="2" w:tplc="AFD89DDE">
+    <w:lvl w:ilvl="2" w:tplc="4F98E5B8">
       <w:numFmt w:val="decimal"/>
       <w:lvlText w:val=""/>
       <w:lvlJc w:val="left"/>
     </w:lvl>
-    <w:lvl w:ilvl="3" w:tplc="BA5620FE">
+    <w:lvl w:ilvl="3" w:tplc="7C041F5C">
       <w:numFmt w:val="decimal"/>
       <w:lvlText w:val=""/>
       <w:lvlJc w:val="left"/>
     </w:lvl>
-    <w:lvl w:ilvl="4" w:tplc="117E4ECE">
+    <w:lvl w:ilvl="4" w:tplc="6840D69E">
       <w:numFmt w:val="decimal"/>
       <w:lvlText w:val=""/>
       <w:lvlJc w:val="left"/>
     </w:lvl>
-    <w:lvl w:ilvl="5" w:tplc="91027DCC">
+    <w:lvl w:ilvl="5" w:tplc="E9785F2A">
       <w:numFmt w:val="decimal"/>
       <w:lvlText w:val=""/>
       <w:lvlJc w:val="left"/>
     </w:lvl>
-    <w:lvl w:ilvl="6" w:tplc="67940512">
+    <w:lvl w:ilvl="6" w:tplc="54D6FB24">
       <w:numFmt w:val="decimal"/>
       <w:lvlText w:val=""/>
       <w:lvlJc w:val="left"/>
     </w:lvl>
-    <w:lvl w:ilvl="7" w:tplc="E524269C">
+    <w:lvl w:ilvl="7" w:tplc="1C5AEF30">
       <w:numFmt w:val="decimal"/>
       <w:lvlText w:val=""/>
       <w:lvlJc w:val="left"/>
     </w:lvl>
-    <w:lvl w:ilvl="8" w:tplc="8084C59C">
+    <w:lvl w:ilvl="8" w:tplc="85628690">
       <w:numFmt w:val="decimal"/>
       <w:lvlText w:val=""/>
       <w:lvlJc w:val="left"/>
     </w:lvl>
   </w:abstractNum>
-  <w:num w:numId="1" w16cid:durableId="84425020">
+  <w:num w:numId="1" w16cid:durableId="1367364699">
     <w:abstractNumId w:val="0"/>
     <w:lvlOverride w:ilvl="0">
       <w:startOverride w:val="1"/>
     </w:lvlOverride>
   </w:num>
-  <w:num w:numId="2" w16cid:durableId="2014531813">
+  <w:num w:numId="2" w16cid:durableId="914436084">
     <w:abstractNumId w:val="1"/>
     <w:lvlOverride w:ilvl="0">
       <w:startOverride w:val="1"/>
     </w:lvlOverride>
   </w:num>
-  <w:num w:numId="3" w16cid:durableId="1806309526">
+  <w:num w:numId="3" w16cid:durableId="80488800">
     <w:abstractNumId w:val="2"/>
     <w:lvlOverride w:ilvl="0">
       <w:startOverride w:val="1"/>
     </w:lvlOverride>
   </w:num>
-  <w:num w:numId="4" w16cid:durableId="1027752685">
+  <w:num w:numId="4" w16cid:durableId="691103889">
     <w:abstractNumId w:val="2"/>
     <w:lvlOverride w:ilvl="0">
       <w:startOverride w:val="1"/>
     </w:lvlOverride>
   </w:num>
-  <w:num w:numId="5" w16cid:durableId="364528407">
+  <w:num w:numId="5" w16cid:durableId="1357460057">
     <w:abstractNumId w:val="2"/>
     <w:lvlOverride w:ilvl="0">
       <w:startOverride w:val="1"/>
     </w:lvlOverride>
   </w:num>
-  <w:num w:numId="6" w16cid:durableId="168563361">
+  <w:num w:numId="6" w16cid:durableId="320234770">
     <w:abstractNumId w:val="2"/>
     <w:lvlOverride w:ilvl="0">
       <w:startOverride w:val="1"/>
     </w:lvlOverride>
   </w:num>
-  <w:num w:numId="7" w16cid:durableId="1071002418">
+  <w:num w:numId="7" w16cid:durableId="1692803436">
     <w:abstractNumId w:val="2"/>
     <w:lvlOverride w:ilvl="0">
       <w:startOverride w:val="1"/>
@@ -20050,7 +20182,7 @@
     <w:link w:val="Char1"/>
     <w:uiPriority w:val="99"/>
     <w:unhideWhenUsed/>
-    <w:rsid w:val="00D66DCB"/>
+    <w:rsid w:val="002542DF"/>
     <w:pPr>
       <w:tabs>
         <w:tab w:val="center" w:pos="4513"/>
@@ -20064,7 +20196,7 @@
     <w:basedOn w:val="a0"/>
     <w:link w:val="aa"/>
     <w:uiPriority w:val="99"/>
-    <w:rsid w:val="00D66DCB"/>
+    <w:rsid w:val="002542DF"/>
   </w:style>
   <w:style w:type="paragraph" w:styleId="ab">
     <w:name w:val="footer"/>
@@ -20072,7 +20204,7 @@
     <w:link w:val="Char2"/>
     <w:uiPriority w:val="99"/>
     <w:unhideWhenUsed/>
-    <w:rsid w:val="00D66DCB"/>
+    <w:rsid w:val="002542DF"/>
     <w:pPr>
       <w:tabs>
         <w:tab w:val="center" w:pos="4513"/>
@@ -20086,7 +20218,7 @@
     <w:basedOn w:val="a0"/>
     <w:link w:val="ab"/>
     <w:uiPriority w:val="99"/>
-    <w:rsid w:val="00D66DCB"/>
+    <w:rsid w:val="002542DF"/>
   </w:style>
   <w:style w:type="paragraph" w:styleId="11">
     <w:name w:val="toc 1"/>
@@ -20095,7 +20227,7 @@
     <w:autoRedefine/>
     <w:uiPriority w:val="39"/>
     <w:unhideWhenUsed/>
-    <w:rsid w:val="00D66DCB"/>
+    <w:rsid w:val="002542DF"/>
   </w:style>
   <w:style w:type="paragraph" w:styleId="20">
     <w:name w:val="toc 2"/>
@@ -20104,7 +20236,7 @@
     <w:autoRedefine/>
     <w:uiPriority w:val="39"/>
     <w:unhideWhenUsed/>
-    <w:rsid w:val="00D66DCB"/>
+    <w:rsid w:val="002542DF"/>
     <w:pPr>
       <w:ind w:leftChars="200" w:left="425"/>
     </w:pPr>

</xml_diff>